<commit_message>
Add arrayList Operations in Notes
</commit_message>
<xml_diff>
--- a/ArrayLists/Notes/ArrayLists.docx
+++ b/ArrayLists/Notes/ArrayLists.docx
@@ -126,7 +126,7 @@
     <w:p>
       <w:r>
         <w:pict w14:anchorId="1411EC48">
-          <v:rect id="_x0000_i1091" style="width:0;height:1.5pt" o:hralign="center" o:hrstd="t" o:hr="t" fillcolor="#a0a0a0" stroked="f"/>
+          <v:rect id="_x0000_i1025" style="width:0;height:1.5pt" o:hralign="center" o:hrstd="t" o:hr="t" fillcolor="#a0a0a0" stroked="f"/>
         </w:pict>
       </w:r>
     </w:p>
@@ -184,15 +184,7 @@
       </w:r>
       <w:proofErr w:type="spellEnd"/>
       <w:r>
-        <w:t>&lt;</w:t>
-      </w:r>
-      <w:proofErr w:type="gramStart"/>
-      <w:r>
-        <w:t>&gt;(</w:t>
-      </w:r>
-      <w:proofErr w:type="gramEnd"/>
-      <w:r>
-        <w:t>);</w:t>
+        <w:t>&lt;&gt;();</w:t>
       </w:r>
     </w:p>
     <w:p>
@@ -205,13 +197,8 @@
         <w:t xml:space="preserve">import </w:t>
       </w:r>
       <w:proofErr w:type="spellStart"/>
-      <w:proofErr w:type="gramStart"/>
-      <w:r>
-        <w:t>java.util</w:t>
-      </w:r>
-      <w:proofErr w:type="gramEnd"/>
-      <w:r>
-        <w:t>.ArrayList</w:t>
+      <w:r>
+        <w:t>java.util.ArrayList</w:t>
       </w:r>
       <w:proofErr w:type="spellEnd"/>
       <w:r>
@@ -226,15 +213,7 @@
     </w:p>
     <w:p>
       <w:r>
-        <w:t xml:space="preserve">    public static void </w:t>
-      </w:r>
-      <w:proofErr w:type="gramStart"/>
-      <w:r>
-        <w:t>main(String[</w:t>
-      </w:r>
-      <w:proofErr w:type="gramEnd"/>
-      <w:r>
-        <w:t xml:space="preserve">] </w:t>
+        <w:t xml:space="preserve">    public static void main(String[] </w:t>
       </w:r>
       <w:proofErr w:type="spellStart"/>
       <w:r>
@@ -264,15 +243,7 @@
       </w:r>
       <w:proofErr w:type="spellEnd"/>
       <w:r>
-        <w:t>&lt;</w:t>
-      </w:r>
-      <w:proofErr w:type="gramStart"/>
-      <w:r>
-        <w:t>&gt;(</w:t>
-      </w:r>
-      <w:proofErr w:type="gramEnd"/>
-      <w:r>
-        <w:t>);</w:t>
+        <w:t>&lt;&gt;();</w:t>
       </w:r>
     </w:p>
     <w:p/>
@@ -281,17 +252,12 @@
         <w:t xml:space="preserve">        </w:t>
       </w:r>
       <w:proofErr w:type="spellStart"/>
-      <w:proofErr w:type="gramStart"/>
       <w:r>
         <w:t>numbers.add</w:t>
       </w:r>
       <w:proofErr w:type="spellEnd"/>
       <w:r>
-        <w:t>(</w:t>
-      </w:r>
-      <w:proofErr w:type="gramEnd"/>
-      <w:r>
-        <w:t>10);</w:t>
+        <w:t>(10);</w:t>
       </w:r>
     </w:p>
     <w:p>
@@ -299,17 +265,12 @@
         <w:t xml:space="preserve">        </w:t>
       </w:r>
       <w:proofErr w:type="spellStart"/>
-      <w:proofErr w:type="gramStart"/>
       <w:r>
         <w:t>numbers.add</w:t>
       </w:r>
       <w:proofErr w:type="spellEnd"/>
       <w:r>
-        <w:t>(</w:t>
-      </w:r>
-      <w:proofErr w:type="gramEnd"/>
-      <w:r>
-        <w:t>20);</w:t>
+        <w:t>(20);</w:t>
       </w:r>
     </w:p>
     <w:p>
@@ -317,17 +278,12 @@
         <w:t xml:space="preserve">        </w:t>
       </w:r>
       <w:proofErr w:type="spellStart"/>
-      <w:proofErr w:type="gramStart"/>
       <w:r>
         <w:t>numbers.add</w:t>
       </w:r>
       <w:proofErr w:type="spellEnd"/>
       <w:r>
-        <w:t>(</w:t>
-      </w:r>
-      <w:proofErr w:type="gramEnd"/>
-      <w:r>
-        <w:t>30);</w:t>
+        <w:t>(30);</w:t>
       </w:r>
     </w:p>
     <w:p/>
@@ -461,17 +417,12 @@
     </w:p>
     <w:p>
       <w:proofErr w:type="spellStart"/>
-      <w:proofErr w:type="gramStart"/>
       <w:r>
         <w:t>boolean</w:t>
       </w:r>
       <w:proofErr w:type="spellEnd"/>
       <w:r>
-        <w:t xml:space="preserve">  →</w:t>
-      </w:r>
-      <w:proofErr w:type="gramEnd"/>
-      <w:r>
-        <w:t xml:space="preserve"> Boolean</w:t>
+        <w:t xml:space="preserve">  → Boolean</w:t>
       </w:r>
     </w:p>
     <w:p>
@@ -482,7 +433,7 @@
     <w:p>
       <w:r>
         <w:pict w14:anchorId="0EA2464C">
-          <v:rect id="_x0000_i1092" style="width:0;height:1.5pt" o:hralign="center" o:hrstd="t" o:hr="t" fillcolor="#a0a0a0" stroked="f"/>
+          <v:rect id="_x0000_i1026" style="width:0;height:1.5pt" o:hralign="center" o:hrstd="t" o:hr="t" fillcolor="#a0a0a0" stroked="f"/>
         </w:pict>
       </w:r>
     </w:p>
@@ -532,15 +483,7 @@
       </w:r>
       <w:proofErr w:type="spellEnd"/>
       <w:r>
-        <w:t>&lt;</w:t>
-      </w:r>
-      <w:proofErr w:type="gramStart"/>
-      <w:r>
-        <w:t>&gt;(</w:t>
-      </w:r>
-      <w:proofErr w:type="gramEnd"/>
-      <w:r>
-        <w:t>);</w:t>
+        <w:t>&lt;&gt;();</w:t>
       </w:r>
     </w:p>
     <w:p>
@@ -563,15 +506,7 @@
       </w:r>
       <w:proofErr w:type="spellEnd"/>
       <w:r>
-        <w:t>&lt;</w:t>
-      </w:r>
-      <w:proofErr w:type="gramStart"/>
-      <w:r>
-        <w:t>&gt;(</w:t>
-      </w:r>
-      <w:proofErr w:type="gramEnd"/>
-      <w:r>
-        <w:t>);</w:t>
+        <w:t>&lt;&gt;();</w:t>
       </w:r>
     </w:p>
     <w:p/>
@@ -668,7 +603,7 @@
     <w:p>
       <w:r>
         <w:pict w14:anchorId="026F97AC">
-          <v:rect id="_x0000_i1093" style="width:0;height:1.5pt" o:hralign="center" o:hrstd="t" o:hr="t" fillcolor="#a0a0a0" stroked="f"/>
+          <v:rect id="_x0000_i1027" style="width:0;height:1.5pt" o:hralign="center" o:hrstd="t" o:hr="t" fillcolor="#a0a0a0" stroked="f"/>
         </w:pict>
       </w:r>
     </w:p>
@@ -718,15 +653,7 @@
       </w:r>
       <w:proofErr w:type="spellEnd"/>
       <w:r>
-        <w:t>&lt;</w:t>
-      </w:r>
-      <w:proofErr w:type="gramStart"/>
-      <w:r>
-        <w:t>&gt;(</w:t>
-      </w:r>
-      <w:proofErr w:type="gramEnd"/>
-      <w:r>
-        <w:t>);</w:t>
+        <w:t>&lt;&gt;();</w:t>
       </w:r>
     </w:p>
     <w:p>
@@ -749,15 +676,7 @@
       </w:r>
       <w:proofErr w:type="spellEnd"/>
       <w:r>
-        <w:t>&lt;</w:t>
-      </w:r>
-      <w:proofErr w:type="gramStart"/>
-      <w:r>
-        <w:t>&gt;(</w:t>
-      </w:r>
-      <w:proofErr w:type="gramEnd"/>
-      <w:r>
-        <w:t>);</w:t>
+        <w:t>&lt;&gt;();</w:t>
       </w:r>
     </w:p>
     <w:p/>
@@ -831,7 +750,7 @@
     <w:p>
       <w:r>
         <w:pict w14:anchorId="0E1A4E98">
-          <v:rect id="_x0000_i1094" style="width:0;height:1.5pt" o:hralign="center" o:hrstd="t" o:hr="t" fillcolor="#a0a0a0" stroked="f"/>
+          <v:rect id="_x0000_i1028" style="width:0;height:1.5pt" o:hralign="center" o:hrstd="t" o:hr="t" fillcolor="#a0a0a0" stroked="f"/>
         </w:pict>
       </w:r>
     </w:p>
@@ -894,15 +813,7 @@
       </w:r>
       <w:proofErr w:type="spellEnd"/>
       <w:r>
-        <w:t>&lt;</w:t>
-      </w:r>
-      <w:proofErr w:type="gramStart"/>
-      <w:r>
-        <w:t>&gt;(</w:t>
-      </w:r>
-      <w:proofErr w:type="gramEnd"/>
-      <w:r>
-        <w:t>);</w:t>
+        <w:t>&lt;&gt;();</w:t>
       </w:r>
     </w:p>
     <w:p>
@@ -925,15 +836,7 @@
       </w:r>
       <w:proofErr w:type="spellEnd"/>
       <w:r>
-        <w:t>&lt;</w:t>
-      </w:r>
-      <w:proofErr w:type="gramStart"/>
-      <w:r>
-        <w:t>&gt;(</w:t>
-      </w:r>
-      <w:proofErr w:type="gramEnd"/>
-      <w:r>
-        <w:t>);</w:t>
+        <w:t>&lt;&gt;();</w:t>
       </w:r>
     </w:p>
     <w:p/>
@@ -952,15 +855,7 @@
       </w:r>
       <w:proofErr w:type="spellEnd"/>
       <w:r>
-        <w:t>&lt;</w:t>
-      </w:r>
-      <w:proofErr w:type="gramStart"/>
-      <w:r>
-        <w:t>&gt;(</w:t>
-      </w:r>
-      <w:proofErr w:type="gramEnd"/>
-      <w:r>
-        <w:t>);</w:t>
+        <w:t>&lt;&gt;();</w:t>
       </w:r>
     </w:p>
     <w:p/>
@@ -979,15 +874,7 @@
       </w:r>
       <w:proofErr w:type="spellEnd"/>
       <w:r>
-        <w:t>&lt;</w:t>
-      </w:r>
-      <w:proofErr w:type="gramStart"/>
-      <w:r>
-        <w:t>&gt;(</w:t>
-      </w:r>
-      <w:proofErr w:type="gramEnd"/>
-      <w:r>
-        <w:t>);</w:t>
+        <w:t>&lt;&gt;();</w:t>
       </w:r>
     </w:p>
     <w:p>
@@ -1018,7 +905,7 @@
     <w:p>
       <w:r>
         <w:pict w14:anchorId="2245DE09">
-          <v:rect id="_x0000_i1095" style="width:0;height:1.5pt" o:hralign="center" o:hrstd="t" o:hr="t" fillcolor="#a0a0a0" stroked="f"/>
+          <v:rect id="_x0000_i1029" style="width:0;height:1.5pt" o:hralign="center" o:hrstd="t" o:hr="t" fillcolor="#a0a0a0" stroked="f"/>
         </w:pict>
       </w:r>
     </w:p>
@@ -1090,7 +977,7 @@
     <w:p>
       <w:r>
         <w:pict w14:anchorId="6D63CE51">
-          <v:rect id="_x0000_i1096" style="width:0;height:1.5pt" o:hralign="center" o:hrstd="t" o:hr="t" fillcolor="#a0a0a0" stroked="f"/>
+          <v:rect id="_x0000_i1030" style="width:0;height:1.5pt" o:hralign="center" o:hrstd="t" o:hr="t" fillcolor="#a0a0a0" stroked="f"/>
         </w:pict>
       </w:r>
     </w:p>
@@ -1149,21 +1036,13 @@
       </w:r>
       <w:proofErr w:type="spellEnd"/>
       <w:r>
-        <w:t>&lt;</w:t>
-      </w:r>
-      <w:proofErr w:type="gramStart"/>
-      <w:r>
-        <w:t>&gt;(</w:t>
-      </w:r>
-      <w:proofErr w:type="gramEnd"/>
-      <w:r>
-        <w:t>);</w:t>
+        <w:t>&lt;&gt;();</w:t>
       </w:r>
     </w:p>
     <w:p>
       <w:r>
         <w:pict w14:anchorId="28EEEB78">
-          <v:rect id="_x0000_i1097" style="width:0;height:1.5pt" o:hralign="center" o:hrstd="t" o:hr="t" fillcolor="#a0a0a0" stroked="f"/>
+          <v:rect id="_x0000_i1031" style="width:0;height:1.5pt" o:hralign="center" o:hrstd="t" o:hr="t" fillcolor="#a0a0a0" stroked="f"/>
         </w:pict>
       </w:r>
     </w:p>
@@ -1235,21 +1114,13 @@
       </w:r>
       <w:proofErr w:type="spellEnd"/>
       <w:r>
-        <w:t>&lt;</w:t>
-      </w:r>
-      <w:proofErr w:type="gramStart"/>
-      <w:r>
-        <w:t>&gt;(</w:t>
-      </w:r>
-      <w:proofErr w:type="gramEnd"/>
-      <w:r>
-        <w:t>);</w:t>
+        <w:t>&lt;&gt;();</w:t>
       </w:r>
     </w:p>
     <w:p>
       <w:r>
         <w:pict w14:anchorId="70CC1FC0">
-          <v:rect id="_x0000_i1098" style="width:0;height:1.5pt" o:hralign="center" o:hrstd="t" o:hr="t" fillcolor="#a0a0a0" stroked="f"/>
+          <v:rect id="_x0000_i1032" style="width:0;height:1.5pt" o:hralign="center" o:hrstd="t" o:hr="t" fillcolor="#a0a0a0" stroked="f"/>
         </w:pict>
       </w:r>
     </w:p>
@@ -1309,21 +1180,13 @@
       </w:r>
       <w:proofErr w:type="spellEnd"/>
       <w:r>
-        <w:t>&lt;</w:t>
-      </w:r>
-      <w:proofErr w:type="gramStart"/>
-      <w:r>
-        <w:t>&gt;(</w:t>
-      </w:r>
-      <w:proofErr w:type="gramEnd"/>
-      <w:r>
-        <w:t>);</w:t>
+        <w:t>&lt;&gt;();</w:t>
       </w:r>
     </w:p>
     <w:p>
       <w:r>
         <w:pict w14:anchorId="61EAFBB0">
-          <v:rect id="_x0000_i1099" style="width:0;height:1.5pt" o:hralign="center" o:hrstd="t" o:hr="t" fillcolor="#a0a0a0" stroked="f"/>
+          <v:rect id="_x0000_i1033" style="width:0;height:1.5pt" o:hralign="center" o:hrstd="t" o:hr="t" fillcolor="#a0a0a0" stroked="f"/>
         </w:pict>
       </w:r>
     </w:p>
@@ -1382,21 +1245,13 @@
       </w:r>
       <w:proofErr w:type="spellEnd"/>
       <w:r>
-        <w:t>&lt;</w:t>
-      </w:r>
-      <w:proofErr w:type="gramStart"/>
-      <w:r>
-        <w:t>&gt;(</w:t>
-      </w:r>
-      <w:proofErr w:type="gramEnd"/>
-      <w:r>
-        <w:t>);</w:t>
+        <w:t>&lt;&gt;();</w:t>
       </w:r>
     </w:p>
     <w:p>
       <w:r>
         <w:pict w14:anchorId="0EC6815B">
-          <v:rect id="_x0000_i1100" style="width:0;height:1.5pt" o:hralign="center" o:hrstd="t" o:hr="t" fillcolor="#a0a0a0" stroked="f"/>
+          <v:rect id="_x0000_i1034" style="width:0;height:1.5pt" o:hralign="center" o:hrstd="t" o:hr="t" fillcolor="#a0a0a0" stroked="f"/>
         </w:pict>
       </w:r>
     </w:p>
@@ -1448,7 +1303,7 @@
     <w:p>
       <w:r>
         <w:pict w14:anchorId="705D418B">
-          <v:rect id="_x0000_i1101" style="width:0;height:1.5pt" o:hralign="center" o:hrstd="t" o:hr="t" fillcolor="#a0a0a0" stroked="f"/>
+          <v:rect id="_x0000_i1035" style="width:0;height:1.5pt" o:hralign="center" o:hrstd="t" o:hr="t" fillcolor="#a0a0a0" stroked="f"/>
         </w:pict>
       </w:r>
     </w:p>
@@ -1521,15 +1376,7 @@
       </w:r>
       <w:proofErr w:type="spellEnd"/>
       <w:r>
-        <w:t>&lt;</w:t>
-      </w:r>
-      <w:proofErr w:type="gramStart"/>
-      <w:r>
-        <w:t>&gt;(</w:t>
-      </w:r>
-      <w:proofErr w:type="gramEnd"/>
-      <w:r>
-        <w:t>);</w:t>
+        <w:t>&lt;&gt;();</w:t>
       </w:r>
     </w:p>
     <w:p/>
@@ -1548,15 +1395,7 @@
       </w:r>
       <w:proofErr w:type="spellEnd"/>
       <w:r>
-        <w:t>&lt;</w:t>
-      </w:r>
-      <w:proofErr w:type="gramStart"/>
-      <w:r>
-        <w:t>&gt;(</w:t>
-      </w:r>
-      <w:proofErr w:type="gramEnd"/>
-      <w:r>
-        <w:t>);</w:t>
+        <w:t>&lt;&gt;();</w:t>
       </w:r>
     </w:p>
     <w:p/>
@@ -1575,15 +1414,7 @@
       </w:r>
       <w:proofErr w:type="spellEnd"/>
       <w:r>
-        <w:t>&lt;</w:t>
-      </w:r>
-      <w:proofErr w:type="gramStart"/>
-      <w:r>
-        <w:t>&gt;(</w:t>
-      </w:r>
-      <w:proofErr w:type="gramEnd"/>
-      <w:r>
-        <w:t>);</w:t>
+        <w:t>&lt;&gt;();</w:t>
       </w:r>
     </w:p>
     <w:p>
@@ -1649,85 +1480,12 @@
       <w:r>
         <w:t xml:space="preserve"> operations: </w:t>
       </w:r>
-      <w:proofErr w:type="gramStart"/>
-      <w:r>
-        <w:rPr>
-          <w:b/>
-          <w:bCs/>
-        </w:rPr>
-        <w:t>add(</w:t>
-      </w:r>
-      <w:proofErr w:type="gramEnd"/>
-      <w:r>
-        <w:rPr>
-          <w:b/>
-          <w:bCs/>
-        </w:rPr>
-        <w:t xml:space="preserve">), </w:t>
-      </w:r>
-      <w:proofErr w:type="gramStart"/>
-      <w:r>
-        <w:rPr>
-          <w:b/>
-          <w:bCs/>
-        </w:rPr>
-        <w:t>get(</w:t>
-      </w:r>
-      <w:proofErr w:type="gramEnd"/>
-      <w:r>
-        <w:rPr>
-          <w:b/>
-          <w:bCs/>
-        </w:rPr>
-        <w:t xml:space="preserve">), </w:t>
-      </w:r>
-      <w:proofErr w:type="gramStart"/>
-      <w:r>
-        <w:rPr>
-          <w:b/>
-          <w:bCs/>
-        </w:rPr>
-        <w:t>set(</w:t>
-      </w:r>
-      <w:proofErr w:type="gramEnd"/>
-      <w:r>
-        <w:rPr>
-          <w:b/>
-          <w:bCs/>
-        </w:rPr>
-        <w:t xml:space="preserve">), </w:t>
-      </w:r>
-      <w:proofErr w:type="gramStart"/>
-      <w:r>
-        <w:rPr>
-          <w:b/>
-          <w:bCs/>
-        </w:rPr>
-        <w:t>remove(</w:t>
-      </w:r>
-      <w:proofErr w:type="gramEnd"/>
-      <w:r>
-        <w:rPr>
-          <w:b/>
-          <w:bCs/>
-        </w:rPr>
-        <w:t xml:space="preserve">), and </w:t>
-      </w:r>
-      <w:proofErr w:type="gramStart"/>
-      <w:r>
-        <w:rPr>
-          <w:b/>
-          <w:bCs/>
-        </w:rPr>
-        <w:t>size(</w:t>
-      </w:r>
-      <w:proofErr w:type="gramEnd"/>
-      <w:r>
-        <w:rPr>
-          <w:b/>
-          <w:bCs/>
-        </w:rPr>
-        <w:t>)</w:t>
+      <w:r>
+        <w:rPr>
+          <w:b/>
+          <w:bCs/>
+        </w:rPr>
+        <w:t>add(), get(), set(), remove(), and size()</w:t>
       </w:r>
       <w:r>
         <w:t>.</w:t>
@@ -1853,13 +1611,8 @@
             <w:hideMark/>
           </w:tcPr>
           <w:p>
-            <w:proofErr w:type="gramStart"/>
             <w:r>
-              <w:t>add(</w:t>
-            </w:r>
-            <w:proofErr w:type="gramEnd"/>
-            <w:r>
-              <w:t>)</w:t>
+              <w:t>add()</w:t>
             </w:r>
           </w:p>
         </w:tc>
@@ -1870,21 +1623,12 @@
             <w:hideMark/>
           </w:tcPr>
           <w:p>
-            <w:proofErr w:type="gramStart"/>
             <w:r>
               <w:rPr>
                 <w:b/>
                 <w:bCs/>
               </w:rPr>
-              <w:t>O(</w:t>
-            </w:r>
-            <w:proofErr w:type="gramEnd"/>
-            <w:r>
-              <w:rPr>
-                <w:b/>
-                <w:bCs/>
-              </w:rPr>
-              <w:t>1)</w:t>
+              <w:t>O(1)</w:t>
             </w:r>
             <w:r>
               <w:t xml:space="preserve"> </w:t>
@@ -1933,21 +1677,12 @@
             <w:hideMark/>
           </w:tcPr>
           <w:p>
-            <w:proofErr w:type="gramStart"/>
             <w:r>
               <w:rPr>
                 <w:b/>
                 <w:bCs/>
               </w:rPr>
-              <w:t>O(</w:t>
-            </w:r>
-            <w:proofErr w:type="gramEnd"/>
-            <w:r>
-              <w:rPr>
-                <w:b/>
-                <w:bCs/>
-              </w:rPr>
-              <w:t>1)</w:t>
+              <w:t>O(1)</w:t>
             </w:r>
             <w:r>
               <w:t xml:space="preserve"> </w:t>
@@ -2029,13 +1764,8 @@
             <w:hideMark/>
           </w:tcPr>
           <w:p>
-            <w:proofErr w:type="gramStart"/>
             <w:r>
-              <w:t>set(</w:t>
-            </w:r>
-            <w:proofErr w:type="gramEnd"/>
-            <w:r>
-              <w:t>index, value)</w:t>
+              <w:t>set(index, value)</w:t>
             </w:r>
           </w:p>
         </w:tc>
@@ -2046,21 +1776,12 @@
             <w:hideMark/>
           </w:tcPr>
           <w:p>
-            <w:proofErr w:type="gramStart"/>
             <w:r>
               <w:rPr>
                 <w:b/>
                 <w:bCs/>
               </w:rPr>
-              <w:t>O(</w:t>
-            </w:r>
-            <w:proofErr w:type="gramEnd"/>
-            <w:r>
-              <w:rPr>
-                <w:b/>
-                <w:bCs/>
-              </w:rPr>
-              <w:t>1)</w:t>
+              <w:t>O(1)</w:t>
             </w:r>
           </w:p>
         </w:tc>
@@ -2088,13 +1809,8 @@
             <w:hideMark/>
           </w:tcPr>
           <w:p>
-            <w:proofErr w:type="gramStart"/>
             <w:r>
-              <w:t>contains(</w:t>
-            </w:r>
-            <w:proofErr w:type="gramEnd"/>
-            <w:r>
-              <w:t>)</w:t>
+              <w:t>contains()</w:t>
             </w:r>
           </w:p>
         </w:tc>
@@ -2117,6 +1833,1435 @@
       </w:tr>
     </w:tbl>
     <w:p/>
+    <w:p>
+      <w:pPr>
+        <w:rPr>
+          <w:b/>
+          <w:bCs/>
+        </w:rPr>
+      </w:pPr>
+      <w:proofErr w:type="spellStart"/>
+      <w:r>
+        <w:rPr>
+          <w:b/>
+          <w:bCs/>
+        </w:rPr>
+        <w:t>ArrayList</w:t>
+      </w:r>
+      <w:proofErr w:type="spellEnd"/>
+      <w:r>
+        <w:rPr>
+          <w:b/>
+          <w:bCs/>
+        </w:rPr>
+        <w:t xml:space="preserve"> Operations — Java</w:t>
+      </w:r>
+    </w:p>
+    <w:p>
+      <w:r>
+        <w:t>First import:</w:t>
+      </w:r>
+    </w:p>
+    <w:p>
+      <w:r>
+        <w:t xml:space="preserve">import </w:t>
+      </w:r>
+      <w:proofErr w:type="spellStart"/>
+      <w:r>
+        <w:t>java.util.ArrayList</w:t>
+      </w:r>
+      <w:proofErr w:type="spellEnd"/>
+      <w:r>
+        <w:t>;</w:t>
+      </w:r>
+    </w:p>
+    <w:p>
+      <w:r>
+        <w:t xml:space="preserve">import </w:t>
+      </w:r>
+      <w:proofErr w:type="spellStart"/>
+      <w:r>
+        <w:t>java.util.Collections</w:t>
+      </w:r>
+      <w:proofErr w:type="spellEnd"/>
+      <w:r>
+        <w:t>;</w:t>
+      </w:r>
+    </w:p>
+    <w:p>
+      <w:r>
+        <w:t xml:space="preserve">Create </w:t>
+      </w:r>
+      <w:proofErr w:type="spellStart"/>
+      <w:r>
+        <w:t>ArrayList</w:t>
+      </w:r>
+      <w:proofErr w:type="spellEnd"/>
+      <w:r>
+        <w:t>:</w:t>
+      </w:r>
+    </w:p>
+    <w:p>
+      <w:proofErr w:type="spellStart"/>
+      <w:r>
+        <w:t>ArrayList</w:t>
+      </w:r>
+      <w:proofErr w:type="spellEnd"/>
+      <w:r>
+        <w:t xml:space="preserve">&lt;Integer&gt; list = new </w:t>
+      </w:r>
+      <w:proofErr w:type="spellStart"/>
+      <w:r>
+        <w:t>ArrayList</w:t>
+      </w:r>
+      <w:proofErr w:type="spellEnd"/>
+      <w:r>
+        <w:t>&lt;&gt;();</w:t>
+      </w:r>
+    </w:p>
+    <w:p>
+      <w:r>
+        <w:pict w14:anchorId="204912FC">
+          <v:rect id="_x0000_i1096" style="width:0;height:1.5pt" o:hralign="center" o:hrstd="t" o:hr="t" fillcolor="#a0a0a0" stroked="f"/>
+        </w:pict>
+      </w:r>
+    </w:p>
+    <w:p>
+      <w:pPr>
+        <w:rPr>
+          <w:b/>
+          <w:bCs/>
+        </w:rPr>
+      </w:pPr>
+      <w:r>
+        <w:rPr>
+          <w:b/>
+          <w:bCs/>
+        </w:rPr>
+        <w:t xml:space="preserve">1. Add Element </w:t>
+      </w:r>
+      <w:r>
+        <w:rPr>
+          <w:rFonts w:ascii="Segoe UI Emoji" w:hAnsi="Segoe UI Emoji" w:cs="Segoe UI Emoji"/>
+          <w:b/>
+          <w:bCs/>
+        </w:rPr>
+        <w:t>⭐</w:t>
+      </w:r>
+    </w:p>
+    <w:p>
+      <w:pPr>
+        <w:rPr>
+          <w:b/>
+          <w:bCs/>
+        </w:rPr>
+      </w:pPr>
+      <w:r>
+        <w:rPr>
+          <w:b/>
+          <w:bCs/>
+        </w:rPr>
+        <w:t>Add at end — add()</w:t>
+      </w:r>
+    </w:p>
+    <w:p>
+      <w:proofErr w:type="spellStart"/>
+      <w:r>
+        <w:t>list.add</w:t>
+      </w:r>
+      <w:proofErr w:type="spellEnd"/>
+      <w:r>
+        <w:t>(10);</w:t>
+      </w:r>
+    </w:p>
+    <w:p>
+      <w:proofErr w:type="spellStart"/>
+      <w:r>
+        <w:t>list.add</w:t>
+      </w:r>
+      <w:proofErr w:type="spellEnd"/>
+      <w:r>
+        <w:t>(20);</w:t>
+      </w:r>
+    </w:p>
+    <w:p>
+      <w:proofErr w:type="spellStart"/>
+      <w:r>
+        <w:t>list.add</w:t>
+      </w:r>
+      <w:proofErr w:type="spellEnd"/>
+      <w:r>
+        <w:t>(30);</w:t>
+      </w:r>
+    </w:p>
+    <w:p>
+      <w:r>
+        <w:t>Output:</w:t>
+      </w:r>
+    </w:p>
+    <w:p>
+      <w:r>
+        <w:t>[10, 20, 30]</w:t>
+      </w:r>
+    </w:p>
+    <w:p>
+      <w:r>
+        <w:rPr>
+          <w:b/>
+          <w:bCs/>
+        </w:rPr>
+        <w:t>Time:</w:t>
+      </w:r>
+      <w:r>
+        <w:t xml:space="preserve"> O(1) average</w:t>
+      </w:r>
+    </w:p>
+    <w:p>
+      <w:pPr>
+        <w:rPr>
+          <w:b/>
+          <w:bCs/>
+        </w:rPr>
+      </w:pPr>
+      <w:r>
+        <w:rPr>
+          <w:b/>
+          <w:bCs/>
+        </w:rPr>
+        <w:t>Add at specific index</w:t>
+      </w:r>
+    </w:p>
+    <w:p>
+      <w:proofErr w:type="spellStart"/>
+      <w:r>
+        <w:t>list.add</w:t>
+      </w:r>
+      <w:proofErr w:type="spellEnd"/>
+      <w:r>
+        <w:t>(1, 50);</w:t>
+      </w:r>
+    </w:p>
+    <w:p>
+      <w:r>
+        <w:t>Output:</w:t>
+      </w:r>
+    </w:p>
+    <w:p>
+      <w:r>
+        <w:t>[10, 50, 20, 30]</w:t>
+      </w:r>
+    </w:p>
+    <w:p>
+      <w:r>
+        <w:rPr>
+          <w:b/>
+          <w:bCs/>
+        </w:rPr>
+        <w:t>Time:</w:t>
+      </w:r>
+      <w:r>
+        <w:t xml:space="preserve"> O(n) because elements may need to shift.</w:t>
+      </w:r>
+    </w:p>
+    <w:p>
+      <w:r>
+        <w:pict w14:anchorId="2E6A0D76">
+          <v:rect id="_x0000_i1097" style="width:0;height:1.5pt" o:hralign="center" o:hrstd="t" o:hr="t" fillcolor="#a0a0a0" stroked="f"/>
+        </w:pict>
+      </w:r>
+    </w:p>
+    <w:p>
+      <w:pPr>
+        <w:rPr>
+          <w:b/>
+          <w:bCs/>
+        </w:rPr>
+      </w:pPr>
+      <w:r>
+        <w:rPr>
+          <w:b/>
+          <w:bCs/>
+        </w:rPr>
+        <w:t xml:space="preserve">2. Get Element </w:t>
+      </w:r>
+      <w:r>
+        <w:rPr>
+          <w:rFonts w:ascii="Segoe UI Emoji" w:hAnsi="Segoe UI Emoji" w:cs="Segoe UI Emoji"/>
+          <w:b/>
+          <w:bCs/>
+        </w:rPr>
+        <w:t>⭐</w:t>
+      </w:r>
+    </w:p>
+    <w:p>
+      <w:r>
+        <w:t>Use get(index):</w:t>
+      </w:r>
+    </w:p>
+    <w:p>
+      <w:r>
+        <w:t xml:space="preserve">int x = </w:t>
+      </w:r>
+      <w:proofErr w:type="spellStart"/>
+      <w:r>
+        <w:t>list.get</w:t>
+      </w:r>
+      <w:proofErr w:type="spellEnd"/>
+      <w:r>
+        <w:t>(1);</w:t>
+      </w:r>
+    </w:p>
+    <w:p>
+      <w:proofErr w:type="spellStart"/>
+      <w:r>
+        <w:t>System.out.println</w:t>
+      </w:r>
+      <w:proofErr w:type="spellEnd"/>
+      <w:r>
+        <w:t>(x);</w:t>
+      </w:r>
+    </w:p>
+    <w:p>
+      <w:r>
+        <w:t>Output:</w:t>
+      </w:r>
+    </w:p>
+    <w:p>
+      <w:r>
+        <w:lastRenderedPageBreak/>
+        <w:t>50</w:t>
+      </w:r>
+    </w:p>
+    <w:p>
+      <w:r>
+        <w:rPr>
+          <w:b/>
+          <w:bCs/>
+        </w:rPr>
+        <w:t>Time:</w:t>
+      </w:r>
+      <w:r>
+        <w:t xml:space="preserve"> O(1)</w:t>
+      </w:r>
+    </w:p>
+    <w:p>
+      <w:proofErr w:type="spellStart"/>
+      <w:r>
+        <w:t>ArrayList</w:t>
+      </w:r>
+      <w:proofErr w:type="spellEnd"/>
+      <w:r>
+        <w:t xml:space="preserve"> provides fast access using index, similar to an array.</w:t>
+      </w:r>
+    </w:p>
+    <w:p>
+      <w:r>
+        <w:pict w14:anchorId="35933F62">
+          <v:rect id="_x0000_i1098" style="width:0;height:1.5pt" o:hralign="center" o:hrstd="t" o:hr="t" fillcolor="#a0a0a0" stroked="f"/>
+        </w:pict>
+      </w:r>
+    </w:p>
+    <w:p>
+      <w:pPr>
+        <w:rPr>
+          <w:b/>
+          <w:bCs/>
+        </w:rPr>
+      </w:pPr>
+      <w:r>
+        <w:rPr>
+          <w:b/>
+          <w:bCs/>
+        </w:rPr>
+        <w:t xml:space="preserve">3. Set / Update Element </w:t>
+      </w:r>
+      <w:r>
+        <w:rPr>
+          <w:rFonts w:ascii="Segoe UI Emoji" w:hAnsi="Segoe UI Emoji" w:cs="Segoe UI Emoji"/>
+          <w:b/>
+          <w:bCs/>
+        </w:rPr>
+        <w:t>⭐</w:t>
+      </w:r>
+    </w:p>
+    <w:p>
+      <w:r>
+        <w:t>Use set(index, value):</w:t>
+      </w:r>
+    </w:p>
+    <w:p>
+      <w:proofErr w:type="spellStart"/>
+      <w:r>
+        <w:t>list.set</w:t>
+      </w:r>
+      <w:proofErr w:type="spellEnd"/>
+      <w:r>
+        <w:t>(1, 100);</w:t>
+      </w:r>
+    </w:p>
+    <w:p>
+      <w:r>
+        <w:t>Before:</w:t>
+      </w:r>
+    </w:p>
+    <w:p>
+      <w:r>
+        <w:t>[10, 50, 20, 30]</w:t>
+      </w:r>
+    </w:p>
+    <w:p>
+      <w:r>
+        <w:t>After:</w:t>
+      </w:r>
+    </w:p>
+    <w:p>
+      <w:r>
+        <w:t>[10, 100, 20, 30]</w:t>
+      </w:r>
+    </w:p>
+    <w:p>
+      <w:r>
+        <w:rPr>
+          <w:b/>
+          <w:bCs/>
+        </w:rPr>
+        <w:t>Time:</w:t>
+      </w:r>
+      <w:r>
+        <w:t xml:space="preserve"> O(1)</w:t>
+      </w:r>
+    </w:p>
+    <w:p>
+      <w:pPr>
+        <w:rPr>
+          <w:b/>
+          <w:bCs/>
+        </w:rPr>
+      </w:pPr>
+      <w:r>
+        <w:rPr>
+          <w:b/>
+          <w:bCs/>
+        </w:rPr>
+        <w:t>Remember</w:t>
+      </w:r>
+    </w:p>
+    <w:p>
+      <w:proofErr w:type="spellStart"/>
+      <w:r>
+        <w:t>list.set</w:t>
+      </w:r>
+      <w:proofErr w:type="spellEnd"/>
+      <w:r>
+        <w:t xml:space="preserve">(index, </w:t>
+      </w:r>
+      <w:proofErr w:type="spellStart"/>
+      <w:r>
+        <w:t>newValue</w:t>
+      </w:r>
+      <w:proofErr w:type="spellEnd"/>
+      <w:r>
+        <w:t>);</w:t>
+      </w:r>
+    </w:p>
+    <w:p>
+      <w:r>
+        <w:t xml:space="preserve">It </w:t>
+      </w:r>
+      <w:r>
+        <w:rPr>
+          <w:b/>
+          <w:bCs/>
+        </w:rPr>
+        <w:t>replaces</w:t>
+      </w:r>
+      <w:r>
+        <w:t xml:space="preserve"> the existing element.</w:t>
+      </w:r>
+    </w:p>
+    <w:p>
+      <w:r>
+        <w:pict w14:anchorId="6CF3726F">
+          <v:rect id="_x0000_i1099" style="width:0;height:1.5pt" o:hralign="center" o:hrstd="t" o:hr="t" fillcolor="#a0a0a0" stroked="f"/>
+        </w:pict>
+      </w:r>
+    </w:p>
+    <w:p>
+      <w:pPr>
+        <w:rPr>
+          <w:b/>
+          <w:bCs/>
+        </w:rPr>
+      </w:pPr>
+      <w:r>
+        <w:rPr>
+          <w:b/>
+          <w:bCs/>
+        </w:rPr>
+        <w:t xml:space="preserve">4. Remove Element </w:t>
+      </w:r>
+      <w:r>
+        <w:rPr>
+          <w:rFonts w:ascii="Segoe UI Emoji" w:hAnsi="Segoe UI Emoji" w:cs="Segoe UI Emoji"/>
+          <w:b/>
+          <w:bCs/>
+        </w:rPr>
+        <w:t>⭐</w:t>
+      </w:r>
+    </w:p>
+    <w:p>
+      <w:pPr>
+        <w:rPr>
+          <w:b/>
+          <w:bCs/>
+        </w:rPr>
+      </w:pPr>
+      <w:r>
+        <w:rPr>
+          <w:b/>
+          <w:bCs/>
+        </w:rPr>
+        <w:t>Remove using index</w:t>
+      </w:r>
+    </w:p>
+    <w:p>
+      <w:proofErr w:type="spellStart"/>
+      <w:r>
+        <w:t>list.remove</w:t>
+      </w:r>
+      <w:proofErr w:type="spellEnd"/>
+      <w:r>
+        <w:t>(1);</w:t>
+      </w:r>
+    </w:p>
+    <w:p>
+      <w:r>
+        <w:t>Removes the element at index 1.</w:t>
+      </w:r>
+    </w:p>
+    <w:p>
+      <w:r>
+        <w:rPr>
+          <w:b/>
+          <w:bCs/>
+        </w:rPr>
+        <w:t>Time:</w:t>
+      </w:r>
+      <w:r>
+        <w:t xml:space="preserve"> O(n)</w:t>
+      </w:r>
+    </w:p>
+    <w:p>
+      <w:r>
+        <w:t>because elements after that index may shift left.</w:t>
+      </w:r>
+    </w:p>
+    <w:p>
+      <w:pPr>
+        <w:rPr>
+          <w:b/>
+          <w:bCs/>
+        </w:rPr>
+      </w:pPr>
+      <w:r>
+        <w:rPr>
+          <w:b/>
+          <w:bCs/>
+        </w:rPr>
+        <w:t xml:space="preserve">Remove an Integer value </w:t>
+      </w:r>
+      <w:r>
+        <w:rPr>
+          <w:rFonts w:ascii="Segoe UI Emoji" w:hAnsi="Segoe UI Emoji" w:cs="Segoe UI Emoji"/>
+          <w:b/>
+          <w:bCs/>
+        </w:rPr>
+        <w:t>⚠️</w:t>
+      </w:r>
+    </w:p>
+    <w:p>
+      <w:r>
+        <w:t>This is important:</w:t>
+      </w:r>
+    </w:p>
+    <w:p>
+      <w:proofErr w:type="spellStart"/>
+      <w:r>
+        <w:t>list.remove</w:t>
+      </w:r>
+      <w:proofErr w:type="spellEnd"/>
+      <w:r>
+        <w:t>(</w:t>
+      </w:r>
+      <w:proofErr w:type="spellStart"/>
+      <w:r>
+        <w:t>Integer.valueOf</w:t>
+      </w:r>
+      <w:proofErr w:type="spellEnd"/>
+      <w:r>
+        <w:t>(20));</w:t>
+      </w:r>
+    </w:p>
+    <w:p>
+      <w:r>
+        <w:t xml:space="preserve">This removes the </w:t>
+      </w:r>
+      <w:r>
+        <w:rPr>
+          <w:b/>
+          <w:bCs/>
+        </w:rPr>
+        <w:t>value 20</w:t>
+      </w:r>
+      <w:r>
+        <w:t>.</w:t>
+      </w:r>
+    </w:p>
+    <w:p>
+      <w:r>
+        <w:t xml:space="preserve">Why </w:t>
+      </w:r>
+      <w:proofErr w:type="spellStart"/>
+      <w:r>
+        <w:t>Integer.valueOf</w:t>
+      </w:r>
+      <w:proofErr w:type="spellEnd"/>
+      <w:r>
+        <w:t>()?</w:t>
+      </w:r>
+    </w:p>
+    <w:p>
+      <w:r>
+        <w:t>Because:</w:t>
+      </w:r>
+    </w:p>
+    <w:p>
+      <w:proofErr w:type="spellStart"/>
+      <w:r>
+        <w:t>list.remove</w:t>
+      </w:r>
+      <w:proofErr w:type="spellEnd"/>
+      <w:r>
+        <w:t>(20);</w:t>
+      </w:r>
+    </w:p>
+    <w:p>
+      <w:r>
+        <w:t>is interpreted as:</w:t>
+      </w:r>
+    </w:p>
+    <w:p>
+      <w:r>
+        <w:t>remove element at index 20</w:t>
+      </w:r>
+    </w:p>
+    <w:p>
+      <w:r>
+        <w:t>not remove the value 20.</w:t>
+      </w:r>
+    </w:p>
+    <w:p>
+      <w:r>
+        <w:pict w14:anchorId="5279F260">
+          <v:rect id="_x0000_i1100" style="width:0;height:1.5pt" o:hralign="center" o:hrstd="t" o:hr="t" fillcolor="#a0a0a0" stroked="f"/>
+        </w:pict>
+      </w:r>
+    </w:p>
+    <w:p>
+      <w:pPr>
+        <w:rPr>
+          <w:b/>
+          <w:bCs/>
+        </w:rPr>
+      </w:pPr>
+      <w:r>
+        <w:rPr>
+          <w:b/>
+          <w:bCs/>
+        </w:rPr>
+        <w:t xml:space="preserve">5. Contains Element </w:t>
+      </w:r>
+      <w:r>
+        <w:rPr>
+          <w:rFonts w:ascii="Segoe UI Emoji" w:hAnsi="Segoe UI Emoji" w:cs="Segoe UI Emoji"/>
+          <w:b/>
+          <w:bCs/>
+        </w:rPr>
+        <w:t>⭐</w:t>
+      </w:r>
+    </w:p>
+    <w:p>
+      <w:r>
+        <w:lastRenderedPageBreak/>
+        <w:t>Check whether an element exists:</w:t>
+      </w:r>
+    </w:p>
+    <w:p>
+      <w:r>
+        <w:t>if (</w:t>
+      </w:r>
+      <w:proofErr w:type="spellStart"/>
+      <w:r>
+        <w:t>list.contains</w:t>
+      </w:r>
+      <w:proofErr w:type="spellEnd"/>
+      <w:r>
+        <w:t>(30)) {</w:t>
+      </w:r>
+    </w:p>
+    <w:p>
+      <w:r>
+        <w:t xml:space="preserve">    </w:t>
+      </w:r>
+      <w:proofErr w:type="spellStart"/>
+      <w:r>
+        <w:t>System.out.println</w:t>
+      </w:r>
+      <w:proofErr w:type="spellEnd"/>
+      <w:r>
+        <w:t>("Found");</w:t>
+      </w:r>
+    </w:p>
+    <w:p>
+      <w:r>
+        <w:t>}</w:t>
+      </w:r>
+    </w:p>
+    <w:p>
+      <w:r>
+        <w:t>Returns:</w:t>
+      </w:r>
+    </w:p>
+    <w:p>
+      <w:r>
+        <w:t>true</w:t>
+      </w:r>
+    </w:p>
+    <w:p>
+      <w:r>
+        <w:t>or</w:t>
+      </w:r>
+    </w:p>
+    <w:p>
+      <w:r>
+        <w:t>false</w:t>
+      </w:r>
+    </w:p>
+    <w:p>
+      <w:r>
+        <w:rPr>
+          <w:b/>
+          <w:bCs/>
+        </w:rPr>
+        <w:t>Time:</w:t>
+      </w:r>
+      <w:r>
+        <w:t xml:space="preserve"> O(n)</w:t>
+      </w:r>
+    </w:p>
+    <w:p>
+      <w:r>
+        <w:t xml:space="preserve">Because </w:t>
+      </w:r>
+      <w:proofErr w:type="spellStart"/>
+      <w:r>
+        <w:t>ArrayList</w:t>
+      </w:r>
+      <w:proofErr w:type="spellEnd"/>
+      <w:r>
+        <w:t xml:space="preserve"> may have to search the entire list.</w:t>
+      </w:r>
+    </w:p>
+    <w:p>
+      <w:r>
+        <w:pict w14:anchorId="2B543600">
+          <v:rect id="_x0000_i1101" style="width:0;height:1.5pt" o:hralign="center" o:hrstd="t" o:hr="t" fillcolor="#a0a0a0" stroked="f"/>
+        </w:pict>
+      </w:r>
+    </w:p>
+    <w:p>
+      <w:pPr>
+        <w:rPr>
+          <w:b/>
+          <w:bCs/>
+        </w:rPr>
+      </w:pPr>
+      <w:r>
+        <w:rPr>
+          <w:b/>
+          <w:bCs/>
+        </w:rPr>
+        <w:t xml:space="preserve">6. Size of </w:t>
+      </w:r>
+      <w:proofErr w:type="spellStart"/>
+      <w:r>
+        <w:rPr>
+          <w:b/>
+          <w:bCs/>
+        </w:rPr>
+        <w:t>ArrayList</w:t>
+      </w:r>
+      <w:proofErr w:type="spellEnd"/>
+    </w:p>
+    <w:p>
+      <w:r>
+        <w:t>Use:</w:t>
+      </w:r>
+    </w:p>
+    <w:p>
+      <w:proofErr w:type="spellStart"/>
+      <w:r>
+        <w:t>list.size</w:t>
+      </w:r>
+      <w:proofErr w:type="spellEnd"/>
+      <w:r>
+        <w:t>();</w:t>
+      </w:r>
+    </w:p>
+    <w:p>
+      <w:r>
+        <w:t>Example:</w:t>
+      </w:r>
+    </w:p>
+    <w:p>
+      <w:proofErr w:type="spellStart"/>
+      <w:r>
+        <w:t>System.out.println</w:t>
+      </w:r>
+      <w:proofErr w:type="spellEnd"/>
+      <w:r>
+        <w:t>(</w:t>
+      </w:r>
+      <w:proofErr w:type="spellStart"/>
+      <w:r>
+        <w:t>list.size</w:t>
+      </w:r>
+      <w:proofErr w:type="spellEnd"/>
+      <w:r>
+        <w:t>());</w:t>
+      </w:r>
+    </w:p>
+    <w:p>
+      <w:r>
+        <w:t>If:</w:t>
+      </w:r>
+    </w:p>
+    <w:p>
+      <w:r>
+        <w:t>[10, 20, 30]</w:t>
+      </w:r>
+    </w:p>
+    <w:p>
+      <w:r>
+        <w:t>Output:</w:t>
+      </w:r>
+    </w:p>
+    <w:p>
+      <w:r>
+        <w:t>3</w:t>
+      </w:r>
+    </w:p>
+    <w:p>
+      <w:r>
+        <w:rPr>
+          <w:b/>
+          <w:bCs/>
+        </w:rPr>
+        <w:t>Time:</w:t>
+      </w:r>
+      <w:r>
+        <w:t xml:space="preserve"> O(1)</w:t>
+      </w:r>
+    </w:p>
+    <w:p>
+      <w:r>
+        <w:rPr>
+          <w:rFonts w:ascii="Segoe UI Emoji" w:hAnsi="Segoe UI Emoji" w:cs="Segoe UI Emoji"/>
+        </w:rPr>
+        <w:t>⚠️</w:t>
+      </w:r>
+      <w:r>
+        <w:t xml:space="preserve"> Array:</w:t>
+      </w:r>
+    </w:p>
+    <w:p>
+      <w:proofErr w:type="spellStart"/>
+      <w:r>
+        <w:t>arr.length</w:t>
+      </w:r>
+      <w:proofErr w:type="spellEnd"/>
+    </w:p>
+    <w:p>
+      <w:proofErr w:type="spellStart"/>
+      <w:r>
+        <w:t>ArrayList</w:t>
+      </w:r>
+      <w:proofErr w:type="spellEnd"/>
+      <w:r>
+        <w:t>:</w:t>
+      </w:r>
+    </w:p>
+    <w:p>
+      <w:proofErr w:type="spellStart"/>
+      <w:r>
+        <w:t>list.size</w:t>
+      </w:r>
+      <w:proofErr w:type="spellEnd"/>
+      <w:r>
+        <w:t>()</w:t>
+      </w:r>
+    </w:p>
+    <w:p>
+      <w:r>
+        <w:pict w14:anchorId="58A871C5">
+          <v:rect id="_x0000_i1102" style="width:0;height:1.5pt" o:hralign="center" o:hrstd="t" o:hr="t" fillcolor="#a0a0a0" stroked="f"/>
+        </w:pict>
+      </w:r>
+    </w:p>
+    <w:p>
+      <w:pPr>
+        <w:rPr>
+          <w:b/>
+          <w:bCs/>
+        </w:rPr>
+      </w:pPr>
+      <w:r>
+        <w:rPr>
+          <w:b/>
+          <w:bCs/>
+        </w:rPr>
+        <w:t>7. Check if Empty</w:t>
+      </w:r>
+    </w:p>
+    <w:p>
+      <w:proofErr w:type="spellStart"/>
+      <w:r>
+        <w:t>list.isEmpty</w:t>
+      </w:r>
+      <w:proofErr w:type="spellEnd"/>
+      <w:r>
+        <w:t>();</w:t>
+      </w:r>
+    </w:p>
+    <w:p>
+      <w:r>
+        <w:t>Example:</w:t>
+      </w:r>
+    </w:p>
+    <w:p>
+      <w:r>
+        <w:t>if (</w:t>
+      </w:r>
+      <w:proofErr w:type="spellStart"/>
+      <w:r>
+        <w:t>list.isEmpty</w:t>
+      </w:r>
+      <w:proofErr w:type="spellEnd"/>
+      <w:r>
+        <w:t>()) {</w:t>
+      </w:r>
+    </w:p>
+    <w:p>
+      <w:r>
+        <w:t xml:space="preserve">    </w:t>
+      </w:r>
+      <w:proofErr w:type="spellStart"/>
+      <w:r>
+        <w:t>System.out.println</w:t>
+      </w:r>
+      <w:proofErr w:type="spellEnd"/>
+      <w:r>
+        <w:t>("List is empty");</w:t>
+      </w:r>
+    </w:p>
+    <w:p>
+      <w:r>
+        <w:t>}</w:t>
+      </w:r>
+    </w:p>
+    <w:p>
+      <w:r>
+        <w:t>Returns true or false.</w:t>
+      </w:r>
+    </w:p>
+    <w:p>
+      <w:r>
+        <w:pict w14:anchorId="51216F41">
+          <v:rect id="_x0000_i1103" style="width:0;height:1.5pt" o:hralign="center" o:hrstd="t" o:hr="t" fillcolor="#a0a0a0" stroked="f"/>
+        </w:pict>
+      </w:r>
+    </w:p>
+    <w:p>
+      <w:pPr>
+        <w:rPr>
+          <w:b/>
+          <w:bCs/>
+        </w:rPr>
+      </w:pPr>
+      <w:r>
+        <w:rPr>
+          <w:b/>
+          <w:bCs/>
+        </w:rPr>
+        <w:lastRenderedPageBreak/>
+        <w:t xml:space="preserve">8. Sort </w:t>
+      </w:r>
+      <w:proofErr w:type="spellStart"/>
+      <w:r>
+        <w:rPr>
+          <w:b/>
+          <w:bCs/>
+        </w:rPr>
+        <w:t>ArrayList</w:t>
+      </w:r>
+      <w:proofErr w:type="spellEnd"/>
+      <w:r>
+        <w:rPr>
+          <w:b/>
+          <w:bCs/>
+        </w:rPr>
+        <w:t xml:space="preserve"> </w:t>
+      </w:r>
+      <w:r>
+        <w:rPr>
+          <w:rFonts w:ascii="Segoe UI Emoji" w:hAnsi="Segoe UI Emoji" w:cs="Segoe UI Emoji"/>
+          <w:b/>
+          <w:bCs/>
+        </w:rPr>
+        <w:t>⭐⭐⭐</w:t>
+      </w:r>
+    </w:p>
+    <w:p>
+      <w:r>
+        <w:t>Use:</w:t>
+      </w:r>
+    </w:p>
+    <w:p>
+      <w:proofErr w:type="spellStart"/>
+      <w:r>
+        <w:t>Collections.sort</w:t>
+      </w:r>
+      <w:proofErr w:type="spellEnd"/>
+      <w:r>
+        <w:t>(list);</w:t>
+      </w:r>
+    </w:p>
+    <w:p>
+      <w:r>
+        <w:t>Example:</w:t>
+      </w:r>
+    </w:p>
+    <w:p>
+      <w:proofErr w:type="spellStart"/>
+      <w:r>
+        <w:t>ArrayList</w:t>
+      </w:r>
+      <w:proofErr w:type="spellEnd"/>
+      <w:r>
+        <w:t xml:space="preserve">&lt;Integer&gt; list = new </w:t>
+      </w:r>
+      <w:proofErr w:type="spellStart"/>
+      <w:r>
+        <w:t>ArrayList</w:t>
+      </w:r>
+      <w:proofErr w:type="spellEnd"/>
+      <w:r>
+        <w:t>&lt;&gt;();</w:t>
+      </w:r>
+    </w:p>
+    <w:p/>
+    <w:p>
+      <w:proofErr w:type="spellStart"/>
+      <w:r>
+        <w:t>list.add</w:t>
+      </w:r>
+      <w:proofErr w:type="spellEnd"/>
+      <w:r>
+        <w:t>(50);</w:t>
+      </w:r>
+    </w:p>
+    <w:p>
+      <w:proofErr w:type="spellStart"/>
+      <w:r>
+        <w:t>list.add</w:t>
+      </w:r>
+      <w:proofErr w:type="spellEnd"/>
+      <w:r>
+        <w:t>(10);</w:t>
+      </w:r>
+    </w:p>
+    <w:p>
+      <w:proofErr w:type="spellStart"/>
+      <w:r>
+        <w:t>list.add</w:t>
+      </w:r>
+      <w:proofErr w:type="spellEnd"/>
+      <w:r>
+        <w:t>(40);</w:t>
+      </w:r>
+    </w:p>
+    <w:p>
+      <w:proofErr w:type="spellStart"/>
+      <w:r>
+        <w:t>list.add</w:t>
+      </w:r>
+      <w:proofErr w:type="spellEnd"/>
+      <w:r>
+        <w:t>(20);</w:t>
+      </w:r>
+    </w:p>
+    <w:p/>
+    <w:p>
+      <w:proofErr w:type="spellStart"/>
+      <w:r>
+        <w:t>Collections.sort</w:t>
+      </w:r>
+      <w:proofErr w:type="spellEnd"/>
+      <w:r>
+        <w:t>(list);</w:t>
+      </w:r>
+    </w:p>
+    <w:p/>
+    <w:p>
+      <w:proofErr w:type="spellStart"/>
+      <w:r>
+        <w:t>System.out.println</w:t>
+      </w:r>
+      <w:proofErr w:type="spellEnd"/>
+      <w:r>
+        <w:t>(list);</w:t>
+      </w:r>
+    </w:p>
+    <w:p>
+      <w:r>
+        <w:t>Output:</w:t>
+      </w:r>
+    </w:p>
+    <w:p>
+      <w:r>
+        <w:t>[10, 20, 40, 50]</w:t>
+      </w:r>
+    </w:p>
+    <w:p>
+      <w:r>
+        <w:rPr>
+          <w:b/>
+          <w:bCs/>
+        </w:rPr>
+        <w:t>Time:</w:t>
+      </w:r>
+      <w:r>
+        <w:t xml:space="preserve"> O(n log n)</w:t>
+      </w:r>
+    </w:p>
+    <w:p>
+      <w:pPr>
+        <w:rPr>
+          <w:b/>
+          <w:bCs/>
+        </w:rPr>
+      </w:pPr>
+      <w:r>
+        <w:rPr>
+          <w:b/>
+          <w:bCs/>
+        </w:rPr>
+        <w:t>Descending order</w:t>
+      </w:r>
+    </w:p>
+    <w:p>
+      <w:proofErr w:type="spellStart"/>
+      <w:r>
+        <w:t>Collections.sort</w:t>
+      </w:r>
+      <w:proofErr w:type="spellEnd"/>
+      <w:r>
+        <w:t xml:space="preserve">(list, </w:t>
+      </w:r>
+      <w:proofErr w:type="spellStart"/>
+      <w:r>
+        <w:t>Collections.reverseOrder</w:t>
+      </w:r>
+      <w:proofErr w:type="spellEnd"/>
+      <w:r>
+        <w:t>());</w:t>
+      </w:r>
+    </w:p>
+    <w:p>
+      <w:r>
+        <w:t>Output:</w:t>
+      </w:r>
+    </w:p>
+    <w:p>
+      <w:r>
+        <w:t>[50, 40, 20, 10]</w:t>
+      </w:r>
+    </w:p>
+    <w:p>
+      <w:r>
+        <w:pict w14:anchorId="0AB5DE8B">
+          <v:rect id="_x0000_i1104" style="width:0;height:1.5pt" o:hralign="center" o:hrstd="t" o:hr="t" fillcolor="#a0a0a0" stroked="f"/>
+        </w:pict>
+      </w:r>
+    </w:p>
+    <w:p>
+      <w:pPr>
+        <w:rPr>
+          <w:b/>
+          <w:bCs/>
+        </w:rPr>
+      </w:pPr>
+      <w:r>
+        <w:rPr>
+          <w:b/>
+          <w:bCs/>
+        </w:rPr>
+        <w:t xml:space="preserve">9. Clear Entire </w:t>
+      </w:r>
+      <w:proofErr w:type="spellStart"/>
+      <w:r>
+        <w:rPr>
+          <w:b/>
+          <w:bCs/>
+        </w:rPr>
+        <w:t>ArrayList</w:t>
+      </w:r>
+      <w:proofErr w:type="spellEnd"/>
+    </w:p>
+    <w:p>
+      <w:proofErr w:type="spellStart"/>
+      <w:r>
+        <w:t>list.clear</w:t>
+      </w:r>
+      <w:proofErr w:type="spellEnd"/>
+      <w:r>
+        <w:t>();</w:t>
+      </w:r>
+    </w:p>
+    <w:p>
+      <w:r>
+        <w:t>Example:</w:t>
+      </w:r>
+    </w:p>
+    <w:p>
+      <w:r>
+        <w:t>Before → [10, 20, 30]</w:t>
+      </w:r>
+    </w:p>
+    <w:p/>
+    <w:p>
+      <w:r>
+        <w:t>After → []</w:t>
+      </w:r>
+    </w:p>
+    <w:p>
+      <w:r>
+        <w:pict w14:anchorId="7E272A5F">
+          <v:rect id="_x0000_i1105" style="width:0;height:1.5pt" o:hralign="center" o:hrstd="t" o:hr="t" fillcolor="#a0a0a0" stroked="f"/>
+        </w:pict>
+      </w:r>
+    </w:p>
+    <w:p>
+      <w:pPr>
+        <w:rPr>
+          <w:b/>
+          <w:bCs/>
+        </w:rPr>
+      </w:pPr>
+      <w:r>
+        <w:rPr>
+          <w:b/>
+          <w:bCs/>
+        </w:rPr>
+        <w:t xml:space="preserve">10. Loop Through </w:t>
+      </w:r>
+      <w:proofErr w:type="spellStart"/>
+      <w:r>
+        <w:rPr>
+          <w:b/>
+          <w:bCs/>
+        </w:rPr>
+        <w:t>ArrayList</w:t>
+      </w:r>
+      <w:proofErr w:type="spellEnd"/>
+    </w:p>
+    <w:p>
+      <w:pPr>
+        <w:rPr>
+          <w:b/>
+          <w:bCs/>
+        </w:rPr>
+      </w:pPr>
+      <w:r>
+        <w:rPr>
+          <w:b/>
+          <w:bCs/>
+        </w:rPr>
+        <w:t>Normal for loop</w:t>
+      </w:r>
+    </w:p>
+    <w:p>
+      <w:r>
+        <w:t xml:space="preserve">for (int </w:t>
+      </w:r>
+      <w:proofErr w:type="spellStart"/>
+      <w:r>
+        <w:t>i</w:t>
+      </w:r>
+      <w:proofErr w:type="spellEnd"/>
+      <w:r>
+        <w:t xml:space="preserve"> = 0; </w:t>
+      </w:r>
+      <w:proofErr w:type="spellStart"/>
+      <w:r>
+        <w:t>i</w:t>
+      </w:r>
+      <w:proofErr w:type="spellEnd"/>
+      <w:r>
+        <w:t xml:space="preserve"> &lt; </w:t>
+      </w:r>
+      <w:proofErr w:type="spellStart"/>
+      <w:r>
+        <w:t>list.size</w:t>
+      </w:r>
+      <w:proofErr w:type="spellEnd"/>
+      <w:r>
+        <w:t xml:space="preserve">(); </w:t>
+      </w:r>
+      <w:proofErr w:type="spellStart"/>
+      <w:r>
+        <w:t>i</w:t>
+      </w:r>
+      <w:proofErr w:type="spellEnd"/>
+      <w:r>
+        <w:t>++) {</w:t>
+      </w:r>
+    </w:p>
+    <w:p>
+      <w:r>
+        <w:t xml:space="preserve">    </w:t>
+      </w:r>
+      <w:proofErr w:type="spellStart"/>
+      <w:r>
+        <w:t>System.out.println</w:t>
+      </w:r>
+      <w:proofErr w:type="spellEnd"/>
+      <w:r>
+        <w:t>(</w:t>
+      </w:r>
+      <w:proofErr w:type="spellStart"/>
+      <w:r>
+        <w:t>list.get</w:t>
+      </w:r>
+      <w:proofErr w:type="spellEnd"/>
+      <w:r>
+        <w:t>(</w:t>
+      </w:r>
+      <w:proofErr w:type="spellStart"/>
+      <w:r>
+        <w:t>i</w:t>
+      </w:r>
+      <w:proofErr w:type="spellEnd"/>
+      <w:r>
+        <w:t>));</w:t>
+      </w:r>
+    </w:p>
+    <w:p>
+      <w:r>
+        <w:t>}</w:t>
+      </w:r>
+    </w:p>
+    <w:p>
+      <w:pPr>
+        <w:rPr>
+          <w:b/>
+          <w:bCs/>
+        </w:rPr>
+      </w:pPr>
+      <w:r>
+        <w:rPr>
+          <w:b/>
+          <w:bCs/>
+        </w:rPr>
+        <w:lastRenderedPageBreak/>
+        <w:t xml:space="preserve">Enhanced for loop </w:t>
+      </w:r>
+      <w:r>
+        <w:rPr>
+          <w:rFonts w:ascii="Segoe UI Emoji" w:hAnsi="Segoe UI Emoji" w:cs="Segoe UI Emoji"/>
+          <w:b/>
+          <w:bCs/>
+        </w:rPr>
+        <w:t>⭐</w:t>
+      </w:r>
+    </w:p>
+    <w:p>
+      <w:r>
+        <w:t xml:space="preserve">for (int </w:t>
+      </w:r>
+      <w:proofErr w:type="spellStart"/>
+      <w:r>
+        <w:t>num</w:t>
+      </w:r>
+      <w:proofErr w:type="spellEnd"/>
+      <w:r>
+        <w:t xml:space="preserve"> : list) {</w:t>
+      </w:r>
+    </w:p>
+    <w:p>
+      <w:r>
+        <w:t xml:space="preserve">    </w:t>
+      </w:r>
+      <w:proofErr w:type="spellStart"/>
+      <w:r>
+        <w:t>System.out.println</w:t>
+      </w:r>
+      <w:proofErr w:type="spellEnd"/>
+      <w:r>
+        <w:t>(</w:t>
+      </w:r>
+      <w:proofErr w:type="spellStart"/>
+      <w:r>
+        <w:t>num</w:t>
+      </w:r>
+      <w:proofErr w:type="spellEnd"/>
+      <w:r>
+        <w:t>);</w:t>
+      </w:r>
+    </w:p>
+    <w:p>
+      <w:r>
+        <w:t>}</w:t>
+      </w:r>
+    </w:p>
+    <w:p>
+      <w:r>
+        <w:t>For DSA, you will frequently use this:</w:t>
+      </w:r>
+    </w:p>
+    <w:p>
+      <w:r>
+        <w:t xml:space="preserve">for (int </w:t>
+      </w:r>
+      <w:proofErr w:type="spellStart"/>
+      <w:r>
+        <w:t>num</w:t>
+      </w:r>
+      <w:proofErr w:type="spellEnd"/>
+      <w:r>
+        <w:t xml:space="preserve"> : list) {</w:t>
+      </w:r>
+    </w:p>
+    <w:p>
+      <w:r>
+        <w:t xml:space="preserve">    // logic</w:t>
+      </w:r>
+    </w:p>
+    <w:p>
+      <w:r>
+        <w:t>}</w:t>
+      </w:r>
+    </w:p>
     <w:p/>
     <w:sectPr>
       <w:pgSz w:w="11906" w:h="16838"/>

</xml_diff>

<commit_message>
Solved: Monotonic,Lonely,Count,Paisum using Arraylist
</commit_message>
<xml_diff>
--- a/ArrayLists/Notes/ArrayLists.docx
+++ b/ArrayLists/Notes/ArrayLists.docx
@@ -126,7 +126,7 @@
     <w:p>
       <w:r>
         <w:pict w14:anchorId="1411EC48">
-          <v:rect id="_x0000_i1025" style="width:0;height:1.5pt" o:hralign="center" o:hrstd="t" o:hr="t" fillcolor="#a0a0a0" stroked="f"/>
+          <v:rect id="_x0000_i1025" style="width:0;height:1.5pt" o:hralign="center" o:bullet="t" o:hrstd="t" o:hr="t" fillcolor="#a0a0a0" stroked="f"/>
         </w:pict>
       </w:r>
     </w:p>
@@ -141,6 +141,154 @@
         <w:rPr>
           <w:b/>
           <w:bCs/>
+          <w:highlight w:val="yellow"/>
+        </w:rPr>
+        <w:t xml:space="preserve">How </w:t>
+      </w:r>
+      <w:proofErr w:type="spellStart"/>
+      <w:r>
+        <w:rPr>
+          <w:b/>
+          <w:bCs/>
+          <w:highlight w:val="yellow"/>
+        </w:rPr>
+        <w:t>ArrayList</w:t>
+      </w:r>
+      <w:proofErr w:type="spellEnd"/>
+      <w:r>
+        <w:rPr>
+          <w:b/>
+          <w:bCs/>
+          <w:highlight w:val="yellow"/>
+        </w:rPr>
+        <w:t xml:space="preserve"> works internally</w:t>
+      </w:r>
+    </w:p>
+    <w:p>
+      <w:r>
+        <w:t>Conceptually:</w:t>
+      </w:r>
+    </w:p>
+    <w:p>
+      <w:proofErr w:type="spellStart"/>
+      <w:r>
+        <w:t>ArrayList</w:t>
+      </w:r>
+      <w:proofErr w:type="spellEnd"/>
+    </w:p>
+    <w:p>
+      <w:r>
+        <w:t xml:space="preserve">   ↓</w:t>
+      </w:r>
+    </w:p>
+    <w:p>
+      <w:r>
+        <w:t>Internal Array</w:t>
+      </w:r>
+    </w:p>
+    <w:p>
+      <w:r>
+        <w:t>[10][20][</w:t>
+      </w:r>
+      <w:proofErr w:type="gramStart"/>
+      <w:r>
+        <w:t>30][ ][ ][</w:t>
+      </w:r>
+      <w:proofErr w:type="gramEnd"/>
+      <w:r>
+        <w:t xml:space="preserve"> ]</w:t>
+      </w:r>
+    </w:p>
+    <w:p>
+      <w:r>
+        <w:t xml:space="preserve">When the internal array becomes full, Java creates a </w:t>
+      </w:r>
+      <w:r>
+        <w:rPr>
+          <w:b/>
+          <w:bCs/>
+        </w:rPr>
+        <w:t>larger array</w:t>
+      </w:r>
+      <w:r>
+        <w:t xml:space="preserve"> and copies the old elements into it.</w:t>
+      </w:r>
+    </w:p>
+    <w:p>
+      <w:r>
+        <w:t>Therefore:</w:t>
+      </w:r>
+    </w:p>
+    <w:p>
+      <w:r>
+        <w:t>Array → Fixed Size</w:t>
+      </w:r>
+    </w:p>
+    <w:p>
+      <w:proofErr w:type="spellStart"/>
+      <w:r>
+        <w:t>ArrayList</w:t>
+      </w:r>
+      <w:proofErr w:type="spellEnd"/>
+      <w:r>
+        <w:t xml:space="preserve"> → Dynamic Size</w:t>
+      </w:r>
+    </w:p>
+    <w:p>
+      <w:pPr>
+        <w:rPr>
+          <w:b/>
+          <w:bCs/>
+        </w:rPr>
+      </w:pPr>
+      <w:r>
+        <w:rPr>
+          <w:b/>
+          <w:bCs/>
+        </w:rPr>
+        <w:t xml:space="preserve">Important interview point </w:t>
+      </w:r>
+      <w:r>
+        <w:rPr>
+          <w:rFonts w:ascii="Segoe UI Emoji" w:hAnsi="Segoe UI Emoji" w:cs="Segoe UI Emoji"/>
+          <w:b/>
+          <w:bCs/>
+        </w:rPr>
+        <w:t>⭐</w:t>
+      </w:r>
+    </w:p>
+    <w:p>
+      <w:proofErr w:type="spellStart"/>
+      <w:r>
+        <w:t>ArrayList</w:t>
+      </w:r>
+      <w:proofErr w:type="spellEnd"/>
+      <w:r>
+        <w:t xml:space="preserve"> is internally implemented using a </w:t>
+      </w:r>
+      <w:r>
+        <w:rPr>
+          <w:b/>
+          <w:bCs/>
+        </w:rPr>
+        <w:t>dynamic array</w:t>
+      </w:r>
+      <w:r>
+        <w:t>.</w:t>
+      </w:r>
+    </w:p>
+    <w:p/>
+    <w:p>
+      <w:pPr>
+        <w:rPr>
+          <w:b/>
+          <w:bCs/>
+        </w:rPr>
+      </w:pPr>
+      <w:r>
+        <w:rPr>
+          <w:b/>
+          <w:bCs/>
         </w:rPr>
         <w:t xml:space="preserve">2. </w:t>
       </w:r>
@@ -184,44 +332,115 @@
       </w:r>
       <w:proofErr w:type="spellEnd"/>
       <w:r>
+        <w:t>&lt;</w:t>
+      </w:r>
+      <w:proofErr w:type="gramStart"/>
+      <w:r>
+        <w:t>&gt;(</w:t>
+      </w:r>
+      <w:proofErr w:type="gramEnd"/>
+      <w:r>
+        <w:t>);</w:t>
+      </w:r>
+    </w:p>
+    <w:p>
+      <w:r>
+        <w:t>Example:</w:t>
+      </w:r>
+    </w:p>
+    <w:p>
+      <w:r>
+        <w:t xml:space="preserve">import </w:t>
+      </w:r>
+      <w:proofErr w:type="spellStart"/>
+      <w:r>
+        <w:t>java.util.ArrayList</w:t>
+      </w:r>
+      <w:proofErr w:type="spellEnd"/>
+      <w:r>
+        <w:t>;</w:t>
+      </w:r>
+    </w:p>
+    <w:p/>
+    <w:p>
+      <w:r>
+        <w:t>public class Main {</w:t>
+      </w:r>
+    </w:p>
+    <w:p>
+      <w:r>
+        <w:t xml:space="preserve">    public static void main(String[] </w:t>
+      </w:r>
+      <w:proofErr w:type="spellStart"/>
+      <w:r>
+        <w:t>args</w:t>
+      </w:r>
+      <w:proofErr w:type="spellEnd"/>
+      <w:r>
+        <w:t>) {</w:t>
+      </w:r>
+    </w:p>
+    <w:p/>
+    <w:p>
+      <w:r>
+        <w:t xml:space="preserve">        </w:t>
+      </w:r>
+      <w:proofErr w:type="spellStart"/>
+      <w:r>
+        <w:t>ArrayList</w:t>
+      </w:r>
+      <w:proofErr w:type="spellEnd"/>
+      <w:r>
+        <w:t xml:space="preserve">&lt;Integer&gt; numbers = new </w:t>
+      </w:r>
+      <w:proofErr w:type="spellStart"/>
+      <w:r>
+        <w:t>ArrayList</w:t>
+      </w:r>
+      <w:proofErr w:type="spellEnd"/>
+      <w:r>
         <w:t>&lt;&gt;();</w:t>
       </w:r>
     </w:p>
-    <w:p>
-      <w:r>
-        <w:t>Example:</w:t>
-      </w:r>
-    </w:p>
-    <w:p>
-      <w:r>
-        <w:t xml:space="preserve">import </w:t>
-      </w:r>
-      <w:proofErr w:type="spellStart"/>
-      <w:r>
-        <w:t>java.util.ArrayList</w:t>
-      </w:r>
-      <w:proofErr w:type="spellEnd"/>
-      <w:r>
-        <w:t>;</w:t>
-      </w:r>
-    </w:p>
     <w:p/>
     <w:p>
       <w:r>
-        <w:t>public class Main {</w:t>
-      </w:r>
-    </w:p>
-    <w:p>
-      <w:r>
-        <w:t xml:space="preserve">    public static void main(String[] </w:t>
-      </w:r>
-      <w:proofErr w:type="spellStart"/>
-      <w:r>
-        <w:t>args</w:t>
-      </w:r>
-      <w:proofErr w:type="spellEnd"/>
-      <w:r>
-        <w:t>) {</w:t>
+        <w:t xml:space="preserve">        </w:t>
+      </w:r>
+      <w:proofErr w:type="spellStart"/>
+      <w:r>
+        <w:t>numbers.add</w:t>
+      </w:r>
+      <w:proofErr w:type="spellEnd"/>
+      <w:r>
+        <w:t>(10);</w:t>
+      </w:r>
+    </w:p>
+    <w:p>
+      <w:r>
+        <w:t xml:space="preserve">        </w:t>
+      </w:r>
+      <w:proofErr w:type="spellStart"/>
+      <w:r>
+        <w:t>numbers.add</w:t>
+      </w:r>
+      <w:proofErr w:type="spellEnd"/>
+      <w:r>
+        <w:t>(20);</w:t>
+      </w:r>
+    </w:p>
+    <w:p>
+      <w:r>
+        <w:lastRenderedPageBreak/>
+        <w:t xml:space="preserve">        </w:t>
+      </w:r>
+      <w:proofErr w:type="spellStart"/>
+      <w:r>
+        <w:t>numbers.add</w:t>
+      </w:r>
+      <w:proofErr w:type="spellEnd"/>
+      <w:r>
+        <w:t>(30);</w:t>
       </w:r>
     </w:p>
     <w:p/>
@@ -231,68 +450,6 @@
       </w:r>
       <w:proofErr w:type="spellStart"/>
       <w:r>
-        <w:t>ArrayList</w:t>
-      </w:r>
-      <w:proofErr w:type="spellEnd"/>
-      <w:r>
-        <w:t xml:space="preserve">&lt;Integer&gt; numbers = new </w:t>
-      </w:r>
-      <w:proofErr w:type="spellStart"/>
-      <w:r>
-        <w:t>ArrayList</w:t>
-      </w:r>
-      <w:proofErr w:type="spellEnd"/>
-      <w:r>
-        <w:t>&lt;&gt;();</w:t>
-      </w:r>
-    </w:p>
-    <w:p/>
-    <w:p>
-      <w:r>
-        <w:t xml:space="preserve">        </w:t>
-      </w:r>
-      <w:proofErr w:type="spellStart"/>
-      <w:r>
-        <w:t>numbers.add</w:t>
-      </w:r>
-      <w:proofErr w:type="spellEnd"/>
-      <w:r>
-        <w:t>(10);</w:t>
-      </w:r>
-    </w:p>
-    <w:p>
-      <w:r>
-        <w:t xml:space="preserve">        </w:t>
-      </w:r>
-      <w:proofErr w:type="spellStart"/>
-      <w:r>
-        <w:t>numbers.add</w:t>
-      </w:r>
-      <w:proofErr w:type="spellEnd"/>
-      <w:r>
-        <w:t>(20);</w:t>
-      </w:r>
-    </w:p>
-    <w:p>
-      <w:r>
-        <w:t xml:space="preserve">        </w:t>
-      </w:r>
-      <w:proofErr w:type="spellStart"/>
-      <w:r>
-        <w:t>numbers.add</w:t>
-      </w:r>
-      <w:proofErr w:type="spellEnd"/>
-      <w:r>
-        <w:t>(30);</w:t>
-      </w:r>
-    </w:p>
-    <w:p/>
-    <w:p>
-      <w:r>
-        <w:t xml:space="preserve">        </w:t>
-      </w:r>
-      <w:proofErr w:type="spellStart"/>
-      <w:r>
         <w:t>System.out.println</w:t>
       </w:r>
       <w:proofErr w:type="spellEnd"/>
@@ -401,7 +558,6 @@
     </w:p>
     <w:p>
       <w:r>
-        <w:lastRenderedPageBreak/>
         <w:t>Java provides wrapper classes:</w:t>
       </w:r>
     </w:p>
@@ -589,6 +745,7 @@
     </w:p>
     <w:p>
       <w:r>
+        <w:lastRenderedPageBreak/>
         <w:t xml:space="preserve">This </w:t>
       </w:r>
       <w:proofErr w:type="spellStart"/>
@@ -728,7 +885,6 @@
     </w:p>
     <w:p>
       <w:r>
-        <w:lastRenderedPageBreak/>
         <w:t>[true, false, true]</w:t>
       </w:r>
     </w:p>
@@ -967,6 +1123,7 @@
     <w:p>
       <w:proofErr w:type="spellStart"/>
       <w:r>
+        <w:lastRenderedPageBreak/>
         <w:t>ArrayList</w:t>
       </w:r>
       <w:proofErr w:type="spellEnd"/>
@@ -1167,7 +1324,6 @@
     <w:p>
       <w:proofErr w:type="spellStart"/>
       <w:r>
-        <w:lastRenderedPageBreak/>
         <w:t>ArrayList</w:t>
       </w:r>
       <w:proofErr w:type="spellEnd"/>
@@ -1538,7 +1694,6 @@
                 <w:b/>
                 <w:bCs/>
               </w:rPr>
-              <w:lastRenderedPageBreak/>
               <w:t>Operation</w:t>
             </w:r>
           </w:p>
@@ -1922,7 +2077,7 @@
     <w:p>
       <w:r>
         <w:pict w14:anchorId="204912FC">
-          <v:rect id="_x0000_i1096" style="width:0;height:1.5pt" o:hralign="center" o:hrstd="t" o:hr="t" fillcolor="#a0a0a0" stroked="f"/>
+          <v:rect id="_x0000_i1036" style="width:0;height:1.5pt" o:hralign="center" o:hrstd="t" o:hr="t" fillcolor="#a0a0a0" stroked="f"/>
         </w:pict>
       </w:r>
     </w:p>
@@ -2001,6 +2156,7 @@
     </w:p>
     <w:p>
       <w:r>
+        <w:lastRenderedPageBreak/>
         <w:t>[10, 20, 30]</w:t>
       </w:r>
     </w:p>
@@ -2066,7 +2222,7 @@
     <w:p>
       <w:r>
         <w:pict w14:anchorId="2E6A0D76">
-          <v:rect id="_x0000_i1097" style="width:0;height:1.5pt" o:hralign="center" o:hrstd="t" o:hr="t" fillcolor="#a0a0a0" stroked="f"/>
+          <v:rect id="_x0000_i1037" style="width:0;height:1.5pt" o:hralign="center" o:hrstd="t" o:hr="t" fillcolor="#a0a0a0" stroked="f"/>
         </w:pict>
       </w:r>
     </w:p>
@@ -2128,8 +2284,422 @@
     </w:p>
     <w:p>
       <w:r>
+        <w:t>50</w:t>
+      </w:r>
+    </w:p>
+    <w:p>
+      <w:r>
+        <w:rPr>
+          <w:b/>
+          <w:bCs/>
+        </w:rPr>
+        <w:t>Time:</w:t>
+      </w:r>
+      <w:r>
+        <w:t xml:space="preserve"> O(1)</w:t>
+      </w:r>
+    </w:p>
+    <w:p>
+      <w:proofErr w:type="spellStart"/>
+      <w:r>
+        <w:t>ArrayList</w:t>
+      </w:r>
+      <w:proofErr w:type="spellEnd"/>
+      <w:r>
+        <w:t xml:space="preserve"> provides fast access using index, similar to an array.</w:t>
+      </w:r>
+    </w:p>
+    <w:p>
+      <w:r>
+        <w:pict w14:anchorId="35933F62">
+          <v:rect id="_x0000_i1038" style="width:0;height:1.5pt" o:hralign="center" o:hrstd="t" o:hr="t" fillcolor="#a0a0a0" stroked="f"/>
+        </w:pict>
+      </w:r>
+    </w:p>
+    <w:p>
+      <w:pPr>
+        <w:rPr>
+          <w:b/>
+          <w:bCs/>
+        </w:rPr>
+      </w:pPr>
+      <w:r>
+        <w:rPr>
+          <w:b/>
+          <w:bCs/>
+        </w:rPr>
+        <w:t xml:space="preserve">3. Set / Update Element </w:t>
+      </w:r>
+      <w:r>
+        <w:rPr>
+          <w:rFonts w:ascii="Segoe UI Emoji" w:hAnsi="Segoe UI Emoji" w:cs="Segoe UI Emoji"/>
+          <w:b/>
+          <w:bCs/>
+        </w:rPr>
+        <w:t>⭐</w:t>
+      </w:r>
+    </w:p>
+    <w:p>
+      <w:r>
+        <w:t>Use set(index, value):</w:t>
+      </w:r>
+    </w:p>
+    <w:p>
+      <w:proofErr w:type="spellStart"/>
+      <w:r>
+        <w:t>list.set</w:t>
+      </w:r>
+      <w:proofErr w:type="spellEnd"/>
+      <w:r>
+        <w:t>(1, 100);</w:t>
+      </w:r>
+    </w:p>
+    <w:p>
+      <w:r>
+        <w:t>Before:</w:t>
+      </w:r>
+    </w:p>
+    <w:p>
+      <w:r>
+        <w:t>[10, 50, 20, 30]</w:t>
+      </w:r>
+    </w:p>
+    <w:p>
+      <w:r>
+        <w:t>After:</w:t>
+      </w:r>
+    </w:p>
+    <w:p>
+      <w:r>
+        <w:t>[10, 100, 20, 30]</w:t>
+      </w:r>
+    </w:p>
+    <w:p>
+      <w:r>
+        <w:rPr>
+          <w:b/>
+          <w:bCs/>
+        </w:rPr>
+        <w:t>Time:</w:t>
+      </w:r>
+      <w:r>
+        <w:t xml:space="preserve"> O(1)</w:t>
+      </w:r>
+    </w:p>
+    <w:p>
+      <w:pPr>
+        <w:rPr>
+          <w:b/>
+          <w:bCs/>
+        </w:rPr>
+      </w:pPr>
+      <w:r>
+        <w:rPr>
+          <w:b/>
+          <w:bCs/>
+        </w:rPr>
+        <w:t>Remember</w:t>
+      </w:r>
+    </w:p>
+    <w:p>
+      <w:proofErr w:type="spellStart"/>
+      <w:r>
+        <w:t>list.set</w:t>
+      </w:r>
+      <w:proofErr w:type="spellEnd"/>
+      <w:r>
+        <w:t xml:space="preserve">(index, </w:t>
+      </w:r>
+      <w:proofErr w:type="spellStart"/>
+      <w:r>
+        <w:t>newValue</w:t>
+      </w:r>
+      <w:proofErr w:type="spellEnd"/>
+      <w:r>
+        <w:t>);</w:t>
+      </w:r>
+    </w:p>
+    <w:p>
+      <w:r>
+        <w:t xml:space="preserve">It </w:t>
+      </w:r>
+      <w:r>
+        <w:rPr>
+          <w:b/>
+          <w:bCs/>
+        </w:rPr>
+        <w:t>replaces</w:t>
+      </w:r>
+      <w:r>
+        <w:t xml:space="preserve"> the existing element.</w:t>
+      </w:r>
+    </w:p>
+    <w:p>
+      <w:r>
+        <w:pict w14:anchorId="6CF3726F">
+          <v:rect id="_x0000_i1039" style="width:0;height:1.5pt" o:hralign="center" o:hrstd="t" o:hr="t" fillcolor="#a0a0a0" stroked="f"/>
+        </w:pict>
+      </w:r>
+    </w:p>
+    <w:p>
+      <w:pPr>
+        <w:rPr>
+          <w:b/>
+          <w:bCs/>
+        </w:rPr>
+      </w:pPr>
+      <w:r>
+        <w:rPr>
+          <w:b/>
+          <w:bCs/>
+        </w:rPr>
+        <w:t xml:space="preserve">4. Remove Element </w:t>
+      </w:r>
+      <w:r>
+        <w:rPr>
+          <w:rFonts w:ascii="Segoe UI Emoji" w:hAnsi="Segoe UI Emoji" w:cs="Segoe UI Emoji"/>
+          <w:b/>
+          <w:bCs/>
+        </w:rPr>
+        <w:t>⭐</w:t>
+      </w:r>
+    </w:p>
+    <w:p>
+      <w:pPr>
+        <w:rPr>
+          <w:b/>
+          <w:bCs/>
+        </w:rPr>
+      </w:pPr>
+      <w:r>
+        <w:rPr>
+          <w:b/>
+          <w:bCs/>
+        </w:rPr>
+        <w:t>Remove using index</w:t>
+      </w:r>
+    </w:p>
+    <w:p>
+      <w:proofErr w:type="spellStart"/>
+      <w:r>
+        <w:t>list.remove</w:t>
+      </w:r>
+      <w:proofErr w:type="spellEnd"/>
+      <w:r>
+        <w:t>(1);</w:t>
+      </w:r>
+    </w:p>
+    <w:p>
+      <w:r>
+        <w:t>Removes the element at index 1.</w:t>
+      </w:r>
+    </w:p>
+    <w:p>
+      <w:r>
+        <w:rPr>
+          <w:b/>
+          <w:bCs/>
+        </w:rPr>
+        <w:t>Time:</w:t>
+      </w:r>
+      <w:r>
+        <w:t xml:space="preserve"> O(n)</w:t>
+      </w:r>
+    </w:p>
+    <w:p>
+      <w:r>
         <w:lastRenderedPageBreak/>
-        <w:t>50</w:t>
+        <w:t>because elements after that index may shift left.</w:t>
+      </w:r>
+    </w:p>
+    <w:p>
+      <w:pPr>
+        <w:rPr>
+          <w:b/>
+          <w:bCs/>
+        </w:rPr>
+      </w:pPr>
+      <w:r>
+        <w:rPr>
+          <w:b/>
+          <w:bCs/>
+        </w:rPr>
+        <w:t xml:space="preserve">Remove an Integer value </w:t>
+      </w:r>
+      <w:r>
+        <w:rPr>
+          <w:rFonts w:ascii="Segoe UI Emoji" w:hAnsi="Segoe UI Emoji" w:cs="Segoe UI Emoji"/>
+          <w:b/>
+          <w:bCs/>
+        </w:rPr>
+        <w:t>⚠️</w:t>
+      </w:r>
+    </w:p>
+    <w:p>
+      <w:r>
+        <w:t>This is important:</w:t>
+      </w:r>
+    </w:p>
+    <w:p>
+      <w:proofErr w:type="spellStart"/>
+      <w:r>
+        <w:t>list.remove</w:t>
+      </w:r>
+      <w:proofErr w:type="spellEnd"/>
+      <w:r>
+        <w:t>(</w:t>
+      </w:r>
+      <w:proofErr w:type="spellStart"/>
+      <w:r>
+        <w:t>Integer.valueOf</w:t>
+      </w:r>
+      <w:proofErr w:type="spellEnd"/>
+      <w:r>
+        <w:t>(20));</w:t>
+      </w:r>
+    </w:p>
+    <w:p>
+      <w:r>
+        <w:t xml:space="preserve">This removes the </w:t>
+      </w:r>
+      <w:r>
+        <w:rPr>
+          <w:b/>
+          <w:bCs/>
+        </w:rPr>
+        <w:t>value 20</w:t>
+      </w:r>
+      <w:r>
+        <w:t>.</w:t>
+      </w:r>
+    </w:p>
+    <w:p>
+      <w:r>
+        <w:t xml:space="preserve">Why </w:t>
+      </w:r>
+      <w:proofErr w:type="spellStart"/>
+      <w:r>
+        <w:t>Integer.valueOf</w:t>
+      </w:r>
+      <w:proofErr w:type="spellEnd"/>
+      <w:r>
+        <w:t>()?</w:t>
+      </w:r>
+    </w:p>
+    <w:p>
+      <w:r>
+        <w:t>Because:</w:t>
+      </w:r>
+    </w:p>
+    <w:p>
+      <w:proofErr w:type="spellStart"/>
+      <w:r>
+        <w:t>list.remove</w:t>
+      </w:r>
+      <w:proofErr w:type="spellEnd"/>
+      <w:r>
+        <w:t>(20);</w:t>
+      </w:r>
+    </w:p>
+    <w:p>
+      <w:r>
+        <w:t>is interpreted as:</w:t>
+      </w:r>
+    </w:p>
+    <w:p>
+      <w:r>
+        <w:t>remove element at index 20</w:t>
+      </w:r>
+    </w:p>
+    <w:p>
+      <w:r>
+        <w:t>not remove the value 20.</w:t>
+      </w:r>
+    </w:p>
+    <w:p>
+      <w:r>
+        <w:pict w14:anchorId="5279F260">
+          <v:rect id="_x0000_i1040" style="width:0;height:1.5pt" o:hralign="center" o:hrstd="t" o:hr="t" fillcolor="#a0a0a0" stroked="f"/>
+        </w:pict>
+      </w:r>
+    </w:p>
+    <w:p>
+      <w:pPr>
+        <w:rPr>
+          <w:b/>
+          <w:bCs/>
+        </w:rPr>
+      </w:pPr>
+      <w:r>
+        <w:rPr>
+          <w:b/>
+          <w:bCs/>
+        </w:rPr>
+        <w:t xml:space="preserve">5. Contains Element </w:t>
+      </w:r>
+      <w:r>
+        <w:rPr>
+          <w:rFonts w:ascii="Segoe UI Emoji" w:hAnsi="Segoe UI Emoji" w:cs="Segoe UI Emoji"/>
+          <w:b/>
+          <w:bCs/>
+        </w:rPr>
+        <w:t>⭐</w:t>
+      </w:r>
+    </w:p>
+    <w:p>
+      <w:r>
+        <w:t>Check whether an element exists:</w:t>
+      </w:r>
+    </w:p>
+    <w:p>
+      <w:r>
+        <w:t>if (</w:t>
+      </w:r>
+      <w:proofErr w:type="spellStart"/>
+      <w:r>
+        <w:t>list.contains</w:t>
+      </w:r>
+      <w:proofErr w:type="spellEnd"/>
+      <w:r>
+        <w:t>(30)) {</w:t>
+      </w:r>
+    </w:p>
+    <w:p>
+      <w:r>
+        <w:t xml:space="preserve">    </w:t>
+      </w:r>
+      <w:proofErr w:type="spellStart"/>
+      <w:r>
+        <w:t>System.out.println</w:t>
+      </w:r>
+      <w:proofErr w:type="spellEnd"/>
+      <w:r>
+        <w:t>("Found");</w:t>
+      </w:r>
+    </w:p>
+    <w:p>
+      <w:r>
+        <w:t>}</w:t>
+      </w:r>
+    </w:p>
+    <w:p>
+      <w:r>
+        <w:t>Returns:</w:t>
+      </w:r>
+    </w:p>
+    <w:p>
+      <w:r>
+        <w:t>true</w:t>
+      </w:r>
+    </w:p>
+    <w:p>
+      <w:r>
+        <w:t>or</w:t>
+      </w:r>
+    </w:p>
+    <w:p>
+      <w:r>
+        <w:t>false</w:t>
       </w:r>
     </w:p>
     <w:p>
@@ -2141,23 +2711,166 @@
         <w:t>Time:</w:t>
       </w:r>
       <w:r>
+        <w:t xml:space="preserve"> O(n)</w:t>
+      </w:r>
+    </w:p>
+    <w:p>
+      <w:r>
+        <w:t xml:space="preserve">Because </w:t>
+      </w:r>
+      <w:proofErr w:type="spellStart"/>
+      <w:r>
+        <w:t>ArrayList</w:t>
+      </w:r>
+      <w:proofErr w:type="spellEnd"/>
+      <w:r>
+        <w:t xml:space="preserve"> may have to search the entire list.</w:t>
+      </w:r>
+    </w:p>
+    <w:p>
+      <w:r>
+        <w:pict w14:anchorId="2B543600">
+          <v:rect id="_x0000_i1041" style="width:0;height:1.5pt" o:hralign="center" o:hrstd="t" o:hr="t" fillcolor="#a0a0a0" stroked="f"/>
+        </w:pict>
+      </w:r>
+    </w:p>
+    <w:p>
+      <w:pPr>
+        <w:rPr>
+          <w:b/>
+          <w:bCs/>
+        </w:rPr>
+      </w:pPr>
+      <w:r>
+        <w:rPr>
+          <w:b/>
+          <w:bCs/>
+        </w:rPr>
+        <w:t xml:space="preserve">6. Size of </w:t>
+      </w:r>
+      <w:proofErr w:type="spellStart"/>
+      <w:r>
+        <w:rPr>
+          <w:b/>
+          <w:bCs/>
+        </w:rPr>
+        <w:t>ArrayList</w:t>
+      </w:r>
+      <w:proofErr w:type="spellEnd"/>
+    </w:p>
+    <w:p>
+      <w:r>
+        <w:t>Use:</w:t>
+      </w:r>
+    </w:p>
+    <w:p>
+      <w:proofErr w:type="spellStart"/>
+      <w:r>
+        <w:t>list.size</w:t>
+      </w:r>
+      <w:proofErr w:type="spellEnd"/>
+      <w:r>
+        <w:t>();</w:t>
+      </w:r>
+    </w:p>
+    <w:p>
+      <w:r>
+        <w:t>Example:</w:t>
+      </w:r>
+    </w:p>
+    <w:p>
+      <w:proofErr w:type="spellStart"/>
+      <w:r>
+        <w:t>System.out.println</w:t>
+      </w:r>
+      <w:proofErr w:type="spellEnd"/>
+      <w:r>
+        <w:t>(</w:t>
+      </w:r>
+      <w:proofErr w:type="spellStart"/>
+      <w:r>
+        <w:t>list.size</w:t>
+      </w:r>
+      <w:proofErr w:type="spellEnd"/>
+      <w:r>
+        <w:t>());</w:t>
+      </w:r>
+    </w:p>
+    <w:p>
+      <w:r>
+        <w:t>If:</w:t>
+      </w:r>
+    </w:p>
+    <w:p>
+      <w:r>
+        <w:t>[10, 20, 30]</w:t>
+      </w:r>
+    </w:p>
+    <w:p>
+      <w:r>
+        <w:t>Output:</w:t>
+      </w:r>
+    </w:p>
+    <w:p>
+      <w:r>
+        <w:t>3</w:t>
+      </w:r>
+    </w:p>
+    <w:p>
+      <w:r>
+        <w:rPr>
+          <w:b/>
+          <w:bCs/>
+        </w:rPr>
+        <w:t>Time:</w:t>
+      </w:r>
+      <w:r>
         <w:t xml:space="preserve"> O(1)</w:t>
       </w:r>
     </w:p>
     <w:p>
-      <w:proofErr w:type="spellStart"/>
-      <w:r>
-        <w:t>ArrayList</w:t>
-      </w:r>
-      <w:proofErr w:type="spellEnd"/>
-      <w:r>
-        <w:t xml:space="preserve"> provides fast access using index, similar to an array.</w:t>
-      </w:r>
-    </w:p>
-    <w:p>
-      <w:r>
-        <w:pict w14:anchorId="35933F62">
-          <v:rect id="_x0000_i1098" style="width:0;height:1.5pt" o:hralign="center" o:hrstd="t" o:hr="t" fillcolor="#a0a0a0" stroked="f"/>
+      <w:r>
+        <w:rPr>
+          <w:rFonts w:ascii="Segoe UI Emoji" w:hAnsi="Segoe UI Emoji" w:cs="Segoe UI Emoji"/>
+        </w:rPr>
+        <w:lastRenderedPageBreak/>
+        <w:t>⚠️</w:t>
+      </w:r>
+      <w:r>
+        <w:t xml:space="preserve"> Array:</w:t>
+      </w:r>
+    </w:p>
+    <w:p>
+      <w:proofErr w:type="spellStart"/>
+      <w:r>
+        <w:t>arr.length</w:t>
+      </w:r>
+      <w:proofErr w:type="spellEnd"/>
+    </w:p>
+    <w:p>
+      <w:proofErr w:type="spellStart"/>
+      <w:r>
+        <w:t>ArrayList</w:t>
+      </w:r>
+      <w:proofErr w:type="spellEnd"/>
+      <w:r>
+        <w:t>:</w:t>
+      </w:r>
+    </w:p>
+    <w:p>
+      <w:proofErr w:type="spellStart"/>
+      <w:r>
+        <w:t>list.size</w:t>
+      </w:r>
+      <w:proofErr w:type="spellEnd"/>
+      <w:r>
+        <w:t>()</w:t>
+      </w:r>
+    </w:p>
+    <w:p>
+      <w:r>
+        <w:pict w14:anchorId="58A871C5">
+          <v:rect id="_x0000_i1042" style="width:0;height:1.5pt" o:hralign="center" o:hrstd="t" o:hr="t" fillcolor="#a0a0a0" stroked="f"/>
         </w:pict>
       </w:r>
     </w:p>
@@ -2173,7 +2886,96 @@
           <w:b/>
           <w:bCs/>
         </w:rPr>
-        <w:t xml:space="preserve">3. Set / Update Element </w:t>
+        <w:t>7. Check if Empty</w:t>
+      </w:r>
+    </w:p>
+    <w:p>
+      <w:proofErr w:type="spellStart"/>
+      <w:r>
+        <w:t>list.isEmpty</w:t>
+      </w:r>
+      <w:proofErr w:type="spellEnd"/>
+      <w:r>
+        <w:t>();</w:t>
+      </w:r>
+    </w:p>
+    <w:p>
+      <w:r>
+        <w:t>Example:</w:t>
+      </w:r>
+    </w:p>
+    <w:p>
+      <w:r>
+        <w:t>if (</w:t>
+      </w:r>
+      <w:proofErr w:type="spellStart"/>
+      <w:r>
+        <w:t>list.isEmpty</w:t>
+      </w:r>
+      <w:proofErr w:type="spellEnd"/>
+      <w:r>
+        <w:t>()) {</w:t>
+      </w:r>
+    </w:p>
+    <w:p>
+      <w:r>
+        <w:t xml:space="preserve">    </w:t>
+      </w:r>
+      <w:proofErr w:type="spellStart"/>
+      <w:r>
+        <w:t>System.out.println</w:t>
+      </w:r>
+      <w:proofErr w:type="spellEnd"/>
+      <w:r>
+        <w:t>("List is empty");</w:t>
+      </w:r>
+    </w:p>
+    <w:p>
+      <w:r>
+        <w:t>}</w:t>
+      </w:r>
+    </w:p>
+    <w:p>
+      <w:r>
+        <w:t>Returns true or false.</w:t>
+      </w:r>
+    </w:p>
+    <w:p>
+      <w:r>
+        <w:pict w14:anchorId="51216F41">
+          <v:rect id="_x0000_i1043" style="width:0;height:1.5pt" o:hralign="center" o:hrstd="t" o:hr="t" fillcolor="#a0a0a0" stroked="f"/>
+        </w:pict>
+      </w:r>
+    </w:p>
+    <w:p>
+      <w:pPr>
+        <w:rPr>
+          <w:b/>
+          <w:bCs/>
+        </w:rPr>
+      </w:pPr>
+      <w:r>
+        <w:rPr>
+          <w:b/>
+          <w:bCs/>
+        </w:rPr>
+        <w:t xml:space="preserve">8. Sort </w:t>
+      </w:r>
+      <w:proofErr w:type="spellStart"/>
+      <w:r>
+        <w:rPr>
+          <w:b/>
+          <w:bCs/>
+        </w:rPr>
+        <w:t>ArrayList</w:t>
+      </w:r>
+      <w:proofErr w:type="spellEnd"/>
+      <w:r>
+        <w:rPr>
+          <w:b/>
+          <w:bCs/>
+        </w:rPr>
+        <w:t xml:space="preserve"> </w:t>
       </w:r>
       <w:r>
         <w:rPr>
@@ -2181,56 +2983,441 @@
           <w:b/>
           <w:bCs/>
         </w:rPr>
+        <w:t>⭐⭐⭐</w:t>
+      </w:r>
+    </w:p>
+    <w:p>
+      <w:r>
+        <w:t>Use:</w:t>
+      </w:r>
+    </w:p>
+    <w:p>
+      <w:proofErr w:type="spellStart"/>
+      <w:r>
+        <w:t>Collections.sort</w:t>
+      </w:r>
+      <w:proofErr w:type="spellEnd"/>
+      <w:r>
+        <w:t>(list);</w:t>
+      </w:r>
+    </w:p>
+    <w:p>
+      <w:r>
+        <w:t>Example:</w:t>
+      </w:r>
+    </w:p>
+    <w:p>
+      <w:proofErr w:type="spellStart"/>
+      <w:r>
+        <w:t>ArrayList</w:t>
+      </w:r>
+      <w:proofErr w:type="spellEnd"/>
+      <w:r>
+        <w:t xml:space="preserve">&lt;Integer&gt; list = new </w:t>
+      </w:r>
+      <w:proofErr w:type="spellStart"/>
+      <w:r>
+        <w:t>ArrayList</w:t>
+      </w:r>
+      <w:proofErr w:type="spellEnd"/>
+      <w:r>
+        <w:t>&lt;&gt;();</w:t>
+      </w:r>
+    </w:p>
+    <w:p/>
+    <w:p>
+      <w:proofErr w:type="spellStart"/>
+      <w:r>
+        <w:t>list.add</w:t>
+      </w:r>
+      <w:proofErr w:type="spellEnd"/>
+      <w:r>
+        <w:t>(50);</w:t>
+      </w:r>
+    </w:p>
+    <w:p>
+      <w:proofErr w:type="spellStart"/>
+      <w:r>
+        <w:t>list.add</w:t>
+      </w:r>
+      <w:proofErr w:type="spellEnd"/>
+      <w:r>
+        <w:t>(10);</w:t>
+      </w:r>
+    </w:p>
+    <w:p>
+      <w:proofErr w:type="spellStart"/>
+      <w:r>
+        <w:t>list.add</w:t>
+      </w:r>
+      <w:proofErr w:type="spellEnd"/>
+      <w:r>
+        <w:t>(40);</w:t>
+      </w:r>
+    </w:p>
+    <w:p>
+      <w:proofErr w:type="spellStart"/>
+      <w:r>
+        <w:t>list.add</w:t>
+      </w:r>
+      <w:proofErr w:type="spellEnd"/>
+      <w:r>
+        <w:t>(20);</w:t>
+      </w:r>
+    </w:p>
+    <w:p/>
+    <w:p>
+      <w:proofErr w:type="spellStart"/>
+      <w:r>
+        <w:t>Collections.sort</w:t>
+      </w:r>
+      <w:proofErr w:type="spellEnd"/>
+      <w:r>
+        <w:t>(list);</w:t>
+      </w:r>
+    </w:p>
+    <w:p/>
+    <w:p>
+      <w:proofErr w:type="spellStart"/>
+      <w:r>
+        <w:t>System.out.println</w:t>
+      </w:r>
+      <w:proofErr w:type="spellEnd"/>
+      <w:r>
+        <w:t>(list);</w:t>
+      </w:r>
+    </w:p>
+    <w:p>
+      <w:r>
+        <w:t>Output:</w:t>
+      </w:r>
+    </w:p>
+    <w:p>
+      <w:r>
+        <w:t>[10, 20, 40, 50]</w:t>
+      </w:r>
+    </w:p>
+    <w:p>
+      <w:r>
+        <w:rPr>
+          <w:b/>
+          <w:bCs/>
+        </w:rPr>
+        <w:t>Time:</w:t>
+      </w:r>
+      <w:r>
+        <w:t xml:space="preserve"> O(n log n)</w:t>
+      </w:r>
+    </w:p>
+    <w:p>
+      <w:pPr>
+        <w:rPr>
+          <w:b/>
+          <w:bCs/>
+        </w:rPr>
+      </w:pPr>
+      <w:r>
+        <w:rPr>
+          <w:b/>
+          <w:bCs/>
+        </w:rPr>
+        <w:t>Descending order</w:t>
+      </w:r>
+    </w:p>
+    <w:p>
+      <w:proofErr w:type="spellStart"/>
+      <w:r>
+        <w:t>Collections.sort</w:t>
+      </w:r>
+      <w:proofErr w:type="spellEnd"/>
+      <w:r>
+        <w:t xml:space="preserve">(list, </w:t>
+      </w:r>
+      <w:proofErr w:type="spellStart"/>
+      <w:r>
+        <w:t>Collections.reverseOrder</w:t>
+      </w:r>
+      <w:proofErr w:type="spellEnd"/>
+      <w:r>
+        <w:t>());</w:t>
+      </w:r>
+    </w:p>
+    <w:p>
+      <w:r>
+        <w:t>Output:</w:t>
+      </w:r>
+    </w:p>
+    <w:p>
+      <w:r>
+        <w:t>[50, 40, 20, 10]</w:t>
+      </w:r>
+    </w:p>
+    <w:p>
+      <w:r>
+        <w:lastRenderedPageBreak/>
+        <w:pict w14:anchorId="0AB5DE8B">
+          <v:rect id="_x0000_i1044" style="width:0;height:1.5pt" o:hralign="center" o:hrstd="t" o:hr="t" fillcolor="#a0a0a0" stroked="f"/>
+        </w:pict>
+      </w:r>
+    </w:p>
+    <w:p>
+      <w:pPr>
+        <w:rPr>
+          <w:b/>
+          <w:bCs/>
+        </w:rPr>
+      </w:pPr>
+      <w:r>
+        <w:rPr>
+          <w:b/>
+          <w:bCs/>
+        </w:rPr>
+        <w:t xml:space="preserve">9. Clear Entire </w:t>
+      </w:r>
+      <w:proofErr w:type="spellStart"/>
+      <w:r>
+        <w:rPr>
+          <w:b/>
+          <w:bCs/>
+        </w:rPr>
+        <w:t>ArrayList</w:t>
+      </w:r>
+      <w:proofErr w:type="spellEnd"/>
+    </w:p>
+    <w:p>
+      <w:proofErr w:type="spellStart"/>
+      <w:r>
+        <w:t>list.clear</w:t>
+      </w:r>
+      <w:proofErr w:type="spellEnd"/>
+      <w:r>
+        <w:t>();</w:t>
+      </w:r>
+    </w:p>
+    <w:p>
+      <w:r>
+        <w:t>Example:</w:t>
+      </w:r>
+    </w:p>
+    <w:p>
+      <w:r>
+        <w:t>Before → [10, 20, 30]</w:t>
+      </w:r>
+    </w:p>
+    <w:p/>
+    <w:p>
+      <w:r>
+        <w:t>After → []</w:t>
+      </w:r>
+    </w:p>
+    <w:p>
+      <w:r>
+        <w:pict w14:anchorId="7E272A5F">
+          <v:rect id="_x0000_i1045" style="width:0;height:1.5pt" o:hralign="center" o:hrstd="t" o:hr="t" fillcolor="#a0a0a0" stroked="f"/>
+        </w:pict>
+      </w:r>
+    </w:p>
+    <w:p>
+      <w:pPr>
+        <w:rPr>
+          <w:b/>
+          <w:bCs/>
+        </w:rPr>
+      </w:pPr>
+      <w:r>
+        <w:rPr>
+          <w:b/>
+          <w:bCs/>
+        </w:rPr>
+        <w:t xml:space="preserve">10. Loop Through </w:t>
+      </w:r>
+      <w:proofErr w:type="spellStart"/>
+      <w:r>
+        <w:rPr>
+          <w:b/>
+          <w:bCs/>
+        </w:rPr>
+        <w:t>ArrayList</w:t>
+      </w:r>
+      <w:proofErr w:type="spellEnd"/>
+    </w:p>
+    <w:p>
+      <w:pPr>
+        <w:rPr>
+          <w:b/>
+          <w:bCs/>
+        </w:rPr>
+      </w:pPr>
+      <w:r>
+        <w:rPr>
+          <w:b/>
+          <w:bCs/>
+        </w:rPr>
+        <w:t>Normal for loop</w:t>
+      </w:r>
+    </w:p>
+    <w:p>
+      <w:r>
+        <w:t xml:space="preserve">for (int </w:t>
+      </w:r>
+      <w:proofErr w:type="spellStart"/>
+      <w:r>
+        <w:t>i</w:t>
+      </w:r>
+      <w:proofErr w:type="spellEnd"/>
+      <w:r>
+        <w:t xml:space="preserve"> = 0; </w:t>
+      </w:r>
+      <w:proofErr w:type="spellStart"/>
+      <w:r>
+        <w:t>i</w:t>
+      </w:r>
+      <w:proofErr w:type="spellEnd"/>
+      <w:r>
+        <w:t xml:space="preserve"> &lt; </w:t>
+      </w:r>
+      <w:proofErr w:type="spellStart"/>
+      <w:r>
+        <w:t>list.size</w:t>
+      </w:r>
+      <w:proofErr w:type="spellEnd"/>
+      <w:r>
+        <w:t xml:space="preserve">(); </w:t>
+      </w:r>
+      <w:proofErr w:type="spellStart"/>
+      <w:r>
+        <w:t>i</w:t>
+      </w:r>
+      <w:proofErr w:type="spellEnd"/>
+      <w:r>
+        <w:t>++) {</w:t>
+      </w:r>
+    </w:p>
+    <w:p>
+      <w:r>
+        <w:t xml:space="preserve">    </w:t>
+      </w:r>
+      <w:proofErr w:type="spellStart"/>
+      <w:r>
+        <w:t>System.out.println</w:t>
+      </w:r>
+      <w:proofErr w:type="spellEnd"/>
+      <w:r>
+        <w:t>(</w:t>
+      </w:r>
+      <w:proofErr w:type="spellStart"/>
+      <w:r>
+        <w:t>list.get</w:t>
+      </w:r>
+      <w:proofErr w:type="spellEnd"/>
+      <w:r>
+        <w:t>(</w:t>
+      </w:r>
+      <w:proofErr w:type="spellStart"/>
+      <w:r>
+        <w:t>i</w:t>
+      </w:r>
+      <w:proofErr w:type="spellEnd"/>
+      <w:r>
+        <w:t>));</w:t>
+      </w:r>
+    </w:p>
+    <w:p>
+      <w:r>
+        <w:t>}</w:t>
+      </w:r>
+    </w:p>
+    <w:p>
+      <w:pPr>
+        <w:rPr>
+          <w:b/>
+          <w:bCs/>
+        </w:rPr>
+      </w:pPr>
+      <w:r>
+        <w:rPr>
+          <w:b/>
+          <w:bCs/>
+        </w:rPr>
+        <w:t xml:space="preserve">Enhanced for loop </w:t>
+      </w:r>
+      <w:r>
+        <w:rPr>
+          <w:rFonts w:ascii="Segoe UI Emoji" w:hAnsi="Segoe UI Emoji" w:cs="Segoe UI Emoji"/>
+          <w:b/>
+          <w:bCs/>
+        </w:rPr>
         <w:t>⭐</w:t>
       </w:r>
     </w:p>
     <w:p>
       <w:r>
-        <w:t>Use set(index, value):</w:t>
-      </w:r>
-    </w:p>
-    <w:p>
-      <w:proofErr w:type="spellStart"/>
-      <w:r>
-        <w:t>list.set</w:t>
-      </w:r>
-      <w:proofErr w:type="spellEnd"/>
-      <w:r>
-        <w:t>(1, 100);</w:t>
-      </w:r>
-    </w:p>
-    <w:p>
-      <w:r>
-        <w:t>Before:</w:t>
-      </w:r>
-    </w:p>
-    <w:p>
-      <w:r>
-        <w:t>[10, 50, 20, 30]</w:t>
-      </w:r>
-    </w:p>
-    <w:p>
-      <w:r>
-        <w:t>After:</w:t>
-      </w:r>
-    </w:p>
-    <w:p>
-      <w:r>
-        <w:t>[10, 100, 20, 30]</w:t>
-      </w:r>
-    </w:p>
-    <w:p>
-      <w:r>
-        <w:rPr>
-          <w:b/>
-          <w:bCs/>
-        </w:rPr>
-        <w:t>Time:</w:t>
-      </w:r>
-      <w:r>
-        <w:t xml:space="preserve"> O(1)</w:t>
-      </w:r>
-    </w:p>
+        <w:t xml:space="preserve">for (int </w:t>
+      </w:r>
+      <w:proofErr w:type="spellStart"/>
+      <w:r>
+        <w:t>num</w:t>
+      </w:r>
+      <w:proofErr w:type="spellEnd"/>
+      <w:r>
+        <w:t xml:space="preserve"> : list) {</w:t>
+      </w:r>
+    </w:p>
+    <w:p>
+      <w:r>
+        <w:t xml:space="preserve">    </w:t>
+      </w:r>
+      <w:proofErr w:type="spellStart"/>
+      <w:r>
+        <w:t>System.out.println</w:t>
+      </w:r>
+      <w:proofErr w:type="spellEnd"/>
+      <w:r>
+        <w:t>(</w:t>
+      </w:r>
+      <w:proofErr w:type="spellStart"/>
+      <w:r>
+        <w:t>num</w:t>
+      </w:r>
+      <w:proofErr w:type="spellEnd"/>
+      <w:r>
+        <w:t>);</w:t>
+      </w:r>
+    </w:p>
+    <w:p>
+      <w:r>
+        <w:t>}</w:t>
+      </w:r>
+    </w:p>
+    <w:p>
+      <w:r>
+        <w:t>For DSA, you will frequently use this:</w:t>
+      </w:r>
+    </w:p>
+    <w:p>
+      <w:r>
+        <w:t xml:space="preserve">for (int </w:t>
+      </w:r>
+      <w:proofErr w:type="spellStart"/>
+      <w:r>
+        <w:t>num</w:t>
+      </w:r>
+      <w:proofErr w:type="spellEnd"/>
+      <w:r>
+        <w:t xml:space="preserve"> : list) {</w:t>
+      </w:r>
+    </w:p>
+    <w:p>
+      <w:r>
+        <w:t xml:space="preserve">    // logic</w:t>
+      </w:r>
+    </w:p>
+    <w:p>
+      <w:r>
+        <w:t>}</w:t>
+      </w:r>
+    </w:p>
+    <w:p/>
     <w:p>
       <w:pPr>
         <w:rPr>
@@ -2242,51 +3429,402 @@
         <w:rPr>
           <w:b/>
           <w:bCs/>
-        </w:rPr>
-        <w:t>Remember</w:t>
-      </w:r>
-    </w:p>
-    <w:p>
-      <w:proofErr w:type="spellStart"/>
-      <w:r>
-        <w:t>list.set</w:t>
-      </w:r>
-      <w:proofErr w:type="spellEnd"/>
-      <w:r>
-        <w:t xml:space="preserve">(index, </w:t>
-      </w:r>
-      <w:proofErr w:type="spellStart"/>
-      <w:r>
-        <w:t>newValue</w:t>
-      </w:r>
-      <w:proofErr w:type="spellEnd"/>
-      <w:r>
-        <w:t>);</w:t>
-      </w:r>
-    </w:p>
-    <w:p>
-      <w:r>
-        <w:t xml:space="preserve">It </w:t>
-      </w:r>
-      <w:r>
-        <w:rPr>
-          <w:b/>
-          <w:bCs/>
-        </w:rPr>
-        <w:t>replaces</w:t>
-      </w:r>
-      <w:r>
-        <w:t xml:space="preserve"> the existing element.</w:t>
-      </w:r>
-    </w:p>
-    <w:p>
-      <w:r>
-        <w:pict w14:anchorId="6CF3726F">
-          <v:rect id="_x0000_i1099" style="width:0;height:1.5pt" o:hralign="center" o:hrstd="t" o:hr="t" fillcolor="#a0a0a0" stroked="f"/>
+          <w:highlight w:val="yellow"/>
+        </w:rPr>
+        <w:t>// Practice Problems</w:t>
+      </w:r>
+    </w:p>
+    <w:p>
+      <w:pPr>
+        <w:rPr>
+          <w:b/>
+          <w:bCs/>
+        </w:rPr>
+      </w:pPr>
+      <w:r>
+        <w:rPr>
+          <w:rFonts w:ascii="Segoe UI Emoji" w:hAnsi="Segoe UI Emoji" w:cs="Segoe UI Emoji"/>
+          <w:b/>
+          <w:bCs/>
+        </w:rPr>
+        <w:t>🟢</w:t>
+      </w:r>
+      <w:r>
+        <w:rPr>
+          <w:b/>
+          <w:bCs/>
+        </w:rPr>
+        <w:t xml:space="preserve"> Level 1 — Must Do</w:t>
+      </w:r>
+    </w:p>
+    <w:p>
+      <w:r>
+        <w:rPr>
+          <w:b/>
+          <w:bCs/>
+          <w:highlight w:val="green"/>
+        </w:rPr>
+        <w:t xml:space="preserve">Q1. Print all elements of an </w:t>
+      </w:r>
+      <w:proofErr w:type="spellStart"/>
+      <w:r>
+        <w:rPr>
+          <w:b/>
+          <w:bCs/>
+          <w:highlight w:val="green"/>
+        </w:rPr>
+        <w:t>ArrayList</w:t>
+      </w:r>
+      <w:proofErr w:type="spellEnd"/>
+      <w:r>
+        <w:br/>
+        <w:t xml:space="preserve">Given an </w:t>
+      </w:r>
+      <w:proofErr w:type="spellStart"/>
+      <w:r>
+        <w:t>ArrayList</w:t>
+      </w:r>
+      <w:proofErr w:type="spellEnd"/>
+      <w:r>
+        <w:t xml:space="preserve"> of integers, print every element.</w:t>
+      </w:r>
+    </w:p>
+    <w:p>
+      <w:r>
+        <w:t>Example:</w:t>
+      </w:r>
+    </w:p>
+    <w:p>
+      <w:r>
+        <w:t>Input</w:t>
+      </w:r>
+      <w:proofErr w:type="gramStart"/>
+      <w:r>
+        <w:t>:  [</w:t>
+      </w:r>
+      <w:proofErr w:type="gramEnd"/>
+      <w:r>
+        <w:t>10, 20, 30, 40]</w:t>
+      </w:r>
+    </w:p>
+    <w:p>
+      <w:r>
+        <w:t>Output: 10 20 30 40</w:t>
+      </w:r>
+    </w:p>
+    <w:p>
+      <w:r>
+        <w:pict w14:anchorId="704765C3">
+          <v:rect id="_x0000_i1190" style="width:0;height:1.5pt" o:hralign="center" o:hrstd="t" o:hr="t" fillcolor="#a0a0a0" stroked="f"/>
         </w:pict>
       </w:r>
     </w:p>
     <w:p>
+      <w:r>
+        <w:rPr>
+          <w:b/>
+          <w:bCs/>
+          <w:highlight w:val="green"/>
+        </w:rPr>
+        <w:t>Q2. Find the maximum element</w:t>
+      </w:r>
+    </w:p>
+    <w:p>
+      <w:r>
+        <w:t>Input</w:t>
+      </w:r>
+      <w:proofErr w:type="gramStart"/>
+      <w:r>
+        <w:t>:  [</w:t>
+      </w:r>
+      <w:proofErr w:type="gramEnd"/>
+      <w:r>
+        <w:t>10, 45, 23, 67, 12]</w:t>
+      </w:r>
+    </w:p>
+    <w:p>
+      <w:r>
+        <w:t>Output: 67</w:t>
+      </w:r>
+    </w:p>
+    <w:p>
+      <w:r>
+        <w:pict w14:anchorId="7E17E013">
+          <v:rect id="_x0000_i1191" style="width:0;height:1.5pt" o:hralign="center" o:hrstd="t" o:hr="t" fillcolor="#a0a0a0" stroked="f"/>
+        </w:pict>
+      </w:r>
+    </w:p>
+    <w:p>
+      <w:r>
+        <w:rPr>
+          <w:b/>
+          <w:bCs/>
+          <w:highlight w:val="green"/>
+        </w:rPr>
+        <w:lastRenderedPageBreak/>
+        <w:t>Q3. Find the minimum element</w:t>
+      </w:r>
+    </w:p>
+    <w:p>
+      <w:r>
+        <w:t>Input</w:t>
+      </w:r>
+      <w:proofErr w:type="gramStart"/>
+      <w:r>
+        <w:t>:  [</w:t>
+      </w:r>
+      <w:proofErr w:type="gramEnd"/>
+      <w:r>
+        <w:t>10, 45, 23, 67, 12]</w:t>
+      </w:r>
+    </w:p>
+    <w:p>
+      <w:r>
+        <w:t>Output: 10</w:t>
+      </w:r>
+    </w:p>
+    <w:p>
+      <w:r>
+        <w:pict w14:anchorId="74FC2B04">
+          <v:rect id="_x0000_i1192" style="width:0;height:1.5pt" o:hralign="center" o:hrstd="t" o:hr="t" fillcolor="#a0a0a0" stroked="f"/>
+        </w:pict>
+      </w:r>
+    </w:p>
+    <w:p>
+      <w:r>
+        <w:rPr>
+          <w:b/>
+          <w:bCs/>
+          <w:highlight w:val="green"/>
+        </w:rPr>
+        <w:t>Q4. Find the sum of all elements</w:t>
+      </w:r>
+    </w:p>
+    <w:p>
+      <w:r>
+        <w:t>Input</w:t>
+      </w:r>
+      <w:proofErr w:type="gramStart"/>
+      <w:r>
+        <w:t>:  [</w:t>
+      </w:r>
+      <w:proofErr w:type="gramEnd"/>
+      <w:r>
+        <w:t>10, 20, 30, 40]</w:t>
+      </w:r>
+    </w:p>
+    <w:p>
+      <w:r>
+        <w:t>Output: 100</w:t>
+      </w:r>
+    </w:p>
+    <w:p>
+      <w:r>
+        <w:pict w14:anchorId="090B2ADF">
+          <v:rect id="_x0000_i1193" style="width:0;height:1.5pt" o:hralign="center" o:hrstd="t" o:hr="t" fillcolor="#a0a0a0" stroked="f"/>
+        </w:pict>
+      </w:r>
+    </w:p>
+    <w:p>
+      <w:r>
+        <w:rPr>
+          <w:b/>
+          <w:bCs/>
+          <w:highlight w:val="green"/>
+        </w:rPr>
+        <w:t>Q5. Find the average of elements</w:t>
+      </w:r>
+    </w:p>
+    <w:p>
+      <w:r>
+        <w:t>Input</w:t>
+      </w:r>
+      <w:proofErr w:type="gramStart"/>
+      <w:r>
+        <w:t>:  [</w:t>
+      </w:r>
+      <w:proofErr w:type="gramEnd"/>
+      <w:r>
+        <w:t>10, 20, 30, 40]</w:t>
+      </w:r>
+    </w:p>
+    <w:p>
+      <w:r>
+        <w:t>Output: 25.0</w:t>
+      </w:r>
+    </w:p>
+    <w:p>
+      <w:r>
+        <w:pict w14:anchorId="0C786E94">
+          <v:rect id="_x0000_i1194" style="width:0;height:1.5pt" o:hralign="center" o:hrstd="t" o:hr="t" fillcolor="#a0a0a0" stroked="f"/>
+        </w:pict>
+      </w:r>
+    </w:p>
+    <w:p>
+      <w:r>
+        <w:rPr>
+          <w:b/>
+          <w:bCs/>
+          <w:highlight w:val="green"/>
+        </w:rPr>
+        <w:t>Q6. Search an element</w:t>
+      </w:r>
+      <w:r>
+        <w:br/>
+        <w:t xml:space="preserve">Given an </w:t>
+      </w:r>
+      <w:proofErr w:type="spellStart"/>
+      <w:r>
+        <w:t>ArrayList</w:t>
+      </w:r>
+      <w:proofErr w:type="spellEnd"/>
+      <w:r>
+        <w:t xml:space="preserve"> and a key, check whether the key exists.</w:t>
+      </w:r>
+    </w:p>
+    <w:p>
+      <w:r>
+        <w:t>Input</w:t>
+      </w:r>
+      <w:proofErr w:type="gramStart"/>
+      <w:r>
+        <w:t>:  [</w:t>
+      </w:r>
+      <w:proofErr w:type="gramEnd"/>
+      <w:r>
+        <w:t>10, 20, 30, 40], key = 30</w:t>
+      </w:r>
+    </w:p>
+    <w:p>
+      <w:r>
+        <w:t>Output: Found</w:t>
+      </w:r>
+    </w:p>
+    <w:p>
+      <w:r>
+        <w:t>Practice both:</w:t>
+      </w:r>
+    </w:p>
+    <w:p>
+      <w:proofErr w:type="spellStart"/>
+      <w:proofErr w:type="gramStart"/>
+      <w:r>
+        <w:t>list.contains</w:t>
+      </w:r>
+      <w:proofErr w:type="spellEnd"/>
+      <w:proofErr w:type="gramEnd"/>
+      <w:r>
+        <w:t>(key)</w:t>
+      </w:r>
+    </w:p>
+    <w:p>
+      <w:r>
+        <w:t>and manually using a loop.</w:t>
+      </w:r>
+    </w:p>
+    <w:p>
+      <w:r>
+        <w:pict w14:anchorId="0336D4C6">
+          <v:rect id="_x0000_i1195" style="width:0;height:1.5pt" o:hralign="center" o:hrstd="t" o:hr="t" fillcolor="#a0a0a0" stroked="f"/>
+        </w:pict>
+      </w:r>
+    </w:p>
+    <w:p>
+      <w:r>
+        <w:rPr>
+          <w:b/>
+          <w:bCs/>
+          <w:highlight w:val="green"/>
+        </w:rPr>
+        <w:t>Q7. Count even and odd numbers</w:t>
+      </w:r>
+    </w:p>
+    <w:p>
+      <w:r>
+        <w:t>Input</w:t>
+      </w:r>
+      <w:proofErr w:type="gramStart"/>
+      <w:r>
+        <w:t>:  [</w:t>
+      </w:r>
+      <w:proofErr w:type="gramEnd"/>
+      <w:r>
+        <w:t>10, 15, 20, 25, 30]</w:t>
+      </w:r>
+    </w:p>
+    <w:p>
+      <w:r>
+        <w:t>Output:</w:t>
+      </w:r>
+    </w:p>
+    <w:p>
+      <w:r>
+        <w:t>Even = 3</w:t>
+      </w:r>
+    </w:p>
+    <w:p>
+      <w:r>
+        <w:t>Odd = 2</w:t>
+      </w:r>
+    </w:p>
+    <w:p>
+      <w:r>
+        <w:pict w14:anchorId="698D5B76">
+          <v:rect id="_x0000_i1196" style="width:0;height:1.5pt" o:hralign="center" o:hrstd="t" o:hr="t" fillcolor="#a0a0a0" stroked="f"/>
+        </w:pict>
+      </w:r>
+    </w:p>
+    <w:p>
+      <w:r>
+        <w:rPr>
+          <w:b/>
+          <w:bCs/>
+          <w:highlight w:val="green"/>
+        </w:rPr>
+        <w:t>Q8. Count positive, negative and zero</w:t>
+      </w:r>
+    </w:p>
+    <w:p>
+      <w:r>
+        <w:t>Input</w:t>
+      </w:r>
+      <w:proofErr w:type="gramStart"/>
+      <w:r>
+        <w:t>:  [</w:t>
+      </w:r>
+      <w:proofErr w:type="gramEnd"/>
+      <w:r>
+        <w:t>10, -5, 0, 20, -3, 0]</w:t>
+      </w:r>
+    </w:p>
+    <w:p>
+      <w:r>
+        <w:t>Output:</w:t>
+      </w:r>
+    </w:p>
+    <w:p>
+      <w:r>
+        <w:t>Positive = 2</w:t>
+      </w:r>
+    </w:p>
+    <w:p>
+      <w:r>
+        <w:t>Negative = 2</w:t>
+      </w:r>
+    </w:p>
+    <w:p>
+      <w:r>
+        <w:t>Zero = 2</w:t>
+      </w:r>
+    </w:p>
+    <w:p>
+      <w:r>
+        <w:pict w14:anchorId="6EFAAC29">
+          <v:rect id="_x0000_i1197" style="width:0;height:1.5pt" o:hralign="center" o:hrstd="t" o:hr="t" fillcolor="#a0a0a0" stroked="f"/>
+        </w:pict>
+      </w:r>
+    </w:p>
+    <w:p>
       <w:pPr>
         <w:rPr>
           <w:b/>
@@ -2295,19 +3833,405 @@
       </w:pPr>
       <w:r>
         <w:rPr>
-          <w:b/>
-          <w:bCs/>
-        </w:rPr>
-        <w:t xml:space="preserve">4. Remove Element </w:t>
-      </w:r>
-      <w:r>
-        <w:rPr>
           <w:rFonts w:ascii="Segoe UI Emoji" w:hAnsi="Segoe UI Emoji" w:cs="Segoe UI Emoji"/>
           <w:b/>
           <w:bCs/>
         </w:rPr>
+        <w:t>🟡</w:t>
+      </w:r>
+      <w:r>
+        <w:rPr>
+          <w:b/>
+          <w:bCs/>
+        </w:rPr>
+        <w:t xml:space="preserve"> Level 2 — Very Important</w:t>
+      </w:r>
+    </w:p>
+    <w:p>
+      <w:r>
+        <w:rPr>
+          <w:b/>
+          <w:bCs/>
+          <w:highlight w:val="green"/>
+        </w:rPr>
+        <w:lastRenderedPageBreak/>
+        <w:t>Q9. Remove a particular element</w:t>
+      </w:r>
+    </w:p>
+    <w:p>
+      <w:r>
+        <w:t>Input</w:t>
+      </w:r>
+      <w:proofErr w:type="gramStart"/>
+      <w:r>
+        <w:t>:  [</w:t>
+      </w:r>
+      <w:proofErr w:type="gramEnd"/>
+      <w:r>
+        <w:t>10, 20, 30, 20, 40]</w:t>
+      </w:r>
+    </w:p>
+    <w:p>
+      <w:r>
+        <w:t>Remove: 20</w:t>
+      </w:r>
+    </w:p>
+    <w:p/>
+    <w:p>
+      <w:r>
+        <w:t>Output: [10, 30, 20, 40]</w:t>
+      </w:r>
+    </w:p>
+    <w:p>
+      <w:r>
+        <w:t>Understand the difference between:</w:t>
+      </w:r>
+    </w:p>
+    <w:p>
+      <w:proofErr w:type="spellStart"/>
+      <w:proofErr w:type="gramStart"/>
+      <w:r>
+        <w:t>list.remove</w:t>
+      </w:r>
+      <w:proofErr w:type="spellEnd"/>
+      <w:proofErr w:type="gramEnd"/>
+      <w:r>
+        <w:t>(2</w:t>
+      </w:r>
+      <w:proofErr w:type="gramStart"/>
+      <w:r>
+        <w:t xml:space="preserve">);   </w:t>
+      </w:r>
+      <w:proofErr w:type="gramEnd"/>
+      <w:r>
+        <w:t xml:space="preserve">   // removes by INDEX</w:t>
+      </w:r>
+    </w:p>
+    <w:p>
+      <w:proofErr w:type="spellStart"/>
+      <w:proofErr w:type="gramStart"/>
+      <w:r>
+        <w:t>list.remove</w:t>
+      </w:r>
+      <w:proofErr w:type="spellEnd"/>
+      <w:proofErr w:type="gramEnd"/>
+      <w:r>
+        <w:t>(</w:t>
+      </w:r>
+      <w:proofErr w:type="spellStart"/>
+      <w:r>
+        <w:t>Integer.valueOf</w:t>
+      </w:r>
+      <w:proofErr w:type="spellEnd"/>
+      <w:r>
+        <w:t>(20)); // removes VALUE</w:t>
+      </w:r>
+    </w:p>
+    <w:p>
+      <w:r>
+        <w:rPr>
+          <w:rFonts w:ascii="Segoe UI Emoji" w:hAnsi="Segoe UI Emoji" w:cs="Segoe UI Emoji"/>
+        </w:rPr>
         <w:t>⭐</w:t>
       </w:r>
+      <w:r>
+        <w:t xml:space="preserve"> This is a common Java interview trap.</w:t>
+      </w:r>
+    </w:p>
+    <w:p>
+      <w:r>
+        <w:pict w14:anchorId="21ABA020">
+          <v:rect id="_x0000_i1198" style="width:0;height:1.5pt" o:hralign="center" o:hrstd="t" o:hr="t" fillcolor="#a0a0a0" stroked="f"/>
+        </w:pict>
+      </w:r>
+    </w:p>
+    <w:p>
+      <w:r>
+        <w:rPr>
+          <w:b/>
+          <w:bCs/>
+        </w:rPr>
+        <w:t>Q10. Remove all occurrences of an element</w:t>
+      </w:r>
+    </w:p>
+    <w:p>
+      <w:r>
+        <w:t>Input</w:t>
+      </w:r>
+      <w:proofErr w:type="gramStart"/>
+      <w:r>
+        <w:t>:  [</w:t>
+      </w:r>
+      <w:proofErr w:type="gramEnd"/>
+      <w:r>
+        <w:t>10, 20, 30, 20, 40, 20]</w:t>
+      </w:r>
+    </w:p>
+    <w:p>
+      <w:r>
+        <w:t>Remove: 20</w:t>
+      </w:r>
+    </w:p>
+    <w:p/>
+    <w:p>
+      <w:r>
+        <w:t>Output: [10, 30, 40]</w:t>
+      </w:r>
+    </w:p>
+    <w:p>
+      <w:r>
+        <w:pict w14:anchorId="502AAF96">
+          <v:rect id="_x0000_i1199" style="width:0;height:1.5pt" o:hralign="center" o:hrstd="t" o:hr="t" fillcolor="#a0a0a0" stroked="f"/>
+        </w:pict>
+      </w:r>
+    </w:p>
+    <w:p>
+      <w:r>
+        <w:rPr>
+          <w:b/>
+          <w:bCs/>
+          <w:highlight w:val="green"/>
+        </w:rPr>
+        <w:t xml:space="preserve">Q11. Reverse an </w:t>
+      </w:r>
+      <w:proofErr w:type="spellStart"/>
+      <w:r>
+        <w:rPr>
+          <w:b/>
+          <w:bCs/>
+          <w:highlight w:val="green"/>
+        </w:rPr>
+        <w:t>ArrayList</w:t>
+      </w:r>
+      <w:proofErr w:type="spellEnd"/>
+    </w:p>
+    <w:p>
+      <w:r>
+        <w:t>Input</w:t>
+      </w:r>
+      <w:proofErr w:type="gramStart"/>
+      <w:r>
+        <w:t>:  [</w:t>
+      </w:r>
+      <w:proofErr w:type="gramEnd"/>
+      <w:r>
+        <w:t>10, 20, 30, 40]</w:t>
+      </w:r>
+    </w:p>
+    <w:p>
+      <w:r>
+        <w:t>Output: [40, 30, 20, 10]</w:t>
+      </w:r>
+    </w:p>
+    <w:p>
+      <w:r>
+        <w:t xml:space="preserve">Try it first </w:t>
+      </w:r>
+      <w:r>
+        <w:rPr>
+          <w:b/>
+          <w:bCs/>
+        </w:rPr>
+        <w:t>without</w:t>
+      </w:r>
+      <w:r>
+        <w:t xml:space="preserve"> </w:t>
+      </w:r>
+      <w:proofErr w:type="spellStart"/>
+      <w:r>
+        <w:t>Collections.reverse</w:t>
+      </w:r>
+      <w:proofErr w:type="spellEnd"/>
+      <w:r>
+        <w:t>().</w:t>
+      </w:r>
+    </w:p>
+    <w:p>
+      <w:r>
+        <w:pict w14:anchorId="109EDDAB">
+          <v:rect id="_x0000_i1200" style="width:0;height:1.5pt" o:hralign="center" o:hrstd="t" o:hr="t" fillcolor="#a0a0a0" stroked="f"/>
+        </w:pict>
+      </w:r>
+    </w:p>
+    <w:p>
+      <w:r>
+        <w:rPr>
+          <w:b/>
+          <w:bCs/>
+        </w:rPr>
+        <w:t>Q12. Find duplicate elements</w:t>
+      </w:r>
+    </w:p>
+    <w:p>
+      <w:r>
+        <w:t>Input</w:t>
+      </w:r>
+      <w:proofErr w:type="gramStart"/>
+      <w:r>
+        <w:t>:  [</w:t>
+      </w:r>
+      <w:proofErr w:type="gramEnd"/>
+      <w:r>
+        <w:t>10, 20, 30, 20, 40, 10]</w:t>
+      </w:r>
+    </w:p>
+    <w:p>
+      <w:r>
+        <w:t>Output: 10 20</w:t>
+      </w:r>
+    </w:p>
+    <w:p>
+      <w:r>
+        <w:rPr>
+          <w:rFonts w:ascii="Segoe UI Emoji" w:hAnsi="Segoe UI Emoji" w:cs="Segoe UI Emoji"/>
+        </w:rPr>
+        <w:t>⭐</w:t>
+      </w:r>
+      <w:r>
+        <w:t xml:space="preserve"> Very important for placement coding.</w:t>
+      </w:r>
+    </w:p>
+    <w:p>
+      <w:r>
+        <w:pict w14:anchorId="39AAAA3C">
+          <v:rect id="_x0000_i1201" style="width:0;height:1.5pt" o:hralign="center" o:hrstd="t" o:hr="t" fillcolor="#a0a0a0" stroked="f"/>
+        </w:pict>
+      </w:r>
+    </w:p>
+    <w:p>
+      <w:r>
+        <w:rPr>
+          <w:b/>
+          <w:bCs/>
+        </w:rPr>
+        <w:t>Q13. Find frequency of each element</w:t>
+      </w:r>
+    </w:p>
+    <w:p>
+      <w:r>
+        <w:t>Input: [10, 20, 10, 30, 20, 10]</w:t>
+      </w:r>
+    </w:p>
+    <w:p/>
+    <w:p>
+      <w:r>
+        <w:t>Output:</w:t>
+      </w:r>
+    </w:p>
+    <w:p>
+      <w:r>
+        <w:t>10 → 3</w:t>
+      </w:r>
+    </w:p>
+    <w:p>
+      <w:r>
+        <w:t>20 → 2</w:t>
+      </w:r>
+    </w:p>
+    <w:p>
+      <w:r>
+        <w:t>30 → 1</w:t>
+      </w:r>
+    </w:p>
+    <w:p>
+      <w:r>
+        <w:t xml:space="preserve">This also prepares you for </w:t>
+      </w:r>
+      <w:r>
+        <w:rPr>
+          <w:b/>
+          <w:bCs/>
+        </w:rPr>
+        <w:t>HashMap</w:t>
+      </w:r>
+      <w:r>
+        <w:t>, which you'll use heavily later.</w:t>
+      </w:r>
+    </w:p>
+    <w:p>
+      <w:r>
+        <w:lastRenderedPageBreak/>
+        <w:pict w14:anchorId="635193B7">
+          <v:rect id="_x0000_i1202" style="width:0;height:1.5pt" o:hralign="center" o:hrstd="t" o:hr="t" fillcolor="#a0a0a0" stroked="f"/>
+        </w:pict>
+      </w:r>
+    </w:p>
+    <w:p>
+      <w:r>
+        <w:rPr>
+          <w:b/>
+          <w:bCs/>
+          <w:highlight w:val="green"/>
+        </w:rPr>
+        <w:t>Q14. Find the second largest element</w:t>
+      </w:r>
+    </w:p>
+    <w:p>
+      <w:r>
+        <w:t>Input</w:t>
+      </w:r>
+      <w:proofErr w:type="gramStart"/>
+      <w:r>
+        <w:t>:  [</w:t>
+      </w:r>
+      <w:proofErr w:type="gramEnd"/>
+      <w:r>
+        <w:t>10, 50, 30, 80, 40]</w:t>
+      </w:r>
+    </w:p>
+    <w:p/>
+    <w:p>
+      <w:r>
+        <w:t>Output: 50</w:t>
+      </w:r>
+    </w:p>
+    <w:p>
+      <w:r>
+        <w:t>Try without sorting first.</w:t>
+      </w:r>
+    </w:p>
+    <w:p>
+      <w:r>
+        <w:pict w14:anchorId="4B9CBE1A">
+          <v:rect id="_x0000_i1203" style="width:0;height:1.5pt" o:hralign="center" o:hrstd="t" o:hr="t" fillcolor="#a0a0a0" stroked="f"/>
+        </w:pict>
+      </w:r>
+    </w:p>
+    <w:p>
+      <w:r>
+        <w:rPr>
+          <w:b/>
+          <w:bCs/>
+          <w:highlight w:val="green"/>
+        </w:rPr>
+        <w:t>Q15. Find the second smallest element</w:t>
+      </w:r>
+    </w:p>
+    <w:p>
+      <w:r>
+        <w:t>Input</w:t>
+      </w:r>
+      <w:proofErr w:type="gramStart"/>
+      <w:r>
+        <w:t>:  [</w:t>
+      </w:r>
+      <w:proofErr w:type="gramEnd"/>
+      <w:r>
+        <w:t>10, 50, 30, 80, 40]</w:t>
+      </w:r>
+    </w:p>
+    <w:p/>
+    <w:p>
+      <w:r>
+        <w:t>Output: 30</w:t>
+      </w:r>
+    </w:p>
+    <w:p>
+      <w:r>
+        <w:pict w14:anchorId="5735D77E">
+          <v:rect id="_x0000_i1204" style="width:0;height:1.5pt" o:hralign="center" o:hrstd="t" o:hr="t" fillcolor="#a0a0a0" stroked="f"/>
+        </w:pict>
+      </w:r>
     </w:p>
     <w:p>
       <w:pPr>
@@ -2318,42 +4242,245 @@
       </w:pPr>
       <w:r>
         <w:rPr>
-          <w:b/>
-          <w:bCs/>
-        </w:rPr>
-        <w:t>Remove using index</w:t>
-      </w:r>
-    </w:p>
-    <w:p>
-      <w:proofErr w:type="spellStart"/>
-      <w:r>
-        <w:t>list.remove</w:t>
-      </w:r>
-      <w:proofErr w:type="spellEnd"/>
-      <w:r>
-        <w:t>(1);</w:t>
-      </w:r>
-    </w:p>
-    <w:p>
-      <w:r>
-        <w:t>Removes the element at index 1.</w:t>
-      </w:r>
-    </w:p>
-    <w:p>
-      <w:r>
-        <w:rPr>
-          <w:b/>
-          <w:bCs/>
-        </w:rPr>
-        <w:t>Time:</w:t>
-      </w:r>
-      <w:r>
-        <w:t xml:space="preserve"> O(n)</w:t>
-      </w:r>
-    </w:p>
-    <w:p>
-      <w:r>
-        <w:t>because elements after that index may shift left.</w:t>
+          <w:rFonts w:ascii="Segoe UI Emoji" w:hAnsi="Segoe UI Emoji" w:cs="Segoe UI Emoji"/>
+          <w:b/>
+          <w:bCs/>
+        </w:rPr>
+        <w:t>🟠</w:t>
+      </w:r>
+      <w:r>
+        <w:rPr>
+          <w:b/>
+          <w:bCs/>
+        </w:rPr>
+        <w:t xml:space="preserve"> Level 3 — Coding Round Style</w:t>
+      </w:r>
+    </w:p>
+    <w:p>
+      <w:r>
+        <w:rPr>
+          <w:b/>
+          <w:bCs/>
+        </w:rPr>
+        <w:t xml:space="preserve">Q16. Sort an </w:t>
+      </w:r>
+      <w:proofErr w:type="spellStart"/>
+      <w:r>
+        <w:rPr>
+          <w:b/>
+          <w:bCs/>
+        </w:rPr>
+        <w:t>ArrayList</w:t>
+      </w:r>
+      <w:proofErr w:type="spellEnd"/>
+      <w:r>
+        <w:rPr>
+          <w:b/>
+          <w:bCs/>
+        </w:rPr>
+        <w:t xml:space="preserve"> in ascending order</w:t>
+      </w:r>
+    </w:p>
+    <w:p>
+      <w:r>
+        <w:t>Input</w:t>
+      </w:r>
+      <w:proofErr w:type="gramStart"/>
+      <w:r>
+        <w:t>:  [</w:t>
+      </w:r>
+      <w:proofErr w:type="gramEnd"/>
+      <w:r>
+        <w:t>40, 10, 30, 20]</w:t>
+      </w:r>
+    </w:p>
+    <w:p>
+      <w:r>
+        <w:t>Output: [10, 20, 30, 40]</w:t>
+      </w:r>
+    </w:p>
+    <w:p>
+      <w:r>
+        <w:t>First try:</w:t>
+      </w:r>
+    </w:p>
+    <w:p>
+      <w:proofErr w:type="spellStart"/>
+      <w:r>
+        <w:t>Collections.sort</w:t>
+      </w:r>
+      <w:proofErr w:type="spellEnd"/>
+      <w:r>
+        <w:t>(list);</w:t>
+      </w:r>
+    </w:p>
+    <w:p>
+      <w:r>
+        <w:t>Then implement sorting manually.</w:t>
+      </w:r>
+    </w:p>
+    <w:p>
+      <w:r>
+        <w:pict w14:anchorId="4798D3C4">
+          <v:rect id="_x0000_i1205" style="width:0;height:1.5pt" o:hralign="center" o:hrstd="t" o:hr="t" fillcolor="#a0a0a0" stroked="f"/>
+        </w:pict>
+      </w:r>
+    </w:p>
+    <w:p>
+      <w:r>
+        <w:rPr>
+          <w:b/>
+          <w:bCs/>
+        </w:rPr>
+        <w:t>Q17. Sort in descending order</w:t>
+      </w:r>
+    </w:p>
+    <w:p>
+      <w:r>
+        <w:t>Input</w:t>
+      </w:r>
+      <w:proofErr w:type="gramStart"/>
+      <w:r>
+        <w:t>:  [</w:t>
+      </w:r>
+      <w:proofErr w:type="gramEnd"/>
+      <w:r>
+        <w:t>40, 10, 30, 20]</w:t>
+      </w:r>
+    </w:p>
+    <w:p>
+      <w:r>
+        <w:t>Output: [40, 30, 20, 10]</w:t>
+      </w:r>
+    </w:p>
+    <w:p>
+      <w:r>
+        <w:pict w14:anchorId="4D00DB9F">
+          <v:rect id="_x0000_i1206" style="width:0;height:1.5pt" o:hralign="center" o:hrstd="t" o:hr="t" fillcolor="#a0a0a0" stroked="f"/>
+        </w:pict>
+      </w:r>
+    </w:p>
+    <w:p>
+      <w:r>
+        <w:rPr>
+          <w:b/>
+          <w:bCs/>
+        </w:rPr>
+        <w:t xml:space="preserve">Q18. Find common elements between two </w:t>
+      </w:r>
+      <w:proofErr w:type="spellStart"/>
+      <w:r>
+        <w:rPr>
+          <w:b/>
+          <w:bCs/>
+        </w:rPr>
+        <w:t>ArrayLists</w:t>
+      </w:r>
+      <w:proofErr w:type="spellEnd"/>
+    </w:p>
+    <w:p>
+      <w:r>
+        <w:t>A = [10, 20, 30, 40]</w:t>
+      </w:r>
+    </w:p>
+    <w:p>
+      <w:r>
+        <w:t>B = [20, 40, 50, 60]</w:t>
+      </w:r>
+    </w:p>
+    <w:p/>
+    <w:p>
+      <w:r>
+        <w:t>Output: [20, 40]</w:t>
+      </w:r>
+    </w:p>
+    <w:p>
+      <w:r>
+        <w:pict w14:anchorId="34F63F4D">
+          <v:rect id="_x0000_i1207" style="width:0;height:1.5pt" o:hralign="center" o:hrstd="t" o:hr="t" fillcolor="#a0a0a0" stroked="f"/>
+        </w:pict>
+      </w:r>
+    </w:p>
+    <w:p>
+      <w:r>
+        <w:rPr>
+          <w:b/>
+          <w:bCs/>
+        </w:rPr>
+        <w:t xml:space="preserve">Q19. Merge two </w:t>
+      </w:r>
+      <w:proofErr w:type="spellStart"/>
+      <w:r>
+        <w:rPr>
+          <w:b/>
+          <w:bCs/>
+        </w:rPr>
+        <w:t>ArrayLists</w:t>
+      </w:r>
+      <w:proofErr w:type="spellEnd"/>
+    </w:p>
+    <w:p>
+      <w:r>
+        <w:t>A = [10, 20, 30]</w:t>
+      </w:r>
+    </w:p>
+    <w:p>
+      <w:r>
+        <w:t>B = [40, 50, 60]</w:t>
+      </w:r>
+    </w:p>
+    <w:p/>
+    <w:p>
+      <w:r>
+        <w:lastRenderedPageBreak/>
+        <w:t>Output: [10, 20, 30, 40, 50, 60]</w:t>
+      </w:r>
+    </w:p>
+    <w:p>
+      <w:r>
+        <w:pict w14:anchorId="65E72CF6">
+          <v:rect id="_x0000_i1208" style="width:0;height:1.5pt" o:hralign="center" o:hrstd="t" o:hr="t" fillcolor="#a0a0a0" stroked="f"/>
+        </w:pict>
+      </w:r>
+    </w:p>
+    <w:p>
+      <w:r>
+        <w:rPr>
+          <w:b/>
+          <w:bCs/>
+        </w:rPr>
+        <w:t>Q20. Remove duplicate elements</w:t>
+      </w:r>
+    </w:p>
+    <w:p>
+      <w:r>
+        <w:t>Input</w:t>
+      </w:r>
+      <w:proofErr w:type="gramStart"/>
+      <w:r>
+        <w:t>:  [</w:t>
+      </w:r>
+      <w:proofErr w:type="gramEnd"/>
+      <w:r>
+        <w:t>10, 20, 10, 30, 20, 40]</w:t>
+      </w:r>
+    </w:p>
+    <w:p/>
+    <w:p>
+      <w:r>
+        <w:t>Output: [10, 20, 30, 40]</w:t>
+      </w:r>
+    </w:p>
+    <w:p>
+      <w:r>
+        <w:t>Try first without HashSet.</w:t>
+      </w:r>
+    </w:p>
+    <w:p>
+      <w:r>
+        <w:pict w14:anchorId="70B4B7D9">
+          <v:rect id="_x0000_i1209" style="width:0;height:1.5pt" o:hralign="center" o:hrstd="t" o:hr="t" fillcolor="#a0a0a0" stroked="f"/>
+        </w:pict>
       </w:r>
     </w:p>
     <w:p>
@@ -2365,901 +4492,191 @@
       </w:pPr>
       <w:r>
         <w:rPr>
-          <w:b/>
-          <w:bCs/>
-        </w:rPr>
-        <w:t xml:space="preserve">Remove an Integer value </w:t>
-      </w:r>
-      <w:r>
-        <w:rPr>
           <w:rFonts w:ascii="Segoe UI Emoji" w:hAnsi="Segoe UI Emoji" w:cs="Segoe UI Emoji"/>
           <w:b/>
           <w:bCs/>
         </w:rPr>
-        <w:t>⚠️</w:t>
-      </w:r>
-    </w:p>
-    <w:p>
-      <w:r>
-        <w:t>This is important:</w:t>
-      </w:r>
-    </w:p>
-    <w:p>
-      <w:proofErr w:type="spellStart"/>
-      <w:r>
-        <w:t>list.remove</w:t>
-      </w:r>
-      <w:proofErr w:type="spellEnd"/>
-      <w:r>
-        <w:t>(</w:t>
-      </w:r>
-      <w:proofErr w:type="spellStart"/>
-      <w:r>
-        <w:t>Integer.valueOf</w:t>
-      </w:r>
-      <w:proofErr w:type="spellEnd"/>
-      <w:r>
-        <w:t>(20));</w:t>
-      </w:r>
-    </w:p>
-    <w:p>
-      <w:r>
-        <w:t xml:space="preserve">This removes the </w:t>
-      </w:r>
-      <w:r>
-        <w:rPr>
-          <w:b/>
-          <w:bCs/>
-        </w:rPr>
-        <w:t>value 20</w:t>
-      </w:r>
-      <w:r>
-        <w:t>.</w:t>
-      </w:r>
-    </w:p>
-    <w:p>
-      <w:r>
-        <w:t xml:space="preserve">Why </w:t>
-      </w:r>
-      <w:proofErr w:type="spellStart"/>
-      <w:r>
-        <w:t>Integer.valueOf</w:t>
-      </w:r>
-      <w:proofErr w:type="spellEnd"/>
-      <w:r>
-        <w:t>()?</w:t>
-      </w:r>
-    </w:p>
-    <w:p>
-      <w:r>
-        <w:t>Because:</w:t>
-      </w:r>
-    </w:p>
-    <w:p>
-      <w:proofErr w:type="spellStart"/>
-      <w:r>
-        <w:t>list.remove</w:t>
-      </w:r>
-      <w:proofErr w:type="spellEnd"/>
-      <w:r>
-        <w:t>(20);</w:t>
-      </w:r>
-    </w:p>
-    <w:p>
-      <w:r>
-        <w:t>is interpreted as:</w:t>
-      </w:r>
-    </w:p>
-    <w:p>
-      <w:r>
-        <w:t>remove element at index 20</w:t>
-      </w:r>
-    </w:p>
-    <w:p>
-      <w:r>
-        <w:t>not remove the value 20.</w:t>
-      </w:r>
-    </w:p>
-    <w:p>
-      <w:r>
-        <w:pict w14:anchorId="5279F260">
-          <v:rect id="_x0000_i1100" style="width:0;height:1.5pt" o:hralign="center" o:hrstd="t" o:hr="t" fillcolor="#a0a0a0" stroked="f"/>
+        <w:t>🔴</w:t>
+      </w:r>
+      <w:r>
+        <w:rPr>
+          <w:b/>
+          <w:bCs/>
+        </w:rPr>
+        <w:t xml:space="preserve"> Level 4 — Good for HCL/TCS-style Practice</w:t>
+      </w:r>
+    </w:p>
+    <w:p>
+      <w:r>
+        <w:rPr>
+          <w:b/>
+          <w:bCs/>
+        </w:rPr>
+        <w:t>Q21. Find the first non-repeating element</w:t>
+      </w:r>
+    </w:p>
+    <w:p>
+      <w:r>
+        <w:t>Input: [10, 20, 10, 30, 20, 40]</w:t>
+      </w:r>
+    </w:p>
+    <w:p/>
+    <w:p>
+      <w:r>
+        <w:t>Output: 30</w:t>
+      </w:r>
+    </w:p>
+    <w:p>
+      <w:r>
+        <w:pict w14:anchorId="5FFE01E8">
+          <v:rect id="_x0000_i1210" style="width:0;height:1.5pt" o:hralign="center" o:hrstd="t" o:hr="t" fillcolor="#a0a0a0" stroked="f"/>
         </w:pict>
       </w:r>
     </w:p>
     <w:p>
-      <w:pPr>
-        <w:rPr>
-          <w:b/>
-          <w:bCs/>
-        </w:rPr>
-      </w:pPr>
-      <w:r>
-        <w:rPr>
-          <w:b/>
-          <w:bCs/>
-        </w:rPr>
-        <w:t xml:space="preserve">5. Contains Element </w:t>
-      </w:r>
+      <w:r>
+        <w:rPr>
+          <w:b/>
+          <w:bCs/>
+        </w:rPr>
+        <w:t>Q22. Find the first repeating element</w:t>
+      </w:r>
+    </w:p>
+    <w:p>
+      <w:r>
+        <w:t>Input: [10, 20, 30, 20, 40]</w:t>
+      </w:r>
+    </w:p>
+    <w:p/>
+    <w:p>
+      <w:r>
+        <w:t>Output: 20</w:t>
+      </w:r>
+    </w:p>
+    <w:p>
+      <w:r>
+        <w:pict w14:anchorId="2E9C07B6">
+          <v:rect id="_x0000_i1211" style="width:0;height:1.5pt" o:hralign="center" o:hrstd="t" o:hr="t" fillcolor="#a0a0a0" stroked="f"/>
+        </w:pict>
+      </w:r>
+    </w:p>
+    <w:p>
+      <w:r>
+        <w:rPr>
+          <w:b/>
+          <w:bCs/>
+        </w:rPr>
+        <w:t>Q23. Move all zeros to the end</w:t>
+      </w:r>
+    </w:p>
+    <w:p>
+      <w:r>
+        <w:t>Input</w:t>
+      </w:r>
+      <w:proofErr w:type="gramStart"/>
+      <w:r>
+        <w:t>:  [</w:t>
+      </w:r>
+      <w:proofErr w:type="gramEnd"/>
+      <w:r>
+        <w:t>0, 10, 0, 20, 30, 0]</w:t>
+      </w:r>
+    </w:p>
+    <w:p>
+      <w:r>
+        <w:t>Output: [10, 20, 30, 0, 0, 0]</w:t>
+      </w:r>
+    </w:p>
+    <w:p>
       <w:r>
         <w:rPr>
           <w:rFonts w:ascii="Segoe UI Emoji" w:hAnsi="Segoe UI Emoji" w:cs="Segoe UI Emoji"/>
-          <w:b/>
-          <w:bCs/>
         </w:rPr>
         <w:t>⭐</w:t>
       </w:r>
-    </w:p>
+      <w:r>
+        <w:t xml:space="preserve"> Very useful array/</w:t>
+      </w:r>
+      <w:proofErr w:type="spellStart"/>
+      <w:r>
+        <w:t>ArrayList</w:t>
+      </w:r>
+      <w:proofErr w:type="spellEnd"/>
+      <w:r>
+        <w:t xml:space="preserve"> pattern.</w:t>
+      </w:r>
+    </w:p>
+    <w:p>
+      <w:r>
+        <w:pict w14:anchorId="32E09035">
+          <v:rect id="_x0000_i1212" style="width:0;height:1.5pt" o:hralign="center" o:hrstd="t" o:hr="t" fillcolor="#a0a0a0" stroked="f"/>
+        </w:pict>
+      </w:r>
+    </w:p>
+    <w:p>
+      <w:r>
+        <w:rPr>
+          <w:b/>
+          <w:bCs/>
+        </w:rPr>
+        <w:t>Q24. Separate even and odd elements</w:t>
+      </w:r>
+    </w:p>
+    <w:p>
+      <w:r>
+        <w:t>Input: [10, 15, 20, 25, 30]</w:t>
+      </w:r>
+    </w:p>
+    <w:p/>
+    <w:p>
+      <w:r>
+        <w:t>Output:</w:t>
+      </w:r>
+    </w:p>
+    <w:p>
+      <w:r>
+        <w:t>Even: [10, 20, 30]</w:t>
+      </w:r>
+    </w:p>
+    <w:p>
+      <w:r>
+        <w:t>Odd</w:t>
+      </w:r>
+      <w:proofErr w:type="gramStart"/>
+      <w:r>
+        <w:t>:  [</w:t>
+      </w:r>
+      <w:proofErr w:type="gramEnd"/>
+      <w:r>
+        <w:t>15, 25]</w:t>
+      </w:r>
+    </w:p>
+    <w:p>
+      <w:r>
+        <w:pict w14:anchorId="6C0918D8">
+          <v:rect id="_x0000_i1213" style="width:0;height:1.5pt" o:hralign="center" o:hrstd="t" o:hr="t" fillcolor="#a0a0a0" stroked="f"/>
+        </w:pict>
+      </w:r>
+    </w:p>
+    <w:p>
+      <w:r>
+        <w:rPr>
+          <w:b/>
+          <w:bCs/>
+        </w:rPr>
+        <w:t>Q25. Find the missing number</w:t>
+      </w:r>
+    </w:p>
+    <w:p>
+      <w:r>
+        <w:t>Input: [1, 2, 3, 5, 6]</w:t>
+      </w:r>
+    </w:p>
+    <w:p/>
     <w:p>
       <w:r>
         <w:lastRenderedPageBreak/>
-        <w:t>Check whether an element exists:</w:t>
-      </w:r>
-    </w:p>
-    <w:p>
-      <w:r>
-        <w:t>if (</w:t>
-      </w:r>
-      <w:proofErr w:type="spellStart"/>
-      <w:r>
-        <w:t>list.contains</w:t>
-      </w:r>
-      <w:proofErr w:type="spellEnd"/>
-      <w:r>
-        <w:t>(30)) {</w:t>
-      </w:r>
-    </w:p>
-    <w:p>
-      <w:r>
-        <w:t xml:space="preserve">    </w:t>
-      </w:r>
-      <w:proofErr w:type="spellStart"/>
-      <w:r>
-        <w:t>System.out.println</w:t>
-      </w:r>
-      <w:proofErr w:type="spellEnd"/>
-      <w:r>
-        <w:t>("Found");</w:t>
-      </w:r>
-    </w:p>
-    <w:p>
-      <w:r>
-        <w:t>}</w:t>
-      </w:r>
-    </w:p>
-    <w:p>
-      <w:r>
-        <w:t>Returns:</w:t>
-      </w:r>
-    </w:p>
-    <w:p>
-      <w:r>
-        <w:t>true</w:t>
-      </w:r>
-    </w:p>
-    <w:p>
-      <w:r>
-        <w:t>or</w:t>
-      </w:r>
-    </w:p>
-    <w:p>
-      <w:r>
-        <w:t>false</w:t>
-      </w:r>
-    </w:p>
-    <w:p>
-      <w:r>
-        <w:rPr>
-          <w:b/>
-          <w:bCs/>
-        </w:rPr>
-        <w:t>Time:</w:t>
-      </w:r>
-      <w:r>
-        <w:t xml:space="preserve"> O(n)</w:t>
-      </w:r>
-    </w:p>
-    <w:p>
-      <w:r>
-        <w:t xml:space="preserve">Because </w:t>
-      </w:r>
-      <w:proofErr w:type="spellStart"/>
-      <w:r>
-        <w:t>ArrayList</w:t>
-      </w:r>
-      <w:proofErr w:type="spellEnd"/>
-      <w:r>
-        <w:t xml:space="preserve"> may have to search the entire list.</w:t>
-      </w:r>
-    </w:p>
-    <w:p>
-      <w:r>
-        <w:pict w14:anchorId="2B543600">
-          <v:rect id="_x0000_i1101" style="width:0;height:1.5pt" o:hralign="center" o:hrstd="t" o:hr="t" fillcolor="#a0a0a0" stroked="f"/>
-        </w:pict>
-      </w:r>
-    </w:p>
-    <w:p>
-      <w:pPr>
-        <w:rPr>
-          <w:b/>
-          <w:bCs/>
-        </w:rPr>
-      </w:pPr>
-      <w:r>
-        <w:rPr>
-          <w:b/>
-          <w:bCs/>
-        </w:rPr>
-        <w:t xml:space="preserve">6. Size of </w:t>
-      </w:r>
-      <w:proofErr w:type="spellStart"/>
-      <w:r>
-        <w:rPr>
-          <w:b/>
-          <w:bCs/>
-        </w:rPr>
-        <w:t>ArrayList</w:t>
-      </w:r>
-      <w:proofErr w:type="spellEnd"/>
-    </w:p>
-    <w:p>
-      <w:r>
-        <w:t>Use:</w:t>
-      </w:r>
-    </w:p>
-    <w:p>
-      <w:proofErr w:type="spellStart"/>
-      <w:r>
-        <w:t>list.size</w:t>
-      </w:r>
-      <w:proofErr w:type="spellEnd"/>
-      <w:r>
-        <w:t>();</w:t>
-      </w:r>
-    </w:p>
-    <w:p>
-      <w:r>
-        <w:t>Example:</w:t>
-      </w:r>
-    </w:p>
-    <w:p>
-      <w:proofErr w:type="spellStart"/>
-      <w:r>
-        <w:t>System.out.println</w:t>
-      </w:r>
-      <w:proofErr w:type="spellEnd"/>
-      <w:r>
-        <w:t>(</w:t>
-      </w:r>
-      <w:proofErr w:type="spellStart"/>
-      <w:r>
-        <w:t>list.size</w:t>
-      </w:r>
-      <w:proofErr w:type="spellEnd"/>
-      <w:r>
-        <w:t>());</w:t>
-      </w:r>
-    </w:p>
-    <w:p>
-      <w:r>
-        <w:t>If:</w:t>
-      </w:r>
-    </w:p>
-    <w:p>
-      <w:r>
-        <w:t>[10, 20, 30]</w:t>
-      </w:r>
-    </w:p>
-    <w:p>
-      <w:r>
-        <w:t>Output:</w:t>
-      </w:r>
-    </w:p>
-    <w:p>
-      <w:r>
-        <w:t>3</w:t>
-      </w:r>
-    </w:p>
-    <w:p>
-      <w:r>
-        <w:rPr>
-          <w:b/>
-          <w:bCs/>
-        </w:rPr>
-        <w:t>Time:</w:t>
-      </w:r>
-      <w:r>
-        <w:t xml:space="preserve"> O(1)</w:t>
-      </w:r>
-    </w:p>
-    <w:p>
-      <w:r>
-        <w:rPr>
-          <w:rFonts w:ascii="Segoe UI Emoji" w:hAnsi="Segoe UI Emoji" w:cs="Segoe UI Emoji"/>
-        </w:rPr>
-        <w:t>⚠️</w:t>
-      </w:r>
-      <w:r>
-        <w:t xml:space="preserve"> Array:</w:t>
-      </w:r>
-    </w:p>
-    <w:p>
-      <w:proofErr w:type="spellStart"/>
-      <w:r>
-        <w:t>arr.length</w:t>
-      </w:r>
-      <w:proofErr w:type="spellEnd"/>
-    </w:p>
-    <w:p>
-      <w:proofErr w:type="spellStart"/>
-      <w:r>
-        <w:t>ArrayList</w:t>
-      </w:r>
-      <w:proofErr w:type="spellEnd"/>
-      <w:r>
-        <w:t>:</w:t>
-      </w:r>
-    </w:p>
-    <w:p>
-      <w:proofErr w:type="spellStart"/>
-      <w:r>
-        <w:t>list.size</w:t>
-      </w:r>
-      <w:proofErr w:type="spellEnd"/>
-      <w:r>
-        <w:t>()</w:t>
-      </w:r>
-    </w:p>
-    <w:p>
-      <w:r>
-        <w:pict w14:anchorId="58A871C5">
-          <v:rect id="_x0000_i1102" style="width:0;height:1.5pt" o:hralign="center" o:hrstd="t" o:hr="t" fillcolor="#a0a0a0" stroked="f"/>
-        </w:pict>
-      </w:r>
-    </w:p>
-    <w:p>
-      <w:pPr>
-        <w:rPr>
-          <w:b/>
-          <w:bCs/>
-        </w:rPr>
-      </w:pPr>
-      <w:r>
-        <w:rPr>
-          <w:b/>
-          <w:bCs/>
-        </w:rPr>
-        <w:t>7. Check if Empty</w:t>
-      </w:r>
-    </w:p>
-    <w:p>
-      <w:proofErr w:type="spellStart"/>
-      <w:r>
-        <w:t>list.isEmpty</w:t>
-      </w:r>
-      <w:proofErr w:type="spellEnd"/>
-      <w:r>
-        <w:t>();</w:t>
-      </w:r>
-    </w:p>
-    <w:p>
-      <w:r>
-        <w:t>Example:</w:t>
-      </w:r>
-    </w:p>
-    <w:p>
-      <w:r>
-        <w:t>if (</w:t>
-      </w:r>
-      <w:proofErr w:type="spellStart"/>
-      <w:r>
-        <w:t>list.isEmpty</w:t>
-      </w:r>
-      <w:proofErr w:type="spellEnd"/>
-      <w:r>
-        <w:t>()) {</w:t>
-      </w:r>
-    </w:p>
-    <w:p>
-      <w:r>
-        <w:t xml:space="preserve">    </w:t>
-      </w:r>
-      <w:proofErr w:type="spellStart"/>
-      <w:r>
-        <w:t>System.out.println</w:t>
-      </w:r>
-      <w:proofErr w:type="spellEnd"/>
-      <w:r>
-        <w:t>("List is empty");</w:t>
-      </w:r>
-    </w:p>
-    <w:p>
-      <w:r>
-        <w:t>}</w:t>
-      </w:r>
-    </w:p>
-    <w:p>
-      <w:r>
-        <w:t>Returns true or false.</w:t>
-      </w:r>
-    </w:p>
-    <w:p>
-      <w:r>
-        <w:pict w14:anchorId="51216F41">
-          <v:rect id="_x0000_i1103" style="width:0;height:1.5pt" o:hralign="center" o:hrstd="t" o:hr="t" fillcolor="#a0a0a0" stroked="f"/>
-        </w:pict>
-      </w:r>
-    </w:p>
-    <w:p>
-      <w:pPr>
-        <w:rPr>
-          <w:b/>
-          <w:bCs/>
-        </w:rPr>
-      </w:pPr>
-      <w:r>
-        <w:rPr>
-          <w:b/>
-          <w:bCs/>
-        </w:rPr>
-        <w:lastRenderedPageBreak/>
-        <w:t xml:space="preserve">8. Sort </w:t>
-      </w:r>
-      <w:proofErr w:type="spellStart"/>
-      <w:r>
-        <w:rPr>
-          <w:b/>
-          <w:bCs/>
-        </w:rPr>
-        <w:t>ArrayList</w:t>
-      </w:r>
-      <w:proofErr w:type="spellEnd"/>
-      <w:r>
-        <w:rPr>
-          <w:b/>
-          <w:bCs/>
-        </w:rPr>
-        <w:t xml:space="preserve"> </w:t>
-      </w:r>
-      <w:r>
-        <w:rPr>
-          <w:rFonts w:ascii="Segoe UI Emoji" w:hAnsi="Segoe UI Emoji" w:cs="Segoe UI Emoji"/>
-          <w:b/>
-          <w:bCs/>
-        </w:rPr>
-        <w:t>⭐⭐⭐</w:t>
-      </w:r>
-    </w:p>
-    <w:p>
-      <w:r>
-        <w:t>Use:</w:t>
-      </w:r>
-    </w:p>
-    <w:p>
-      <w:proofErr w:type="spellStart"/>
-      <w:r>
-        <w:t>Collections.sort</w:t>
-      </w:r>
-      <w:proofErr w:type="spellEnd"/>
-      <w:r>
-        <w:t>(list);</w:t>
-      </w:r>
-    </w:p>
-    <w:p>
-      <w:r>
-        <w:t>Example:</w:t>
-      </w:r>
-    </w:p>
-    <w:p>
-      <w:proofErr w:type="spellStart"/>
-      <w:r>
-        <w:t>ArrayList</w:t>
-      </w:r>
-      <w:proofErr w:type="spellEnd"/>
-      <w:r>
-        <w:t xml:space="preserve">&lt;Integer&gt; list = new </w:t>
-      </w:r>
-      <w:proofErr w:type="spellStart"/>
-      <w:r>
-        <w:t>ArrayList</w:t>
-      </w:r>
-      <w:proofErr w:type="spellEnd"/>
-      <w:r>
-        <w:t>&lt;&gt;();</w:t>
-      </w:r>
-    </w:p>
-    <w:p/>
-    <w:p>
-      <w:proofErr w:type="spellStart"/>
-      <w:r>
-        <w:t>list.add</w:t>
-      </w:r>
-      <w:proofErr w:type="spellEnd"/>
-      <w:r>
-        <w:t>(50);</w:t>
-      </w:r>
-    </w:p>
-    <w:p>
-      <w:proofErr w:type="spellStart"/>
-      <w:r>
-        <w:t>list.add</w:t>
-      </w:r>
-      <w:proofErr w:type="spellEnd"/>
-      <w:r>
-        <w:t>(10);</w:t>
-      </w:r>
-    </w:p>
-    <w:p>
-      <w:proofErr w:type="spellStart"/>
-      <w:r>
-        <w:t>list.add</w:t>
-      </w:r>
-      <w:proofErr w:type="spellEnd"/>
-      <w:r>
-        <w:t>(40);</w:t>
-      </w:r>
-    </w:p>
-    <w:p>
-      <w:proofErr w:type="spellStart"/>
-      <w:r>
-        <w:t>list.add</w:t>
-      </w:r>
-      <w:proofErr w:type="spellEnd"/>
-      <w:r>
-        <w:t>(20);</w:t>
-      </w:r>
-    </w:p>
-    <w:p/>
-    <w:p>
-      <w:proofErr w:type="spellStart"/>
-      <w:r>
-        <w:t>Collections.sort</w:t>
-      </w:r>
-      <w:proofErr w:type="spellEnd"/>
-      <w:r>
-        <w:t>(list);</w:t>
-      </w:r>
-    </w:p>
-    <w:p/>
-    <w:p>
-      <w:proofErr w:type="spellStart"/>
-      <w:r>
-        <w:t>System.out.println</w:t>
-      </w:r>
-      <w:proofErr w:type="spellEnd"/>
-      <w:r>
-        <w:t>(list);</w:t>
-      </w:r>
-    </w:p>
-    <w:p>
-      <w:r>
-        <w:t>Output:</w:t>
-      </w:r>
-    </w:p>
-    <w:p>
-      <w:r>
-        <w:t>[10, 20, 40, 50]</w:t>
-      </w:r>
-    </w:p>
-    <w:p>
-      <w:r>
-        <w:rPr>
-          <w:b/>
-          <w:bCs/>
-        </w:rPr>
-        <w:t>Time:</w:t>
-      </w:r>
-      <w:r>
-        <w:t xml:space="preserve"> O(n log n)</w:t>
-      </w:r>
-    </w:p>
-    <w:p>
-      <w:pPr>
-        <w:rPr>
-          <w:b/>
-          <w:bCs/>
-        </w:rPr>
-      </w:pPr>
-      <w:r>
-        <w:rPr>
-          <w:b/>
-          <w:bCs/>
-        </w:rPr>
-        <w:t>Descending order</w:t>
-      </w:r>
-    </w:p>
-    <w:p>
-      <w:proofErr w:type="spellStart"/>
-      <w:r>
-        <w:t>Collections.sort</w:t>
-      </w:r>
-      <w:proofErr w:type="spellEnd"/>
-      <w:r>
-        <w:t xml:space="preserve">(list, </w:t>
-      </w:r>
-      <w:proofErr w:type="spellStart"/>
-      <w:r>
-        <w:t>Collections.reverseOrder</w:t>
-      </w:r>
-      <w:proofErr w:type="spellEnd"/>
-      <w:r>
-        <w:t>());</w:t>
-      </w:r>
-    </w:p>
-    <w:p>
-      <w:r>
-        <w:t>Output:</w:t>
-      </w:r>
-    </w:p>
-    <w:p>
-      <w:r>
-        <w:t>[50, 40, 20, 10]</w:t>
-      </w:r>
-    </w:p>
-    <w:p>
-      <w:r>
-        <w:pict w14:anchorId="0AB5DE8B">
-          <v:rect id="_x0000_i1104" style="width:0;height:1.5pt" o:hralign="center" o:hrstd="t" o:hr="t" fillcolor="#a0a0a0" stroked="f"/>
-        </w:pict>
-      </w:r>
-    </w:p>
-    <w:p>
-      <w:pPr>
-        <w:rPr>
-          <w:b/>
-          <w:bCs/>
-        </w:rPr>
-      </w:pPr>
-      <w:r>
-        <w:rPr>
-          <w:b/>
-          <w:bCs/>
-        </w:rPr>
-        <w:t xml:space="preserve">9. Clear Entire </w:t>
-      </w:r>
-      <w:proofErr w:type="spellStart"/>
-      <w:r>
-        <w:rPr>
-          <w:b/>
-          <w:bCs/>
-        </w:rPr>
-        <w:t>ArrayList</w:t>
-      </w:r>
-      <w:proofErr w:type="spellEnd"/>
-    </w:p>
-    <w:p>
-      <w:proofErr w:type="spellStart"/>
-      <w:r>
-        <w:t>list.clear</w:t>
-      </w:r>
-      <w:proofErr w:type="spellEnd"/>
-      <w:r>
-        <w:t>();</w:t>
-      </w:r>
-    </w:p>
-    <w:p>
-      <w:r>
-        <w:t>Example:</w:t>
-      </w:r>
-    </w:p>
-    <w:p>
-      <w:r>
-        <w:t>Before → [10, 20, 30]</w:t>
-      </w:r>
-    </w:p>
-    <w:p/>
-    <w:p>
-      <w:r>
-        <w:t>After → []</w:t>
-      </w:r>
-    </w:p>
-    <w:p>
-      <w:r>
-        <w:pict w14:anchorId="7E272A5F">
-          <v:rect id="_x0000_i1105" style="width:0;height:1.5pt" o:hralign="center" o:hrstd="t" o:hr="t" fillcolor="#a0a0a0" stroked="f"/>
-        </w:pict>
-      </w:r>
-    </w:p>
-    <w:p>
-      <w:pPr>
-        <w:rPr>
-          <w:b/>
-          <w:bCs/>
-        </w:rPr>
-      </w:pPr>
-      <w:r>
-        <w:rPr>
-          <w:b/>
-          <w:bCs/>
-        </w:rPr>
-        <w:t xml:space="preserve">10. Loop Through </w:t>
-      </w:r>
-      <w:proofErr w:type="spellStart"/>
-      <w:r>
-        <w:rPr>
-          <w:b/>
-          <w:bCs/>
-        </w:rPr>
-        <w:t>ArrayList</w:t>
-      </w:r>
-      <w:proofErr w:type="spellEnd"/>
-    </w:p>
-    <w:p>
-      <w:pPr>
-        <w:rPr>
-          <w:b/>
-          <w:bCs/>
-        </w:rPr>
-      </w:pPr>
-      <w:r>
-        <w:rPr>
-          <w:b/>
-          <w:bCs/>
-        </w:rPr>
-        <w:t>Normal for loop</w:t>
-      </w:r>
-    </w:p>
-    <w:p>
-      <w:r>
-        <w:t xml:space="preserve">for (int </w:t>
-      </w:r>
-      <w:proofErr w:type="spellStart"/>
-      <w:r>
-        <w:t>i</w:t>
-      </w:r>
-      <w:proofErr w:type="spellEnd"/>
-      <w:r>
-        <w:t xml:space="preserve"> = 0; </w:t>
-      </w:r>
-      <w:proofErr w:type="spellStart"/>
-      <w:r>
-        <w:t>i</w:t>
-      </w:r>
-      <w:proofErr w:type="spellEnd"/>
-      <w:r>
-        <w:t xml:space="preserve"> &lt; </w:t>
-      </w:r>
-      <w:proofErr w:type="spellStart"/>
-      <w:r>
-        <w:t>list.size</w:t>
-      </w:r>
-      <w:proofErr w:type="spellEnd"/>
-      <w:r>
-        <w:t xml:space="preserve">(); </w:t>
-      </w:r>
-      <w:proofErr w:type="spellStart"/>
-      <w:r>
-        <w:t>i</w:t>
-      </w:r>
-      <w:proofErr w:type="spellEnd"/>
-      <w:r>
-        <w:t>++) {</w:t>
-      </w:r>
-    </w:p>
-    <w:p>
-      <w:r>
-        <w:t xml:space="preserve">    </w:t>
-      </w:r>
-      <w:proofErr w:type="spellStart"/>
-      <w:r>
-        <w:t>System.out.println</w:t>
-      </w:r>
-      <w:proofErr w:type="spellEnd"/>
-      <w:r>
-        <w:t>(</w:t>
-      </w:r>
-      <w:proofErr w:type="spellStart"/>
-      <w:r>
-        <w:t>list.get</w:t>
-      </w:r>
-      <w:proofErr w:type="spellEnd"/>
-      <w:r>
-        <w:t>(</w:t>
-      </w:r>
-      <w:proofErr w:type="spellStart"/>
-      <w:r>
-        <w:t>i</w:t>
-      </w:r>
-      <w:proofErr w:type="spellEnd"/>
-      <w:r>
-        <w:t>));</w:t>
-      </w:r>
-    </w:p>
-    <w:p>
-      <w:r>
-        <w:t>}</w:t>
-      </w:r>
-    </w:p>
-    <w:p>
-      <w:pPr>
-        <w:rPr>
-          <w:b/>
-          <w:bCs/>
-        </w:rPr>
-      </w:pPr>
-      <w:r>
-        <w:rPr>
-          <w:b/>
-          <w:bCs/>
-        </w:rPr>
-        <w:lastRenderedPageBreak/>
-        <w:t xml:space="preserve">Enhanced for loop </w:t>
-      </w:r>
-      <w:r>
-        <w:rPr>
-          <w:rFonts w:ascii="Segoe UI Emoji" w:hAnsi="Segoe UI Emoji" w:cs="Segoe UI Emoji"/>
-          <w:b/>
-          <w:bCs/>
-        </w:rPr>
-        <w:t>⭐</w:t>
-      </w:r>
-    </w:p>
-    <w:p>
-      <w:r>
-        <w:t xml:space="preserve">for (int </w:t>
-      </w:r>
-      <w:proofErr w:type="spellStart"/>
-      <w:r>
-        <w:t>num</w:t>
-      </w:r>
-      <w:proofErr w:type="spellEnd"/>
-      <w:r>
-        <w:t xml:space="preserve"> : list) {</w:t>
-      </w:r>
-    </w:p>
-    <w:p>
-      <w:r>
-        <w:t xml:space="preserve">    </w:t>
-      </w:r>
-      <w:proofErr w:type="spellStart"/>
-      <w:r>
-        <w:t>System.out.println</w:t>
-      </w:r>
-      <w:proofErr w:type="spellEnd"/>
-      <w:r>
-        <w:t>(</w:t>
-      </w:r>
-      <w:proofErr w:type="spellStart"/>
-      <w:r>
-        <w:t>num</w:t>
-      </w:r>
-      <w:proofErr w:type="spellEnd"/>
-      <w:r>
-        <w:t>);</w:t>
-      </w:r>
-    </w:p>
-    <w:p>
-      <w:r>
-        <w:t>}</w:t>
-      </w:r>
-    </w:p>
-    <w:p>
-      <w:r>
-        <w:t>For DSA, you will frequently use this:</w:t>
-      </w:r>
-    </w:p>
-    <w:p>
-      <w:r>
-        <w:t xml:space="preserve">for (int </w:t>
-      </w:r>
-      <w:proofErr w:type="spellStart"/>
-      <w:r>
-        <w:t>num</w:t>
-      </w:r>
-      <w:proofErr w:type="spellEnd"/>
-      <w:r>
-        <w:t xml:space="preserve"> : list) {</w:t>
-      </w:r>
-    </w:p>
-    <w:p>
-      <w:r>
-        <w:t xml:space="preserve">    // logic</w:t>
-      </w:r>
-    </w:p>
-    <w:p>
-      <w:r>
-        <w:t>}</w:t>
+        <w:t>Output: 4</w:t>
       </w:r>
     </w:p>
     <w:p/>

</xml_diff>

<commit_message>
Solved some Arraylist Practice Problem
</commit_message>
<xml_diff>
--- a/ArrayLists/Notes/ArrayLists.docx
+++ b/ArrayLists/Notes/ArrayLists.docx
@@ -3415,1268 +3415,6 @@
     <w:p>
       <w:r>
         <w:t>}</w:t>
-      </w:r>
-    </w:p>
-    <w:p/>
-    <w:p>
-      <w:pPr>
-        <w:rPr>
-          <w:b/>
-          <w:bCs/>
-        </w:rPr>
-      </w:pPr>
-      <w:r>
-        <w:rPr>
-          <w:b/>
-          <w:bCs/>
-          <w:highlight w:val="yellow"/>
-        </w:rPr>
-        <w:t>// Practice Problems</w:t>
-      </w:r>
-    </w:p>
-    <w:p>
-      <w:pPr>
-        <w:rPr>
-          <w:b/>
-          <w:bCs/>
-        </w:rPr>
-      </w:pPr>
-      <w:r>
-        <w:rPr>
-          <w:rFonts w:ascii="Segoe UI Emoji" w:hAnsi="Segoe UI Emoji" w:cs="Segoe UI Emoji"/>
-          <w:b/>
-          <w:bCs/>
-        </w:rPr>
-        <w:t>🟢</w:t>
-      </w:r>
-      <w:r>
-        <w:rPr>
-          <w:b/>
-          <w:bCs/>
-        </w:rPr>
-        <w:t xml:space="preserve"> Level 1 — Must Do</w:t>
-      </w:r>
-    </w:p>
-    <w:p>
-      <w:r>
-        <w:rPr>
-          <w:b/>
-          <w:bCs/>
-          <w:highlight w:val="green"/>
-        </w:rPr>
-        <w:t xml:space="preserve">Q1. Print all elements of an </w:t>
-      </w:r>
-      <w:proofErr w:type="spellStart"/>
-      <w:r>
-        <w:rPr>
-          <w:b/>
-          <w:bCs/>
-          <w:highlight w:val="green"/>
-        </w:rPr>
-        <w:t>ArrayList</w:t>
-      </w:r>
-      <w:proofErr w:type="spellEnd"/>
-      <w:r>
-        <w:br/>
-        <w:t xml:space="preserve">Given an </w:t>
-      </w:r>
-      <w:proofErr w:type="spellStart"/>
-      <w:r>
-        <w:t>ArrayList</w:t>
-      </w:r>
-      <w:proofErr w:type="spellEnd"/>
-      <w:r>
-        <w:t xml:space="preserve"> of integers, print every element.</w:t>
-      </w:r>
-    </w:p>
-    <w:p>
-      <w:r>
-        <w:t>Example:</w:t>
-      </w:r>
-    </w:p>
-    <w:p>
-      <w:r>
-        <w:t>Input</w:t>
-      </w:r>
-      <w:proofErr w:type="gramStart"/>
-      <w:r>
-        <w:t>:  [</w:t>
-      </w:r>
-      <w:proofErr w:type="gramEnd"/>
-      <w:r>
-        <w:t>10, 20, 30, 40]</w:t>
-      </w:r>
-    </w:p>
-    <w:p>
-      <w:r>
-        <w:t>Output: 10 20 30 40</w:t>
-      </w:r>
-    </w:p>
-    <w:p>
-      <w:r>
-        <w:pict w14:anchorId="704765C3">
-          <v:rect id="_x0000_i1190" style="width:0;height:1.5pt" o:hralign="center" o:hrstd="t" o:hr="t" fillcolor="#a0a0a0" stroked="f"/>
-        </w:pict>
-      </w:r>
-    </w:p>
-    <w:p>
-      <w:r>
-        <w:rPr>
-          <w:b/>
-          <w:bCs/>
-          <w:highlight w:val="green"/>
-        </w:rPr>
-        <w:t>Q2. Find the maximum element</w:t>
-      </w:r>
-    </w:p>
-    <w:p>
-      <w:r>
-        <w:t>Input</w:t>
-      </w:r>
-      <w:proofErr w:type="gramStart"/>
-      <w:r>
-        <w:t>:  [</w:t>
-      </w:r>
-      <w:proofErr w:type="gramEnd"/>
-      <w:r>
-        <w:t>10, 45, 23, 67, 12]</w:t>
-      </w:r>
-    </w:p>
-    <w:p>
-      <w:r>
-        <w:t>Output: 67</w:t>
-      </w:r>
-    </w:p>
-    <w:p>
-      <w:r>
-        <w:pict w14:anchorId="7E17E013">
-          <v:rect id="_x0000_i1191" style="width:0;height:1.5pt" o:hralign="center" o:hrstd="t" o:hr="t" fillcolor="#a0a0a0" stroked="f"/>
-        </w:pict>
-      </w:r>
-    </w:p>
-    <w:p>
-      <w:r>
-        <w:rPr>
-          <w:b/>
-          <w:bCs/>
-          <w:highlight w:val="green"/>
-        </w:rPr>
-        <w:lastRenderedPageBreak/>
-        <w:t>Q3. Find the minimum element</w:t>
-      </w:r>
-    </w:p>
-    <w:p>
-      <w:r>
-        <w:t>Input</w:t>
-      </w:r>
-      <w:proofErr w:type="gramStart"/>
-      <w:r>
-        <w:t>:  [</w:t>
-      </w:r>
-      <w:proofErr w:type="gramEnd"/>
-      <w:r>
-        <w:t>10, 45, 23, 67, 12]</w:t>
-      </w:r>
-    </w:p>
-    <w:p>
-      <w:r>
-        <w:t>Output: 10</w:t>
-      </w:r>
-    </w:p>
-    <w:p>
-      <w:r>
-        <w:pict w14:anchorId="74FC2B04">
-          <v:rect id="_x0000_i1192" style="width:0;height:1.5pt" o:hralign="center" o:hrstd="t" o:hr="t" fillcolor="#a0a0a0" stroked="f"/>
-        </w:pict>
-      </w:r>
-    </w:p>
-    <w:p>
-      <w:r>
-        <w:rPr>
-          <w:b/>
-          <w:bCs/>
-          <w:highlight w:val="green"/>
-        </w:rPr>
-        <w:t>Q4. Find the sum of all elements</w:t>
-      </w:r>
-    </w:p>
-    <w:p>
-      <w:r>
-        <w:t>Input</w:t>
-      </w:r>
-      <w:proofErr w:type="gramStart"/>
-      <w:r>
-        <w:t>:  [</w:t>
-      </w:r>
-      <w:proofErr w:type="gramEnd"/>
-      <w:r>
-        <w:t>10, 20, 30, 40]</w:t>
-      </w:r>
-    </w:p>
-    <w:p>
-      <w:r>
-        <w:t>Output: 100</w:t>
-      </w:r>
-    </w:p>
-    <w:p>
-      <w:r>
-        <w:pict w14:anchorId="090B2ADF">
-          <v:rect id="_x0000_i1193" style="width:0;height:1.5pt" o:hralign="center" o:hrstd="t" o:hr="t" fillcolor="#a0a0a0" stroked="f"/>
-        </w:pict>
-      </w:r>
-    </w:p>
-    <w:p>
-      <w:r>
-        <w:rPr>
-          <w:b/>
-          <w:bCs/>
-          <w:highlight w:val="green"/>
-        </w:rPr>
-        <w:t>Q5. Find the average of elements</w:t>
-      </w:r>
-    </w:p>
-    <w:p>
-      <w:r>
-        <w:t>Input</w:t>
-      </w:r>
-      <w:proofErr w:type="gramStart"/>
-      <w:r>
-        <w:t>:  [</w:t>
-      </w:r>
-      <w:proofErr w:type="gramEnd"/>
-      <w:r>
-        <w:t>10, 20, 30, 40]</w:t>
-      </w:r>
-    </w:p>
-    <w:p>
-      <w:r>
-        <w:t>Output: 25.0</w:t>
-      </w:r>
-    </w:p>
-    <w:p>
-      <w:r>
-        <w:pict w14:anchorId="0C786E94">
-          <v:rect id="_x0000_i1194" style="width:0;height:1.5pt" o:hralign="center" o:hrstd="t" o:hr="t" fillcolor="#a0a0a0" stroked="f"/>
-        </w:pict>
-      </w:r>
-    </w:p>
-    <w:p>
-      <w:r>
-        <w:rPr>
-          <w:b/>
-          <w:bCs/>
-          <w:highlight w:val="green"/>
-        </w:rPr>
-        <w:t>Q6. Search an element</w:t>
-      </w:r>
-      <w:r>
-        <w:br/>
-        <w:t xml:space="preserve">Given an </w:t>
-      </w:r>
-      <w:proofErr w:type="spellStart"/>
-      <w:r>
-        <w:t>ArrayList</w:t>
-      </w:r>
-      <w:proofErr w:type="spellEnd"/>
-      <w:r>
-        <w:t xml:space="preserve"> and a key, check whether the key exists.</w:t>
-      </w:r>
-    </w:p>
-    <w:p>
-      <w:r>
-        <w:t>Input</w:t>
-      </w:r>
-      <w:proofErr w:type="gramStart"/>
-      <w:r>
-        <w:t>:  [</w:t>
-      </w:r>
-      <w:proofErr w:type="gramEnd"/>
-      <w:r>
-        <w:t>10, 20, 30, 40], key = 30</w:t>
-      </w:r>
-    </w:p>
-    <w:p>
-      <w:r>
-        <w:t>Output: Found</w:t>
-      </w:r>
-    </w:p>
-    <w:p>
-      <w:r>
-        <w:t>Practice both:</w:t>
-      </w:r>
-    </w:p>
-    <w:p>
-      <w:proofErr w:type="spellStart"/>
-      <w:proofErr w:type="gramStart"/>
-      <w:r>
-        <w:t>list.contains</w:t>
-      </w:r>
-      <w:proofErr w:type="spellEnd"/>
-      <w:proofErr w:type="gramEnd"/>
-      <w:r>
-        <w:t>(key)</w:t>
-      </w:r>
-    </w:p>
-    <w:p>
-      <w:r>
-        <w:t>and manually using a loop.</w:t>
-      </w:r>
-    </w:p>
-    <w:p>
-      <w:r>
-        <w:pict w14:anchorId="0336D4C6">
-          <v:rect id="_x0000_i1195" style="width:0;height:1.5pt" o:hralign="center" o:hrstd="t" o:hr="t" fillcolor="#a0a0a0" stroked="f"/>
-        </w:pict>
-      </w:r>
-    </w:p>
-    <w:p>
-      <w:r>
-        <w:rPr>
-          <w:b/>
-          <w:bCs/>
-          <w:highlight w:val="green"/>
-        </w:rPr>
-        <w:t>Q7. Count even and odd numbers</w:t>
-      </w:r>
-    </w:p>
-    <w:p>
-      <w:r>
-        <w:t>Input</w:t>
-      </w:r>
-      <w:proofErr w:type="gramStart"/>
-      <w:r>
-        <w:t>:  [</w:t>
-      </w:r>
-      <w:proofErr w:type="gramEnd"/>
-      <w:r>
-        <w:t>10, 15, 20, 25, 30]</w:t>
-      </w:r>
-    </w:p>
-    <w:p>
-      <w:r>
-        <w:t>Output:</w:t>
-      </w:r>
-    </w:p>
-    <w:p>
-      <w:r>
-        <w:t>Even = 3</w:t>
-      </w:r>
-    </w:p>
-    <w:p>
-      <w:r>
-        <w:t>Odd = 2</w:t>
-      </w:r>
-    </w:p>
-    <w:p>
-      <w:r>
-        <w:pict w14:anchorId="698D5B76">
-          <v:rect id="_x0000_i1196" style="width:0;height:1.5pt" o:hralign="center" o:hrstd="t" o:hr="t" fillcolor="#a0a0a0" stroked="f"/>
-        </w:pict>
-      </w:r>
-    </w:p>
-    <w:p>
-      <w:r>
-        <w:rPr>
-          <w:b/>
-          <w:bCs/>
-          <w:highlight w:val="green"/>
-        </w:rPr>
-        <w:t>Q8. Count positive, negative and zero</w:t>
-      </w:r>
-    </w:p>
-    <w:p>
-      <w:r>
-        <w:t>Input</w:t>
-      </w:r>
-      <w:proofErr w:type="gramStart"/>
-      <w:r>
-        <w:t>:  [</w:t>
-      </w:r>
-      <w:proofErr w:type="gramEnd"/>
-      <w:r>
-        <w:t>10, -5, 0, 20, -3, 0]</w:t>
-      </w:r>
-    </w:p>
-    <w:p>
-      <w:r>
-        <w:t>Output:</w:t>
-      </w:r>
-    </w:p>
-    <w:p>
-      <w:r>
-        <w:t>Positive = 2</w:t>
-      </w:r>
-    </w:p>
-    <w:p>
-      <w:r>
-        <w:t>Negative = 2</w:t>
-      </w:r>
-    </w:p>
-    <w:p>
-      <w:r>
-        <w:t>Zero = 2</w:t>
-      </w:r>
-    </w:p>
-    <w:p>
-      <w:r>
-        <w:pict w14:anchorId="6EFAAC29">
-          <v:rect id="_x0000_i1197" style="width:0;height:1.5pt" o:hralign="center" o:hrstd="t" o:hr="t" fillcolor="#a0a0a0" stroked="f"/>
-        </w:pict>
-      </w:r>
-    </w:p>
-    <w:p>
-      <w:pPr>
-        <w:rPr>
-          <w:b/>
-          <w:bCs/>
-        </w:rPr>
-      </w:pPr>
-      <w:r>
-        <w:rPr>
-          <w:rFonts w:ascii="Segoe UI Emoji" w:hAnsi="Segoe UI Emoji" w:cs="Segoe UI Emoji"/>
-          <w:b/>
-          <w:bCs/>
-        </w:rPr>
-        <w:t>🟡</w:t>
-      </w:r>
-      <w:r>
-        <w:rPr>
-          <w:b/>
-          <w:bCs/>
-        </w:rPr>
-        <w:t xml:space="preserve"> Level 2 — Very Important</w:t>
-      </w:r>
-    </w:p>
-    <w:p>
-      <w:r>
-        <w:rPr>
-          <w:b/>
-          <w:bCs/>
-          <w:highlight w:val="green"/>
-        </w:rPr>
-        <w:lastRenderedPageBreak/>
-        <w:t>Q9. Remove a particular element</w:t>
-      </w:r>
-    </w:p>
-    <w:p>
-      <w:r>
-        <w:t>Input</w:t>
-      </w:r>
-      <w:proofErr w:type="gramStart"/>
-      <w:r>
-        <w:t>:  [</w:t>
-      </w:r>
-      <w:proofErr w:type="gramEnd"/>
-      <w:r>
-        <w:t>10, 20, 30, 20, 40]</w:t>
-      </w:r>
-    </w:p>
-    <w:p>
-      <w:r>
-        <w:t>Remove: 20</w:t>
-      </w:r>
-    </w:p>
-    <w:p/>
-    <w:p>
-      <w:r>
-        <w:t>Output: [10, 30, 20, 40]</w:t>
-      </w:r>
-    </w:p>
-    <w:p>
-      <w:r>
-        <w:t>Understand the difference between:</w:t>
-      </w:r>
-    </w:p>
-    <w:p>
-      <w:proofErr w:type="spellStart"/>
-      <w:proofErr w:type="gramStart"/>
-      <w:r>
-        <w:t>list.remove</w:t>
-      </w:r>
-      <w:proofErr w:type="spellEnd"/>
-      <w:proofErr w:type="gramEnd"/>
-      <w:r>
-        <w:t>(2</w:t>
-      </w:r>
-      <w:proofErr w:type="gramStart"/>
-      <w:r>
-        <w:t xml:space="preserve">);   </w:t>
-      </w:r>
-      <w:proofErr w:type="gramEnd"/>
-      <w:r>
-        <w:t xml:space="preserve">   // removes by INDEX</w:t>
-      </w:r>
-    </w:p>
-    <w:p>
-      <w:proofErr w:type="spellStart"/>
-      <w:proofErr w:type="gramStart"/>
-      <w:r>
-        <w:t>list.remove</w:t>
-      </w:r>
-      <w:proofErr w:type="spellEnd"/>
-      <w:proofErr w:type="gramEnd"/>
-      <w:r>
-        <w:t>(</w:t>
-      </w:r>
-      <w:proofErr w:type="spellStart"/>
-      <w:r>
-        <w:t>Integer.valueOf</w:t>
-      </w:r>
-      <w:proofErr w:type="spellEnd"/>
-      <w:r>
-        <w:t>(20)); // removes VALUE</w:t>
-      </w:r>
-    </w:p>
-    <w:p>
-      <w:r>
-        <w:rPr>
-          <w:rFonts w:ascii="Segoe UI Emoji" w:hAnsi="Segoe UI Emoji" w:cs="Segoe UI Emoji"/>
-        </w:rPr>
-        <w:t>⭐</w:t>
-      </w:r>
-      <w:r>
-        <w:t xml:space="preserve"> This is a common Java interview trap.</w:t>
-      </w:r>
-    </w:p>
-    <w:p>
-      <w:r>
-        <w:pict w14:anchorId="21ABA020">
-          <v:rect id="_x0000_i1198" style="width:0;height:1.5pt" o:hralign="center" o:hrstd="t" o:hr="t" fillcolor="#a0a0a0" stroked="f"/>
-        </w:pict>
-      </w:r>
-    </w:p>
-    <w:p>
-      <w:r>
-        <w:rPr>
-          <w:b/>
-          <w:bCs/>
-        </w:rPr>
-        <w:t>Q10. Remove all occurrences of an element</w:t>
-      </w:r>
-    </w:p>
-    <w:p>
-      <w:r>
-        <w:t>Input</w:t>
-      </w:r>
-      <w:proofErr w:type="gramStart"/>
-      <w:r>
-        <w:t>:  [</w:t>
-      </w:r>
-      <w:proofErr w:type="gramEnd"/>
-      <w:r>
-        <w:t>10, 20, 30, 20, 40, 20]</w:t>
-      </w:r>
-    </w:p>
-    <w:p>
-      <w:r>
-        <w:t>Remove: 20</w:t>
-      </w:r>
-    </w:p>
-    <w:p/>
-    <w:p>
-      <w:r>
-        <w:t>Output: [10, 30, 40]</w:t>
-      </w:r>
-    </w:p>
-    <w:p>
-      <w:r>
-        <w:pict w14:anchorId="502AAF96">
-          <v:rect id="_x0000_i1199" style="width:0;height:1.5pt" o:hralign="center" o:hrstd="t" o:hr="t" fillcolor="#a0a0a0" stroked="f"/>
-        </w:pict>
-      </w:r>
-    </w:p>
-    <w:p>
-      <w:r>
-        <w:rPr>
-          <w:b/>
-          <w:bCs/>
-          <w:highlight w:val="green"/>
-        </w:rPr>
-        <w:t xml:space="preserve">Q11. Reverse an </w:t>
-      </w:r>
-      <w:proofErr w:type="spellStart"/>
-      <w:r>
-        <w:rPr>
-          <w:b/>
-          <w:bCs/>
-          <w:highlight w:val="green"/>
-        </w:rPr>
-        <w:t>ArrayList</w:t>
-      </w:r>
-      <w:proofErr w:type="spellEnd"/>
-    </w:p>
-    <w:p>
-      <w:r>
-        <w:t>Input</w:t>
-      </w:r>
-      <w:proofErr w:type="gramStart"/>
-      <w:r>
-        <w:t>:  [</w:t>
-      </w:r>
-      <w:proofErr w:type="gramEnd"/>
-      <w:r>
-        <w:t>10, 20, 30, 40]</w:t>
-      </w:r>
-    </w:p>
-    <w:p>
-      <w:r>
-        <w:t>Output: [40, 30, 20, 10]</w:t>
-      </w:r>
-    </w:p>
-    <w:p>
-      <w:r>
-        <w:t xml:space="preserve">Try it first </w:t>
-      </w:r>
-      <w:r>
-        <w:rPr>
-          <w:b/>
-          <w:bCs/>
-        </w:rPr>
-        <w:t>without</w:t>
-      </w:r>
-      <w:r>
-        <w:t xml:space="preserve"> </w:t>
-      </w:r>
-      <w:proofErr w:type="spellStart"/>
-      <w:r>
-        <w:t>Collections.reverse</w:t>
-      </w:r>
-      <w:proofErr w:type="spellEnd"/>
-      <w:r>
-        <w:t>().</w:t>
-      </w:r>
-    </w:p>
-    <w:p>
-      <w:r>
-        <w:pict w14:anchorId="109EDDAB">
-          <v:rect id="_x0000_i1200" style="width:0;height:1.5pt" o:hralign="center" o:hrstd="t" o:hr="t" fillcolor="#a0a0a0" stroked="f"/>
-        </w:pict>
-      </w:r>
-    </w:p>
-    <w:p>
-      <w:r>
-        <w:rPr>
-          <w:b/>
-          <w:bCs/>
-        </w:rPr>
-        <w:t>Q12. Find duplicate elements</w:t>
-      </w:r>
-    </w:p>
-    <w:p>
-      <w:r>
-        <w:t>Input</w:t>
-      </w:r>
-      <w:proofErr w:type="gramStart"/>
-      <w:r>
-        <w:t>:  [</w:t>
-      </w:r>
-      <w:proofErr w:type="gramEnd"/>
-      <w:r>
-        <w:t>10, 20, 30, 20, 40, 10]</w:t>
-      </w:r>
-    </w:p>
-    <w:p>
-      <w:r>
-        <w:t>Output: 10 20</w:t>
-      </w:r>
-    </w:p>
-    <w:p>
-      <w:r>
-        <w:rPr>
-          <w:rFonts w:ascii="Segoe UI Emoji" w:hAnsi="Segoe UI Emoji" w:cs="Segoe UI Emoji"/>
-        </w:rPr>
-        <w:t>⭐</w:t>
-      </w:r>
-      <w:r>
-        <w:t xml:space="preserve"> Very important for placement coding.</w:t>
-      </w:r>
-    </w:p>
-    <w:p>
-      <w:r>
-        <w:pict w14:anchorId="39AAAA3C">
-          <v:rect id="_x0000_i1201" style="width:0;height:1.5pt" o:hralign="center" o:hrstd="t" o:hr="t" fillcolor="#a0a0a0" stroked="f"/>
-        </w:pict>
-      </w:r>
-    </w:p>
-    <w:p>
-      <w:r>
-        <w:rPr>
-          <w:b/>
-          <w:bCs/>
-        </w:rPr>
-        <w:t>Q13. Find frequency of each element</w:t>
-      </w:r>
-    </w:p>
-    <w:p>
-      <w:r>
-        <w:t>Input: [10, 20, 10, 30, 20, 10]</w:t>
-      </w:r>
-    </w:p>
-    <w:p/>
-    <w:p>
-      <w:r>
-        <w:t>Output:</w:t>
-      </w:r>
-    </w:p>
-    <w:p>
-      <w:r>
-        <w:t>10 → 3</w:t>
-      </w:r>
-    </w:p>
-    <w:p>
-      <w:r>
-        <w:t>20 → 2</w:t>
-      </w:r>
-    </w:p>
-    <w:p>
-      <w:r>
-        <w:t>30 → 1</w:t>
-      </w:r>
-    </w:p>
-    <w:p>
-      <w:r>
-        <w:t xml:space="preserve">This also prepares you for </w:t>
-      </w:r>
-      <w:r>
-        <w:rPr>
-          <w:b/>
-          <w:bCs/>
-        </w:rPr>
-        <w:t>HashMap</w:t>
-      </w:r>
-      <w:r>
-        <w:t>, which you'll use heavily later.</w:t>
-      </w:r>
-    </w:p>
-    <w:p>
-      <w:r>
-        <w:lastRenderedPageBreak/>
-        <w:pict w14:anchorId="635193B7">
-          <v:rect id="_x0000_i1202" style="width:0;height:1.5pt" o:hralign="center" o:hrstd="t" o:hr="t" fillcolor="#a0a0a0" stroked="f"/>
-        </w:pict>
-      </w:r>
-    </w:p>
-    <w:p>
-      <w:r>
-        <w:rPr>
-          <w:b/>
-          <w:bCs/>
-          <w:highlight w:val="green"/>
-        </w:rPr>
-        <w:t>Q14. Find the second largest element</w:t>
-      </w:r>
-    </w:p>
-    <w:p>
-      <w:r>
-        <w:t>Input</w:t>
-      </w:r>
-      <w:proofErr w:type="gramStart"/>
-      <w:r>
-        <w:t>:  [</w:t>
-      </w:r>
-      <w:proofErr w:type="gramEnd"/>
-      <w:r>
-        <w:t>10, 50, 30, 80, 40]</w:t>
-      </w:r>
-    </w:p>
-    <w:p/>
-    <w:p>
-      <w:r>
-        <w:t>Output: 50</w:t>
-      </w:r>
-    </w:p>
-    <w:p>
-      <w:r>
-        <w:t>Try without sorting first.</w:t>
-      </w:r>
-    </w:p>
-    <w:p>
-      <w:r>
-        <w:pict w14:anchorId="4B9CBE1A">
-          <v:rect id="_x0000_i1203" style="width:0;height:1.5pt" o:hralign="center" o:hrstd="t" o:hr="t" fillcolor="#a0a0a0" stroked="f"/>
-        </w:pict>
-      </w:r>
-    </w:p>
-    <w:p>
-      <w:r>
-        <w:rPr>
-          <w:b/>
-          <w:bCs/>
-          <w:highlight w:val="green"/>
-        </w:rPr>
-        <w:t>Q15. Find the second smallest element</w:t>
-      </w:r>
-    </w:p>
-    <w:p>
-      <w:r>
-        <w:t>Input</w:t>
-      </w:r>
-      <w:proofErr w:type="gramStart"/>
-      <w:r>
-        <w:t>:  [</w:t>
-      </w:r>
-      <w:proofErr w:type="gramEnd"/>
-      <w:r>
-        <w:t>10, 50, 30, 80, 40]</w:t>
-      </w:r>
-    </w:p>
-    <w:p/>
-    <w:p>
-      <w:r>
-        <w:t>Output: 30</w:t>
-      </w:r>
-    </w:p>
-    <w:p>
-      <w:r>
-        <w:pict w14:anchorId="5735D77E">
-          <v:rect id="_x0000_i1204" style="width:0;height:1.5pt" o:hralign="center" o:hrstd="t" o:hr="t" fillcolor="#a0a0a0" stroked="f"/>
-        </w:pict>
-      </w:r>
-    </w:p>
-    <w:p>
-      <w:pPr>
-        <w:rPr>
-          <w:b/>
-          <w:bCs/>
-        </w:rPr>
-      </w:pPr>
-      <w:r>
-        <w:rPr>
-          <w:rFonts w:ascii="Segoe UI Emoji" w:hAnsi="Segoe UI Emoji" w:cs="Segoe UI Emoji"/>
-          <w:b/>
-          <w:bCs/>
-        </w:rPr>
-        <w:t>🟠</w:t>
-      </w:r>
-      <w:r>
-        <w:rPr>
-          <w:b/>
-          <w:bCs/>
-        </w:rPr>
-        <w:t xml:space="preserve"> Level 3 — Coding Round Style</w:t>
-      </w:r>
-    </w:p>
-    <w:p>
-      <w:r>
-        <w:rPr>
-          <w:b/>
-          <w:bCs/>
-        </w:rPr>
-        <w:t xml:space="preserve">Q16. Sort an </w:t>
-      </w:r>
-      <w:proofErr w:type="spellStart"/>
-      <w:r>
-        <w:rPr>
-          <w:b/>
-          <w:bCs/>
-        </w:rPr>
-        <w:t>ArrayList</w:t>
-      </w:r>
-      <w:proofErr w:type="spellEnd"/>
-      <w:r>
-        <w:rPr>
-          <w:b/>
-          <w:bCs/>
-        </w:rPr>
-        <w:t xml:space="preserve"> in ascending order</w:t>
-      </w:r>
-    </w:p>
-    <w:p>
-      <w:r>
-        <w:t>Input</w:t>
-      </w:r>
-      <w:proofErr w:type="gramStart"/>
-      <w:r>
-        <w:t>:  [</w:t>
-      </w:r>
-      <w:proofErr w:type="gramEnd"/>
-      <w:r>
-        <w:t>40, 10, 30, 20]</w:t>
-      </w:r>
-    </w:p>
-    <w:p>
-      <w:r>
-        <w:t>Output: [10, 20, 30, 40]</w:t>
-      </w:r>
-    </w:p>
-    <w:p>
-      <w:r>
-        <w:t>First try:</w:t>
-      </w:r>
-    </w:p>
-    <w:p>
-      <w:proofErr w:type="spellStart"/>
-      <w:r>
-        <w:t>Collections.sort</w:t>
-      </w:r>
-      <w:proofErr w:type="spellEnd"/>
-      <w:r>
-        <w:t>(list);</w:t>
-      </w:r>
-    </w:p>
-    <w:p>
-      <w:r>
-        <w:t>Then implement sorting manually.</w:t>
-      </w:r>
-    </w:p>
-    <w:p>
-      <w:r>
-        <w:pict w14:anchorId="4798D3C4">
-          <v:rect id="_x0000_i1205" style="width:0;height:1.5pt" o:hralign="center" o:hrstd="t" o:hr="t" fillcolor="#a0a0a0" stroked="f"/>
-        </w:pict>
-      </w:r>
-    </w:p>
-    <w:p>
-      <w:r>
-        <w:rPr>
-          <w:b/>
-          <w:bCs/>
-        </w:rPr>
-        <w:t>Q17. Sort in descending order</w:t>
-      </w:r>
-    </w:p>
-    <w:p>
-      <w:r>
-        <w:t>Input</w:t>
-      </w:r>
-      <w:proofErr w:type="gramStart"/>
-      <w:r>
-        <w:t>:  [</w:t>
-      </w:r>
-      <w:proofErr w:type="gramEnd"/>
-      <w:r>
-        <w:t>40, 10, 30, 20]</w:t>
-      </w:r>
-    </w:p>
-    <w:p>
-      <w:r>
-        <w:t>Output: [40, 30, 20, 10]</w:t>
-      </w:r>
-    </w:p>
-    <w:p>
-      <w:r>
-        <w:pict w14:anchorId="4D00DB9F">
-          <v:rect id="_x0000_i1206" style="width:0;height:1.5pt" o:hralign="center" o:hrstd="t" o:hr="t" fillcolor="#a0a0a0" stroked="f"/>
-        </w:pict>
-      </w:r>
-    </w:p>
-    <w:p>
-      <w:r>
-        <w:rPr>
-          <w:b/>
-          <w:bCs/>
-        </w:rPr>
-        <w:t xml:space="preserve">Q18. Find common elements between two </w:t>
-      </w:r>
-      <w:proofErr w:type="spellStart"/>
-      <w:r>
-        <w:rPr>
-          <w:b/>
-          <w:bCs/>
-        </w:rPr>
-        <w:t>ArrayLists</w:t>
-      </w:r>
-      <w:proofErr w:type="spellEnd"/>
-    </w:p>
-    <w:p>
-      <w:r>
-        <w:t>A = [10, 20, 30, 40]</w:t>
-      </w:r>
-    </w:p>
-    <w:p>
-      <w:r>
-        <w:t>B = [20, 40, 50, 60]</w:t>
-      </w:r>
-    </w:p>
-    <w:p/>
-    <w:p>
-      <w:r>
-        <w:t>Output: [20, 40]</w:t>
-      </w:r>
-    </w:p>
-    <w:p>
-      <w:r>
-        <w:pict w14:anchorId="34F63F4D">
-          <v:rect id="_x0000_i1207" style="width:0;height:1.5pt" o:hralign="center" o:hrstd="t" o:hr="t" fillcolor="#a0a0a0" stroked="f"/>
-        </w:pict>
-      </w:r>
-    </w:p>
-    <w:p>
-      <w:r>
-        <w:rPr>
-          <w:b/>
-          <w:bCs/>
-        </w:rPr>
-        <w:t xml:space="preserve">Q19. Merge two </w:t>
-      </w:r>
-      <w:proofErr w:type="spellStart"/>
-      <w:r>
-        <w:rPr>
-          <w:b/>
-          <w:bCs/>
-        </w:rPr>
-        <w:t>ArrayLists</w:t>
-      </w:r>
-      <w:proofErr w:type="spellEnd"/>
-    </w:p>
-    <w:p>
-      <w:r>
-        <w:t>A = [10, 20, 30]</w:t>
-      </w:r>
-    </w:p>
-    <w:p>
-      <w:r>
-        <w:t>B = [40, 50, 60]</w:t>
-      </w:r>
-    </w:p>
-    <w:p/>
-    <w:p>
-      <w:r>
-        <w:lastRenderedPageBreak/>
-        <w:t>Output: [10, 20, 30, 40, 50, 60]</w:t>
-      </w:r>
-    </w:p>
-    <w:p>
-      <w:r>
-        <w:pict w14:anchorId="65E72CF6">
-          <v:rect id="_x0000_i1208" style="width:0;height:1.5pt" o:hralign="center" o:hrstd="t" o:hr="t" fillcolor="#a0a0a0" stroked="f"/>
-        </w:pict>
-      </w:r>
-    </w:p>
-    <w:p>
-      <w:r>
-        <w:rPr>
-          <w:b/>
-          <w:bCs/>
-        </w:rPr>
-        <w:t>Q20. Remove duplicate elements</w:t>
-      </w:r>
-    </w:p>
-    <w:p>
-      <w:r>
-        <w:t>Input</w:t>
-      </w:r>
-      <w:proofErr w:type="gramStart"/>
-      <w:r>
-        <w:t>:  [</w:t>
-      </w:r>
-      <w:proofErr w:type="gramEnd"/>
-      <w:r>
-        <w:t>10, 20, 10, 30, 20, 40]</w:t>
-      </w:r>
-    </w:p>
-    <w:p/>
-    <w:p>
-      <w:r>
-        <w:t>Output: [10, 20, 30, 40]</w:t>
-      </w:r>
-    </w:p>
-    <w:p>
-      <w:r>
-        <w:t>Try first without HashSet.</w:t>
-      </w:r>
-    </w:p>
-    <w:p>
-      <w:r>
-        <w:pict w14:anchorId="70B4B7D9">
-          <v:rect id="_x0000_i1209" style="width:0;height:1.5pt" o:hralign="center" o:hrstd="t" o:hr="t" fillcolor="#a0a0a0" stroked="f"/>
-        </w:pict>
-      </w:r>
-    </w:p>
-    <w:p>
-      <w:pPr>
-        <w:rPr>
-          <w:b/>
-          <w:bCs/>
-        </w:rPr>
-      </w:pPr>
-      <w:r>
-        <w:rPr>
-          <w:rFonts w:ascii="Segoe UI Emoji" w:hAnsi="Segoe UI Emoji" w:cs="Segoe UI Emoji"/>
-          <w:b/>
-          <w:bCs/>
-        </w:rPr>
-        <w:t>🔴</w:t>
-      </w:r>
-      <w:r>
-        <w:rPr>
-          <w:b/>
-          <w:bCs/>
-        </w:rPr>
-        <w:t xml:space="preserve"> Level 4 — Good for HCL/TCS-style Practice</w:t>
-      </w:r>
-    </w:p>
-    <w:p>
-      <w:r>
-        <w:rPr>
-          <w:b/>
-          <w:bCs/>
-        </w:rPr>
-        <w:t>Q21. Find the first non-repeating element</w:t>
-      </w:r>
-    </w:p>
-    <w:p>
-      <w:r>
-        <w:t>Input: [10, 20, 10, 30, 20, 40]</w:t>
-      </w:r>
-    </w:p>
-    <w:p/>
-    <w:p>
-      <w:r>
-        <w:t>Output: 30</w:t>
-      </w:r>
-    </w:p>
-    <w:p>
-      <w:r>
-        <w:pict w14:anchorId="5FFE01E8">
-          <v:rect id="_x0000_i1210" style="width:0;height:1.5pt" o:hralign="center" o:hrstd="t" o:hr="t" fillcolor="#a0a0a0" stroked="f"/>
-        </w:pict>
-      </w:r>
-    </w:p>
-    <w:p>
-      <w:r>
-        <w:rPr>
-          <w:b/>
-          <w:bCs/>
-        </w:rPr>
-        <w:t>Q22. Find the first repeating element</w:t>
-      </w:r>
-    </w:p>
-    <w:p>
-      <w:r>
-        <w:t>Input: [10, 20, 30, 20, 40]</w:t>
-      </w:r>
-    </w:p>
-    <w:p/>
-    <w:p>
-      <w:r>
-        <w:t>Output: 20</w:t>
-      </w:r>
-    </w:p>
-    <w:p>
-      <w:r>
-        <w:pict w14:anchorId="2E9C07B6">
-          <v:rect id="_x0000_i1211" style="width:0;height:1.5pt" o:hralign="center" o:hrstd="t" o:hr="t" fillcolor="#a0a0a0" stroked="f"/>
-        </w:pict>
-      </w:r>
-    </w:p>
-    <w:p>
-      <w:r>
-        <w:rPr>
-          <w:b/>
-          <w:bCs/>
-        </w:rPr>
-        <w:t>Q23. Move all zeros to the end</w:t>
-      </w:r>
-    </w:p>
-    <w:p>
-      <w:r>
-        <w:t>Input</w:t>
-      </w:r>
-      <w:proofErr w:type="gramStart"/>
-      <w:r>
-        <w:t>:  [</w:t>
-      </w:r>
-      <w:proofErr w:type="gramEnd"/>
-      <w:r>
-        <w:t>0, 10, 0, 20, 30, 0]</w:t>
-      </w:r>
-    </w:p>
-    <w:p>
-      <w:r>
-        <w:t>Output: [10, 20, 30, 0, 0, 0]</w:t>
-      </w:r>
-    </w:p>
-    <w:p>
-      <w:r>
-        <w:rPr>
-          <w:rFonts w:ascii="Segoe UI Emoji" w:hAnsi="Segoe UI Emoji" w:cs="Segoe UI Emoji"/>
-        </w:rPr>
-        <w:t>⭐</w:t>
-      </w:r>
-      <w:r>
-        <w:t xml:space="preserve"> Very useful array/</w:t>
-      </w:r>
-      <w:proofErr w:type="spellStart"/>
-      <w:r>
-        <w:t>ArrayList</w:t>
-      </w:r>
-      <w:proofErr w:type="spellEnd"/>
-      <w:r>
-        <w:t xml:space="preserve"> pattern.</w:t>
-      </w:r>
-    </w:p>
-    <w:p>
-      <w:r>
-        <w:pict w14:anchorId="32E09035">
-          <v:rect id="_x0000_i1212" style="width:0;height:1.5pt" o:hralign="center" o:hrstd="t" o:hr="t" fillcolor="#a0a0a0" stroked="f"/>
-        </w:pict>
-      </w:r>
-    </w:p>
-    <w:p>
-      <w:r>
-        <w:rPr>
-          <w:b/>
-          <w:bCs/>
-        </w:rPr>
-        <w:t>Q24. Separate even and odd elements</w:t>
-      </w:r>
-    </w:p>
-    <w:p>
-      <w:r>
-        <w:t>Input: [10, 15, 20, 25, 30]</w:t>
-      </w:r>
-    </w:p>
-    <w:p/>
-    <w:p>
-      <w:r>
-        <w:t>Output:</w:t>
-      </w:r>
-    </w:p>
-    <w:p>
-      <w:r>
-        <w:t>Even: [10, 20, 30]</w:t>
-      </w:r>
-    </w:p>
-    <w:p>
-      <w:r>
-        <w:t>Odd</w:t>
-      </w:r>
-      <w:proofErr w:type="gramStart"/>
-      <w:r>
-        <w:t>:  [</w:t>
-      </w:r>
-      <w:proofErr w:type="gramEnd"/>
-      <w:r>
-        <w:t>15, 25]</w:t>
-      </w:r>
-    </w:p>
-    <w:p>
-      <w:r>
-        <w:pict w14:anchorId="6C0918D8">
-          <v:rect id="_x0000_i1213" style="width:0;height:1.5pt" o:hralign="center" o:hrstd="t" o:hr="t" fillcolor="#a0a0a0" stroked="f"/>
-        </w:pict>
-      </w:r>
-    </w:p>
-    <w:p>
-      <w:r>
-        <w:rPr>
-          <w:b/>
-          <w:bCs/>
-        </w:rPr>
-        <w:t>Q25. Find the missing number</w:t>
-      </w:r>
-    </w:p>
-    <w:p>
-      <w:r>
-        <w:t>Input: [1, 2, 3, 5, 6]</w:t>
-      </w:r>
-    </w:p>
-    <w:p/>
-    <w:p>
-      <w:r>
-        <w:lastRenderedPageBreak/>
-        <w:t>Output: 4</w:t>
       </w:r>
     </w:p>
     <w:p/>
@@ -5291,6 +4029,7 @@
   <w:style w:type="character" w:default="1" w:styleId="DefaultParagraphFont">
     <w:name w:val="Default Paragraph Font"/>
     <w:uiPriority w:val="1"/>
+    <w:semiHidden/>
     <w:unhideWhenUsed/>
   </w:style>
   <w:style w:type="table" w:default="1" w:styleId="TableNormal">

</xml_diff>